<commit_message>
Remove numbered section headings from report
</commit_message>
<xml_diff>
--- a/docs/EDA_Outage_Report.docx
+++ b/docs/EDA_Outage_Report.docx
@@ -343,7 +343,7 @@
         <w:pStyle w:val="Heading1"/>
       </w:pPr>
       <w:r>
-        <w:t>1. Study Design and Modeling Rationale</w:t>
+        <w:t>Study Design and Modeling Rationale</w:t>
       </w:r>
     </w:p>
     <w:p>
@@ -522,7 +522,7 @@
         <w:pStyle w:val="Heading1"/>
       </w:pPr>
       <w:r>
-        <w:t>2. Exploratory Analysis</w:t>
+        <w:t>Exploratory Analysis</w:t>
       </w:r>
     </w:p>
     <w:p>
@@ -540,7 +540,7 @@
         <w:pStyle w:val="Heading1"/>
       </w:pPr>
       <w:r>
-        <w:t>3. Corrected Frequency and Count Models</w:t>
+        <w:t>Corrected Frequency and Count Models</w:t>
       </w:r>
     </w:p>
     <w:p>
@@ -563,7 +563,7 @@
         <w:pStyle w:val="Heading1"/>
       </w:pPr>
       <w:r>
-        <w:t>4. CVI, Duration, and Resilience Models</w:t>
+        <w:t>CVI, Duration, and Resilience Models</w:t>
       </w:r>
     </w:p>
     <w:p>
@@ -586,7 +586,7 @@
         <w:pStyle w:val="Heading1"/>
       </w:pPr>
       <w:r>
-        <w:t>5. Main Results</w:t>
+        <w:t>Main Results</w:t>
       </w:r>
     </w:p>
     <w:tbl>
@@ -914,7 +914,7 @@
         <w:pStyle w:val="Heading1"/>
       </w:pPr>
       <w:r>
-        <w:t>6. Interpretation</w:t>
+        <w:t>Interpretation</w:t>
       </w:r>
     </w:p>
     <w:p>
@@ -932,7 +932,7 @@
         <w:pStyle w:val="Heading1"/>
       </w:pPr>
       <w:r>
-        <w:t>7. Limitations</w:t>
+        <w:t>Limitations</w:t>
       </w:r>
     </w:p>
     <w:p>
@@ -988,7 +988,7 @@
         <w:pStyle w:val="Heading1"/>
       </w:pPr>
       <w:r>
-        <w:t>8. Recommended Next Steps</w:t>
+        <w:t>Recommended Next Steps</w:t>
       </w:r>
     </w:p>
     <w:p>

</xml_diff>

<commit_message>
Rewrite outage report by notebook methodology parts
</commit_message>
<xml_diff>
--- a/docs/EDA_Outage_Report.docx
+++ b/docs/EDA_Outage_Report.docx
@@ -11,7 +11,7 @@
           <w:b/>
           <w:sz w:val="32"/>
         </w:rPr>
-        <w:t>NYC Power Outage Vulnerability Analysis</w:t>
+        <w:t>NYC Power Outage EDA</w:t>
       </w:r>
     </w:p>
     <w:p>
@@ -23,12 +23,12 @@
           <w:i/>
           <w:sz w:val="22"/>
         </w:rPr>
-        <w:t>Formal Methods and Results Report, 2014-2023</w:t>
+        <w:t>Methods and Results Summary by Notebook Part</w:t>
       </w:r>
     </w:p>
     <w:p>
       <w:r>
-        <w:t>This report summarizes an exploratory and model-based analysis of power outage burden across the five counties of New York City. The analysis links outage events from 2014 through 2023 with Climate Vulnerability Index (CVI) indicators, severe-weather flags, duration measures, and customer impact measures. The primary objective is to assess whether outage frequency and outage duration are associated with time, severe weather, seasonality, and social vulnerability.</w:t>
+        <w:t>This document summarizes the analytical workflow used to examine New York City power outage burden from 2014 to 2023. The analysis links outage events with county and tract geography, severe-weather indicators, customer impact measures, outage duration, and Climate Vulnerability Index (CVI) variables. The purpose is to describe how outage frequency and duration vary over time and geography, and to evaluate whether social vulnerability is associated with outage burden after accounting for weather, seasonality, and data structure.</w:t>
       </w:r>
     </w:p>
     <w:p>
@@ -36,7 +36,7 @@
         <w:pStyle w:val="Heading1"/>
       </w:pPr>
       <w:r>
-        <w:t>Data at a Glance</w:t>
+        <w:t>Study Scope</w:t>
       </w:r>
     </w:p>
     <w:tbl>
@@ -74,7 +74,7 @@
                 <w:rFonts w:ascii="Arial" w:hAnsi="Arial"/>
                 <w:sz w:val="17"/>
               </w:rPr>
-              <w:t>Description</w:t>
+              <w:t>Specification</w:t>
             </w:r>
           </w:p>
         </w:tc>
@@ -134,7 +134,7 @@
                 <w:rFonts w:ascii="Arial" w:hAnsi="Arial"/>
                 <w:sz w:val="17"/>
               </w:rPr>
-              <w:t>NYC five counties: Bronx, Brooklyn, Manhattan, Queens, and Staten Island</w:t>
+              <w:t>NYC five counties: Bronx, Brooklyn, Manhattan, Queens, Staten Island</w:t>
             </w:r>
           </w:p>
         </w:tc>
@@ -150,7 +150,7 @@
                 <w:rFonts w:ascii="Arial" w:hAnsi="Arial"/>
                 <w:sz w:val="17"/>
               </w:rPr>
-              <w:t>Primary unit for frequency models</w:t>
+              <w:t>Primary source</w:t>
             </w:r>
           </w:p>
         </w:tc>
@@ -164,7 +164,7 @@
                 <w:rFonts w:ascii="Arial" w:hAnsi="Arial"/>
                 <w:sz w:val="17"/>
               </w:rPr>
-              <w:t>County-month panel, with 600 observations</w:t>
+              <w:t>Merged outage event file with CVI indicators and severe-weather flags</w:t>
             </w:r>
           </w:p>
         </w:tc>
@@ -180,7 +180,7 @@
                 <w:rFonts w:ascii="Arial" w:hAnsi="Arial"/>
                 <w:sz w:val="17"/>
               </w:rPr>
-              <w:t>County-year diagnostic panel</w:t>
+              <w:t>Exploratory unit</w:t>
             </w:r>
           </w:p>
         </w:tc>
@@ -194,7 +194,7 @@
                 <w:rFonts w:ascii="Arial" w:hAnsi="Arial"/>
                 <w:sz w:val="17"/>
               </w:rPr>
-              <w:t>Approximately 50 observations, used cautiously because of small N</w:t>
+              <w:t>Census tract-year and tract-month summaries</w:t>
             </w:r>
           </w:p>
         </w:tc>
@@ -210,7 +210,7 @@
                 <w:rFonts w:ascii="Arial" w:hAnsi="Arial"/>
                 <w:sz w:val="17"/>
               </w:rPr>
-              <w:t>Event-level duration panel</w:t>
+              <w:t>Main frequency unit</w:t>
             </w:r>
           </w:p>
         </w:tc>
@@ -224,7 +224,7 @@
                 <w:rFonts w:ascii="Arial" w:hAnsi="Arial"/>
                 <w:sz w:val="17"/>
               </w:rPr>
-              <w:t>Approximately 4,500 deduplicated outage events</w:t>
+              <w:t>Balanced county-month panel with 600 observations</w:t>
             </w:r>
           </w:p>
         </w:tc>
@@ -240,7 +240,7 @@
                 <w:rFonts w:ascii="Arial" w:hAnsi="Arial"/>
                 <w:sz w:val="17"/>
               </w:rPr>
-              <w:t>Core predictors</w:t>
+              <w:t>Duration unit</w:t>
             </w:r>
           </w:p>
         </w:tc>
@@ -254,7 +254,7 @@
                 <w:rFonts w:ascii="Arial" w:hAnsi="Arial"/>
                 <w:sz w:val="17"/>
               </w:rPr>
-              <w:t>Year, month, severe-weather count or flag, customer impact, and CVI measures</w:t>
+              <w:t>Deduplicated outage-event panel with approximately 4,500 events</w:t>
             </w:r>
           </w:p>
         </w:tc>
@@ -270,7 +270,7 @@
                 <w:rFonts w:ascii="Arial" w:hAnsi="Arial"/>
                 <w:sz w:val="17"/>
               </w:rPr>
-              <w:t>Primary caution</w:t>
+              <w:t>Core methodological caution</w:t>
             </w:r>
           </w:p>
         </w:tc>
@@ -284,7 +284,7 @@
                 <w:rFonts w:ascii="Arial" w:hAnsi="Arial"/>
                 <w:sz w:val="17"/>
               </w:rPr>
-              <w:t>Tract-level rows are useful for mapping and screening but are not independent inferential observations when outage outcomes repeat within county-years</w:t>
+              <w:t>Tract-level rows are useful for mapping, but outage outcomes repeat within county-year cells; final inference should not rely on false tract-level precision.</w:t>
             </w:r>
           </w:p>
         </w:tc>
@@ -295,7 +295,12 @@
         <w:pStyle w:val="Heading1"/>
       </w:pPr>
       <w:r>
-        <w:t>Executive Summary</w:t>
+        <w:t>Part 0: Data Preparation and NYC Filter</w:t>
+      </w:r>
+    </w:p>
+    <w:p>
+      <w:r>
+        <w:t>Part 0 prepares the event-level outage/CVI file for analysis. County FIPS and tract FIPS are standardized, outage start times are parsed, years and months are extracted, outage duration is converted to numeric hours, and outage event types are used to create a severe-weather flag. The file is then restricted to the five NYC counties and the 2014-2023 study window.</w:t>
       </w:r>
     </w:p>
     <w:p>
@@ -303,7 +308,7 @@
         <w:pStyle w:val="ListBullet"/>
       </w:pPr>
       <w:r>
-        <w:t>Severe weather is the most robust predictor of outage burden and outage duration. In event-level models, severe weather is strongly associated with longer outage duration and larger customer-hour impacts.</w:t>
+        <w:t>Methodology: field cleaning, date parsing, FIPS normalization, NYC filtering, and severe-weather flag construction.</w:t>
       </w:r>
     </w:p>
     <w:p>
@@ -311,7 +316,7 @@
         <w:pStyle w:val="ListBullet"/>
       </w:pPr>
       <w:r>
-        <w:t>The corrected frequency analysis relies primarily on a balanced county-month panel rather than tract-level regressions. This avoids overstating precision when outage outcomes are duplicated across tracts within the same county-year.</w:t>
+        <w:t>Purpose: establish a reproducible analysis panel and ensure that all later summaries use the same geography and time window.</w:t>
       </w:r>
     </w:p>
     <w:p>
@@ -319,23 +324,7 @@
         <w:pStyle w:val="ListBullet"/>
       </w:pPr>
       <w:r>
-        <w:t>Social-economic CVI is the clearest vulnerability signal. In the county-month Poisson model, a one-standard-deviation increase in social-economic CVI is associated with an estimated incidence rate ratio of approximately 1.20, or about 20 percent higher monthly outage counts, holding the model controls constant.</w:t>
-      </w:r>
-    </w:p>
-    <w:p>
-      <w:pPr>
-        <w:pStyle w:val="ListBullet"/>
-      </w:pPr>
-      <w:r>
-        <w:t>Duration evidence is more mixed. Severe weather consistently predicts longer outages, while CVI-related duration signals are weaker and most visible in event-level sensitivity models.</w:t>
-      </w:r>
-    </w:p>
-    <w:p>
-      <w:pPr>
-        <w:pStyle w:val="ListBullet"/>
-      </w:pPr>
-      <w:r>
-        <w:t>The final interpretation should be descriptive and policy-oriented rather than causal. The evidence supports a strong weather story and a more cautious equity/resilience story centered on social-economic vulnerability.</w:t>
+        <w:t>Interpretation role: foundation step only; no substantive inference is made here.</w:t>
       </w:r>
     </w:p>
     <w:p>
@@ -343,250 +332,12 @@
         <w:pStyle w:val="Heading1"/>
       </w:pPr>
       <w:r>
-        <w:t>Study Design and Modeling Rationale</w:t>
+        <w:t>Parts 1-3: Initial Tract-Year and Month Effects</w:t>
       </w:r>
     </w:p>
     <w:p>
       <w:r>
-        <w:t>The analysis begins with a tract-level exploratory dataset because tract geography is useful for mapping vulnerability and identifying spatial patterns. However, a central diagnostic shows that outage occurrence, mean outage duration, and severe-weather counts repeat for tracts within the same county-year. As a result, tract-level regressions create many rows without creating many independent outage outcomes. The report therefore treats tract-level models as exploratory evidence and relies on aggregated or event-level models for stronger interpretation.</w:t>
-      </w:r>
-    </w:p>
-    <w:p>
-      <w:r>
-        <w:t>The most important methodological correction is the shift from tract-level frequency models to a balanced county-month panel. With five counties, ten years, and twelve months per year, the county-month specification provides 600 observations and allows the model to account for seasonality directly through month effects. This design better reflects the observed outage process and avoids false tract-level precision.</w:t>
-      </w:r>
-    </w:p>
-    <w:tbl>
-      <w:tblPr>
-        <w:tblStyle w:val="TableGrid"/>
-        <w:tblW w:type="auto" w:w="0"/>
-        <w:tblLook w:firstColumn="1" w:firstRow="1" w:lastColumn="0" w:lastRow="0" w:noHBand="0" w:noVBand="1" w:val="04A0"/>
-      </w:tblPr>
-      <w:tblGrid>
-        <w:gridCol w:w="4968"/>
-        <w:gridCol w:w="4968"/>
-      </w:tblGrid>
-      <w:tr>
-        <w:tc>
-          <w:tcPr>
-            <w:tcW w:type="dxa" w:w="4968"/>
-          </w:tcPr>
-          <w:p>
-            <w:r>
-              <w:rPr>
-                <w:rFonts w:ascii="Arial" w:hAnsi="Arial"/>
-                <w:sz w:val="17"/>
-              </w:rPr>
-              <w:t>Evidence level</w:t>
-            </w:r>
-          </w:p>
-        </w:tc>
-        <w:tc>
-          <w:tcPr>
-            <w:tcW w:type="dxa" w:w="4968"/>
-          </w:tcPr>
-          <w:p>
-            <w:r>
-              <w:rPr>
-                <w:rFonts w:ascii="Arial" w:hAnsi="Arial"/>
-                <w:sz w:val="17"/>
-              </w:rPr>
-              <w:t>Role in interpretation</w:t>
-            </w:r>
-          </w:p>
-        </w:tc>
-      </w:tr>
-      <w:tr>
-        <w:tc>
-          <w:tcPr>
-            <w:tcW w:type="dxa" w:w="4968"/>
-          </w:tcPr>
-          <w:p>
-            <w:r>
-              <w:rPr>
-                <w:rFonts w:ascii="Arial" w:hAnsi="Arial"/>
-                <w:sz w:val="17"/>
-              </w:rPr>
-              <w:t>Tract-year analysis</w:t>
-            </w:r>
-          </w:p>
-        </w:tc>
-        <w:tc>
-          <w:tcPr>
-            <w:tcW w:type="dxa" w:w="4968"/>
-          </w:tcPr>
-          <w:p>
-            <w:r>
-              <w:rPr>
-                <w:rFonts w:ascii="Arial" w:hAnsi="Arial"/>
-                <w:sz w:val="17"/>
-              </w:rPr>
-              <w:t>Used for exploratory data analysis, screening, and mapping; not treated as final inferential evidence.</w:t>
-            </w:r>
-          </w:p>
-        </w:tc>
-      </w:tr>
-      <w:tr>
-        <w:tc>
-          <w:tcPr>
-            <w:tcW w:type="dxa" w:w="4968"/>
-          </w:tcPr>
-          <w:p>
-            <w:r>
-              <w:rPr>
-                <w:rFonts w:ascii="Arial" w:hAnsi="Arial"/>
-                <w:sz w:val="17"/>
-              </w:rPr>
-              <w:t>County-year analysis</w:t>
-            </w:r>
-          </w:p>
-        </w:tc>
-        <w:tc>
-          <w:tcPr>
-            <w:tcW w:type="dxa" w:w="4968"/>
-          </w:tcPr>
-          <w:p>
-            <w:r>
-              <w:rPr>
-                <w:rFonts w:ascii="Arial" w:hAnsi="Arial"/>
-                <w:sz w:val="17"/>
-              </w:rPr>
-              <w:t>Used for data-structure diagnostics, duration summaries, and small-sample sensitivity checks.</w:t>
-            </w:r>
-          </w:p>
-        </w:tc>
-      </w:tr>
-      <w:tr>
-        <w:tc>
-          <w:tcPr>
-            <w:tcW w:type="dxa" w:w="4968"/>
-          </w:tcPr>
-          <w:p>
-            <w:r>
-              <w:rPr>
-                <w:rFonts w:ascii="Arial" w:hAnsi="Arial"/>
-                <w:sz w:val="17"/>
-              </w:rPr>
-              <w:t>County-month analysis</w:t>
-            </w:r>
-          </w:p>
-        </w:tc>
-        <w:tc>
-          <w:tcPr>
-            <w:tcW w:type="dxa" w:w="4968"/>
-          </w:tcPr>
-          <w:p>
-            <w:r>
-              <w:rPr>
-                <w:rFonts w:ascii="Arial" w:hAnsi="Arial"/>
-                <w:sz w:val="17"/>
-              </w:rPr>
-              <w:t>Used for the primary frequency models because it captures seasonality and provides a larger panel.</w:t>
-            </w:r>
-          </w:p>
-        </w:tc>
-      </w:tr>
-      <w:tr>
-        <w:tc>
-          <w:tcPr>
-            <w:tcW w:type="dxa" w:w="4968"/>
-          </w:tcPr>
-          <w:p>
-            <w:r>
-              <w:rPr>
-                <w:rFonts w:ascii="Arial" w:hAnsi="Arial"/>
-                <w:sz w:val="17"/>
-              </w:rPr>
-              <w:t>Event-level analysis</w:t>
-            </w:r>
-          </w:p>
-        </w:tc>
-        <w:tc>
-          <w:tcPr>
-            <w:tcW w:type="dxa" w:w="4968"/>
-          </w:tcPr>
-          <w:p>
-            <w:r>
-              <w:rPr>
-                <w:rFonts w:ascii="Arial" w:hAnsi="Arial"/>
-                <w:sz w:val="17"/>
-              </w:rPr>
-              <w:t>Used for duration, severe-weather, and customer-hour models with deduplicated outage events.</w:t>
-            </w:r>
-          </w:p>
-        </w:tc>
-      </w:tr>
-    </w:tbl>
-    <w:p>
-      <w:pPr>
-        <w:pStyle w:val="Heading1"/>
-      </w:pPr>
-      <w:r>
-        <w:t>Exploratory Analysis</w:t>
-      </w:r>
-    </w:p>
-    <w:p>
-      <w:r>
-        <w:t>Parts 0 through 6 of the notebook provide exploratory evidence. They clean outage dates, county and tract FIPS codes, outage duration, customer counts, and severe-weather flags. They also examine severe-weather associations, year trends, month effects, visual summaries, nonparametric correlations, and seasonality clusters.</w:t>
-      </w:r>
-    </w:p>
-    <w:p>
-      <w:r>
-        <w:t>These exploratory steps are valuable because they establish the data structure and motivate later model choices. They show seasonal variation in outages, skewness in outage counts and duration, and apparent geographic clustering. They also reveal why tract-level inference must be handled cautiously. The exploratory sections should therefore be presented as pattern discovery and model selection support rather than as final evidence of causal relationships.</w:t>
-      </w:r>
-    </w:p>
-    <w:p>
-      <w:pPr>
-        <w:pStyle w:val="Heading1"/>
-      </w:pPr>
-      <w:r>
-        <w:t>Corrected Frequency and Count Models</w:t>
-      </w:r>
-    </w:p>
-    <w:p>
-      <w:r>
-        <w:t>The central correction appears in Part 8. After identifying repeated outage outcomes within county-years, the analysis collapses away false tract-level precision and shifts toward county-year and county-month models. The county-month model is the preferred frequency specification because it incorporates month effects and increases the effective panel size.</w:t>
-      </w:r>
-    </w:p>
-    <w:p>
-      <w:r>
-        <w:t>The count-model diagnostics indicate that Poisson assumptions are too restrictive for the outage counts. The estimated overdispersion is approximately 41.73, far above the ideal value of 1. A Negative Binomial model substantially improves model fit, reducing AIC from approximately 2297.1 under Poisson to approximately 551.1 with the same main predictors. Month effects remain highly significant in the county-month seasonality model, confirming the importance of seasonal structure.</w:t>
-      </w:r>
-    </w:p>
-    <w:p>
-      <w:r>
-        <w:t>Part 9 simplifies the CVI question by estimating one main CVI concept at a time. This avoids unstable coefficients caused by multicollinearity among CVI variables. The core frequency model includes time, severe-weather count, month effects, and one CVI measure. This design asks whether counties with higher vulnerability have higher monthly outage counts after accounting for time, weather, and seasonality.</w:t>
-      </w:r>
-    </w:p>
-    <w:p>
-      <w:pPr>
-        <w:pStyle w:val="Heading1"/>
-      </w:pPr>
-      <w:r>
-        <w:t>CVI, Duration, and Resilience Models</w:t>
-      </w:r>
-    </w:p>
-    <w:p>
-      <w:r>
-        <w:t>The analysis separates outage frequency from outage resilience. Frequency models ask whether vulnerable counties experience more outage events. Duration models ask whether outages last longer once they occur. This distinction matters because a county may experience frequent but short outages, or fewer outages with longer restoration times. For equity and resilience analysis, duration and customer-hour outcomes are often more policy-relevant than event counts alone.</w:t>
-      </w:r>
-    </w:p>
-    <w:p>
-      <w:r>
-        <w:t>Part 10 examines county-year duration outcomes, including median duration, p90 duration, the share of outages exceeding 8 hours, and the share exceeding 24 hours. Part 10b uses event-level models for log duration, severe-outage probability, Ridge sensitivity checks, and customer-hours. The event-level models are particularly useful because they avoid the small county-year sample and use thousands of deduplicated outage events.</w:t>
-      </w:r>
-    </w:p>
-    <w:p>
-      <w:r>
-        <w:t>Across duration models, severe weather is the most consistent predictor. CVI duration estimates are more model-sensitive. Social-economic CVI is directionally important in some event-level sensitivity models, but it should not be described as uniformly significant across all duration outcomes.</w:t>
-      </w:r>
-    </w:p>
-    <w:p>
-      <w:pPr>
-        <w:pStyle w:val="Heading1"/>
-      </w:pPr>
-      <w:r>
-        <w:t>Main Results</w:t>
+        <w:t>Parts 1 through 3 explore whether severe weather, year trends, and month effects are related to outage outcomes. These sections use tract-year summaries and year-by-month counts to identify broad patterns before moving to corrected models.</w:t>
       </w:r>
     </w:p>
     <w:tbl>
@@ -611,7 +362,7 @@
                 <w:rFonts w:ascii="Arial" w:hAnsi="Arial"/>
                 <w:sz w:val="17"/>
               </w:rPr>
-              <w:t>Finding</w:t>
+              <w:t>Part</w:t>
             </w:r>
           </w:p>
         </w:tc>
@@ -625,7 +376,7 @@
                 <w:rFonts w:ascii="Arial" w:hAnsi="Arial"/>
                 <w:sz w:val="17"/>
               </w:rPr>
-              <w:t>Evidence</w:t>
+              <w:t>Methodology</w:t>
             </w:r>
           </w:p>
         </w:tc>
@@ -639,7 +390,7 @@
                 <w:rFonts w:ascii="Arial" w:hAnsi="Arial"/>
                 <w:sz w:val="17"/>
               </w:rPr>
-              <w:t>Recommended interpretation</w:t>
+              <w:t>Use in final interpretation</w:t>
             </w:r>
           </w:p>
         </w:tc>
@@ -655,7 +406,7 @@
                 <w:rFonts w:ascii="Arial" w:hAnsi="Arial"/>
                 <w:sz w:val="17"/>
               </w:rPr>
-              <w:t>Severe weather is the strongest predictor.</w:t>
+              <w:t>Part 1</w:t>
             </w:r>
           </w:p>
         </w:tc>
@@ -669,7 +420,7 @@
                 <w:rFonts w:ascii="Arial" w:hAnsi="Arial"/>
                 <w:sz w:val="17"/>
               </w:rPr>
-              <w:t>Event-level models show strong associations with log duration and customer-hours.</w:t>
+              <w:t>Per-tract OLS models of outage occurrence and log duration on severe-weather count, with FDR correction.</w:t>
             </w:r>
           </w:p>
         </w:tc>
@@ -683,7 +434,7 @@
                 <w:rFonts w:ascii="Arial" w:hAnsi="Arial"/>
                 <w:sz w:val="17"/>
               </w:rPr>
-              <w:t>Report as the most robust and least ambiguous finding.</w:t>
+              <w:t>Exploratory screen for weather-outage association.</w:t>
             </w:r>
           </w:p>
         </w:tc>
@@ -699,7 +450,7 @@
                 <w:rFonts w:ascii="Arial" w:hAnsi="Arial"/>
                 <w:sz w:val="17"/>
               </w:rPr>
-              <w:t>Social-economic CVI is the clearest vulnerability signal.</w:t>
+              <w:t>Part 2</w:t>
             </w:r>
           </w:p>
         </w:tc>
@@ -713,7 +464,7 @@
                 <w:rFonts w:ascii="Arial" w:hAnsi="Arial"/>
                 <w:sz w:val="17"/>
               </w:rPr>
-              <w:t>County-month Poisson estimate: IRR about 1.20 for a one-standard-deviation increase.</w:t>
+              <w:t>Per-tract year-trend OLS, Kendall tau, and Theil-Sen slope checks.</w:t>
             </w:r>
           </w:p>
         </w:tc>
@@ -727,7 +478,7 @@
                 <w:rFonts w:ascii="Arial" w:hAnsi="Arial"/>
                 <w:sz w:val="17"/>
               </w:rPr>
-              <w:t>Report as evidence that social vulnerability is associated with higher outage frequency.</w:t>
+              <w:t>Describes temporal patterns but is not final causal evidence.</w:t>
             </w:r>
           </w:p>
         </w:tc>
@@ -743,7 +494,7 @@
                 <w:rFonts w:ascii="Arial" w:hAnsi="Arial"/>
                 <w:sz w:val="17"/>
               </w:rPr>
-              <w:t>Overall CVI is positive but less clear.</w:t>
+              <w:t>Part 3</w:t>
             </w:r>
           </w:p>
         </w:tc>
@@ -757,7 +508,7 @@
                 <w:rFonts w:ascii="Arial" w:hAnsi="Arial"/>
                 <w:sz w:val="17"/>
               </w:rPr>
-              <w:t>County-month Poisson IRR about 1.14.</w:t>
+              <w:t>Year-by-month chi-square tests and FDR-adjusted residual checks.</w:t>
             </w:r>
           </w:p>
         </w:tc>
@@ -771,7 +522,192 @@
                 <w:rFonts w:ascii="Arial" w:hAnsi="Arial"/>
                 <w:sz w:val="17"/>
               </w:rPr>
-              <w:t>Use as supporting evidence for the broader vulnerability story.</w:t>
+              <w:t>Identifies seasonality and motivates month controls in later models.</w:t>
+            </w:r>
+          </w:p>
+        </w:tc>
+      </w:tr>
+    </w:tbl>
+    <w:p>
+      <w:r>
+        <w:t>These early analyses are useful for pattern discovery, but they are not the strongest evidence because tract-level observations do not represent fully independent outage outcomes.</w:t>
+      </w:r>
+    </w:p>
+    <w:p>
+      <w:pPr>
+        <w:pStyle w:val="Heading1"/>
+      </w:pPr>
+      <w:r>
+        <w:t>Parts 4-6: Visualization, Correlation, and Seasonality Clustering</w:t>
+      </w:r>
+    </w:p>
+    <w:p>
+      <w:r>
+        <w:t>Parts 4 through 6 summarize spatial and seasonal structure. Visualizations show annual totals and monthly heat maps. Spearman correlations are used because outage counts and duration are skewed. K-means clustering is applied to monthly outage-share profiles to summarize seasonality patterns.</w:t>
+      </w:r>
+    </w:p>
+    <w:p>
+      <w:pPr>
+        <w:pStyle w:val="ListBullet"/>
+      </w:pPr>
+      <w:r>
+        <w:t>Methodology: descriptive visualization, nonparametric correlation, and clustering of monthly outage-share profiles.</w:t>
+      </w:r>
+    </w:p>
+    <w:p>
+      <w:pPr>
+        <w:pStyle w:val="ListBullet"/>
+      </w:pPr>
+      <w:r>
+        <w:t>Main role: communicate patterns and diagnose structure before modeling.</w:t>
+      </w:r>
+    </w:p>
+    <w:p>
+      <w:pPr>
+        <w:pStyle w:val="ListBullet"/>
+      </w:pPr>
+      <w:r>
+        <w:t>Important caveat: the clustering reflects county-level seasonality more than true tract-level heterogeneity because many tract profiles duplicate county patterns.</w:t>
+      </w:r>
+    </w:p>
+    <w:p>
+      <w:pPr>
+        <w:pStyle w:val="Heading1"/>
+      </w:pPr>
+      <w:r>
+        <w:t>Part 7: CVI Variables and Exploratory Regressions</w:t>
+      </w:r>
+    </w:p>
+    <w:p>
+      <w:r>
+        <w:t>Part 7 adds CVI measures to the outage panel. The candidate variables include overall CVI, baseline social-economic CVI, baseline infrastructure CVI, and climate/extreme-events CVI. Exploratory tract-year regressions are used to understand possible vulnerability relationships.</w:t>
+      </w:r>
+    </w:p>
+    <w:p>
+      <w:pPr>
+        <w:pStyle w:val="ListBullet"/>
+      </w:pPr>
+      <w:r>
+        <w:t>Methodology: merge tract-level CVI features, construct tract-year outcomes, and fit exploratory regression models.</w:t>
+      </w:r>
+    </w:p>
+    <w:p>
+      <w:pPr>
+        <w:pStyle w:val="ListBullet"/>
+      </w:pPr>
+      <w:r>
+        <w:t>Key caution: CVI variables are correlated with one another, so models with many CVI predictors can produce unstable coefficients.</w:t>
+      </w:r>
+    </w:p>
+    <w:p>
+      <w:pPr>
+        <w:pStyle w:val="ListBullet"/>
+      </w:pPr>
+      <w:r>
+        <w:t>Interpretation role: hypothesis generation rather than final evidence.</w:t>
+      </w:r>
+    </w:p>
+    <w:p>
+      <w:pPr>
+        <w:pStyle w:val="Heading1"/>
+      </w:pPr>
+      <w:r>
+        <w:t>Part 8: Data Structure Correction</w:t>
+      </w:r>
+    </w:p>
+    <w:p>
+      <w:r>
+        <w:t>Part 8 is the methodological turning point. It shows that outage occurrence, mean duration, and severe-weather count are often identical for tracts within the same county-year. This means tract-level regressions create a misleading sense of precision. The corrected analysis therefore collapses the data to county-year and county-month panels for the main frequency models.</w:t>
+      </w:r>
+    </w:p>
+    <w:p>
+      <w:pPr>
+        <w:pStyle w:val="ListBullet"/>
+      </w:pPr>
+      <w:r>
+        <w:t>Methodology: county-year consistency checks, county-year collapse, OLS/Poisson diagnostics, and VIF checks.</w:t>
+      </w:r>
+    </w:p>
+    <w:p>
+      <w:pPr>
+        <w:pStyle w:val="ListBullet"/>
+      </w:pPr>
+      <w:r>
+        <w:t>Reason for correction: repeated tract rows do not add independent outage information.</w:t>
+      </w:r>
+    </w:p>
+    <w:p>
+      <w:pPr>
+        <w:pStyle w:val="ListBullet"/>
+      </w:pPr>
+      <w:r>
+        <w:t>Final implication: tract-level results should be used for maps and screening; county-month and event-level models should carry the main interpretation.</w:t>
+      </w:r>
+    </w:p>
+    <w:p>
+      <w:pPr>
+        <w:pStyle w:val="Heading1"/>
+      </w:pPr>
+      <w:r>
+        <w:t>Part 8b and Part 9: Corrected Frequency Models</w:t>
+      </w:r>
+    </w:p>
+    <w:p>
+      <w:r>
+        <w:t>The corrected frequency analysis uses count models and county-month models. Poisson diagnostics show substantial overdispersion, so Negative Binomial models are preferred for outage counts. Part 9 then estimates one main CVI concept at a time in a county-month framework with time, severe-weather, and month controls.</w:t>
+      </w:r>
+    </w:p>
+    <w:tbl>
+      <w:tblPr>
+        <w:tblStyle w:val="TableGrid"/>
+        <w:tblW w:type="auto" w:w="0"/>
+        <w:tblLook w:firstColumn="1" w:firstRow="1" w:lastColumn="0" w:lastRow="0" w:noHBand="0" w:noVBand="1" w:val="04A0"/>
+      </w:tblPr>
+      <w:tblGrid>
+        <w:gridCol w:w="3312"/>
+        <w:gridCol w:w="3312"/>
+        <w:gridCol w:w="3312"/>
+      </w:tblGrid>
+      <w:tr>
+        <w:tc>
+          <w:tcPr>
+            <w:tcW w:type="dxa" w:w="3312"/>
+          </w:tcPr>
+          <w:p>
+            <w:r>
+              <w:rPr>
+                <w:rFonts w:ascii="Arial" w:hAnsi="Arial"/>
+                <w:sz w:val="17"/>
+              </w:rPr>
+              <w:t>Model component</w:t>
+            </w:r>
+          </w:p>
+        </w:tc>
+        <w:tc>
+          <w:tcPr>
+            <w:tcW w:type="dxa" w:w="3312"/>
+          </w:tcPr>
+          <w:p>
+            <w:r>
+              <w:rPr>
+                <w:rFonts w:ascii="Arial" w:hAnsi="Arial"/>
+                <w:sz w:val="17"/>
+              </w:rPr>
+              <w:t>Methodology</w:t>
+            </w:r>
+          </w:p>
+        </w:tc>
+        <w:tc>
+          <w:tcPr>
+            <w:tcW w:type="dxa" w:w="3312"/>
+          </w:tcPr>
+          <w:p>
+            <w:r>
+              <w:rPr>
+                <w:rFonts w:ascii="Arial" w:hAnsi="Arial"/>
+                <w:sz w:val="17"/>
+              </w:rPr>
+              <w:t>Interpretation</w:t>
             </w:r>
           </w:p>
         </w:tc>
@@ -787,7 +723,7 @@
                 <w:rFonts w:ascii="Arial" w:hAnsi="Arial"/>
                 <w:sz w:val="17"/>
               </w:rPr>
-              <w:t>Climate-extreme-events CVI has an unexpected negative sign.</w:t>
+              <w:t>Overdispersion check</w:t>
             </w:r>
           </w:p>
         </w:tc>
@@ -801,7 +737,7 @@
                 <w:rFonts w:ascii="Arial" w:hAnsi="Arial"/>
                 <w:sz w:val="17"/>
               </w:rPr>
-              <w:t>Part 9 Poisson IRR about 0.65.</w:t>
+              <w:t>Compare Poisson assumptions against observed count variance.</w:t>
             </w:r>
           </w:p>
         </w:tc>
@@ -815,7 +751,7 @@
                 <w:rFonts w:ascii="Arial" w:hAnsi="Arial"/>
                 <w:sz w:val="17"/>
               </w:rPr>
-              <w:t>Treat as a modeling caution, not as a policy headline.</w:t>
+              <w:t>Poisson is too restrictive when overdispersion is high.</w:t>
             </w:r>
           </w:p>
         </w:tc>
@@ -831,7 +767,7 @@
                 <w:rFonts w:ascii="Arial" w:hAnsi="Arial"/>
                 <w:sz w:val="17"/>
               </w:rPr>
-              <w:t>Infrastructure CVI is suggestive but imprecise.</w:t>
+              <w:t>Negative Binomial</w:t>
             </w:r>
           </w:p>
         </w:tc>
@@ -845,7 +781,7 @@
                 <w:rFonts w:ascii="Arial" w:hAnsi="Arial"/>
                 <w:sz w:val="17"/>
               </w:rPr>
-              <w:t>Positive in theory-driven OLS and Ridge, but intervals cross zero.</w:t>
+              <w:t>Use an overdispersed count model for outage frequency.</w:t>
             </w:r>
           </w:p>
         </w:tc>
@@ -859,7 +795,7 @@
                 <w:rFonts w:ascii="Arial" w:hAnsi="Arial"/>
                 <w:sz w:val="17"/>
               </w:rPr>
-              <w:t>Describe as directional and hypothesis-generating.</w:t>
+              <w:t>Preferred count-model family for frequency.</w:t>
             </w:r>
           </w:p>
         </w:tc>
@@ -875,7 +811,7 @@
                 <w:rFonts w:ascii="Arial" w:hAnsi="Arial"/>
                 <w:sz w:val="17"/>
               </w:rPr>
-              <w:t>Duration evidence is mixed for CVI.</w:t>
+              <w:t>County-month panel</w:t>
             </w:r>
           </w:p>
         </w:tc>
@@ -889,7 +825,7 @@
                 <w:rFonts w:ascii="Arial" w:hAnsi="Arial"/>
                 <w:sz w:val="17"/>
               </w:rPr>
-              <w:t>Severe weather predicts duration more consistently than CVI terms.</w:t>
+              <w:t>Five counties x ten years x twelve months, producing 600 observations.</w:t>
             </w:r>
           </w:p>
         </w:tc>
@@ -903,28 +839,59 @@
                 <w:rFonts w:ascii="Arial" w:hAnsi="Arial"/>
                 <w:sz w:val="17"/>
               </w:rPr>
-              <w:t>Frame CVI duration results cautiously and emphasize event-level sensitivity checks.</w:t>
+              <w:t>Main frequency model because it accounts for seasonality and avoids tract-level pseudo-replication.</w:t>
+            </w:r>
+          </w:p>
+        </w:tc>
+      </w:tr>
+      <w:tr>
+        <w:tc>
+          <w:tcPr>
+            <w:tcW w:type="dxa" w:w="3312"/>
+          </w:tcPr>
+          <w:p>
+            <w:r>
+              <w:rPr>
+                <w:rFonts w:ascii="Arial" w:hAnsi="Arial"/>
+                <w:sz w:val="17"/>
+              </w:rPr>
+              <w:t>One-CVI-at-a-time models</w:t>
+            </w:r>
+          </w:p>
+        </w:tc>
+        <w:tc>
+          <w:tcPr>
+            <w:tcW w:type="dxa" w:w="3312"/>
+          </w:tcPr>
+          <w:p>
+            <w:r>
+              <w:rPr>
+                <w:rFonts w:ascii="Arial" w:hAnsi="Arial"/>
+                <w:sz w:val="17"/>
+              </w:rPr>
+              <w:t>Estimate separate models for overall, social-economic, climate, and high-vulnerability-share concepts.</w:t>
+            </w:r>
+          </w:p>
+        </w:tc>
+        <w:tc>
+          <w:tcPr>
+            <w:tcW w:type="dxa" w:w="3312"/>
+          </w:tcPr>
+          <w:p>
+            <w:r>
+              <w:rPr>
+                <w:rFonts w:ascii="Arial" w:hAnsi="Arial"/>
+                <w:sz w:val="17"/>
+              </w:rPr>
+              <w:t>Improves interpretability and reduces multicollinearity problems.</w:t>
             </w:r>
           </w:p>
         </w:tc>
       </w:tr>
     </w:tbl>
     <w:p>
-      <w:pPr>
-        <w:pStyle w:val="Heading1"/>
-      </w:pPr>
       <w:r>
-        <w:t>Interpretation</w:t>
-      </w:r>
-    </w:p>
-    <w:p>
-      <w:r>
-        <w:t>The most defensible interpretation is that the outage data show a strong weather pattern and a more cautious vulnerability pattern. Severe weather is consistently linked to more serious outage outcomes. Social-economic vulnerability is also important, particularly in the corrected county-month frequency model and in event-level duration sensitivity checks. However, not every CVI measure behaves consistently, and some estimates remain imprecise.</w:t>
-      </w:r>
-    </w:p>
-    <w:p>
-      <w:r>
-        <w:t>The report should therefore avoid the claim that every CVI dimension strongly predicts every outage outcome. A more accurate conclusion is that vulnerability appears policy-relevant, especially through social-economic conditions and resilience after outages occur, but the magnitude and statistical certainty depend on the model and outcome.</w:t>
+        <w:t>The clearest vulnerability signal appears for social-economic CVI. In the county-month Poisson specification, a one-standard-deviation increase in social-economic CVI is associated with an incidence rate ratio of approximately 1.20, or about 20 percent higher monthly outage counts, conditional on the model controls.</w:t>
       </w:r>
     </w:p>
     <w:p>
@@ -932,7 +899,12 @@
         <w:pStyle w:val="Heading1"/>
       </w:pPr>
       <w:r>
-        <w:t>Limitations</w:t>
+        <w:t>Part 9b: Theory-Driven CVI Selection and Ridge Sensitivity</w:t>
+      </w:r>
+    </w:p>
+    <w:p>
+      <w:r>
+        <w:t>Part 9b narrows the vulnerability question to theoretically motivated predictors, including social-economic CVI, infrastructure CVI, and severe-weather count. OLS and Ridge models are compared to assess whether coefficient signs remain stable when predictors are correlated.</w:t>
       </w:r>
     </w:p>
     <w:p>
@@ -940,7 +912,7 @@
         <w:pStyle w:val="ListBullet"/>
       </w:pPr>
       <w:r>
-        <w:t>County-year models are based on approximately 50 observations, so asymptotic p-values and HC3 standard errors should be interpreted cautiously.</w:t>
+        <w:t>Methodology: compare OLS estimates with Ridge sensitivity models.</w:t>
       </w:r>
     </w:p>
     <w:p>
@@ -948,7 +920,7 @@
         <w:pStyle w:val="ListBullet"/>
       </w:pPr>
       <w:r>
-        <w:t>Only five counties are observed, which means cross-sectional results may be sensitive to one county with unusually high or low outage burden.</w:t>
+        <w:t>Use of Ridge: directional robustness check, not the primary explanatory model.</w:t>
       </w:r>
     </w:p>
     <w:p>
@@ -956,7 +928,270 @@
         <w:pStyle w:val="ListBullet"/>
       </w:pPr>
       <w:r>
-        <w:t>Tract-level regressions are exploratory because outage outcomes are repeated within county-years and do not represent independent tract-level outage processes.</w:t>
+        <w:t>Interpretation: infrastructure CVI is positive but imprecise; social-economic CVI is directionally consistent but still sensitive to small county-level sample size.</w:t>
+      </w:r>
+    </w:p>
+    <w:p>
+      <w:pPr>
+        <w:pStyle w:val="Heading1"/>
+      </w:pPr>
+      <w:r>
+        <w:t>Part 10 and Part 10b: Duration and Resilience Models</w:t>
+      </w:r>
+    </w:p>
+    <w:p>
+      <w:r>
+        <w:t>Parts 10 and 10b separate outage frequency from outage resilience. Frequency asks whether outages occur more often. Duration asks whether outages last longer once they occur. This distinction matters because high-burden communities may be affected through restoration time rather than event count alone.</w:t>
+      </w:r>
+    </w:p>
+    <w:tbl>
+      <w:tblPr>
+        <w:tblStyle w:val="TableGrid"/>
+        <w:tblW w:type="auto" w:w="0"/>
+        <w:tblLook w:firstColumn="1" w:firstRow="1" w:lastColumn="0" w:lastRow="0" w:noHBand="0" w:noVBand="1" w:val="04A0"/>
+      </w:tblPr>
+      <w:tblGrid>
+        <w:gridCol w:w="3312"/>
+        <w:gridCol w:w="3312"/>
+        <w:gridCol w:w="3312"/>
+      </w:tblGrid>
+      <w:tr>
+        <w:tc>
+          <w:tcPr>
+            <w:tcW w:type="dxa" w:w="3312"/>
+          </w:tcPr>
+          <w:p>
+            <w:r>
+              <w:rPr>
+                <w:rFonts w:ascii="Arial" w:hAnsi="Arial"/>
+                <w:sz w:val="17"/>
+              </w:rPr>
+              <w:t>Outcome family</w:t>
+            </w:r>
+          </w:p>
+        </w:tc>
+        <w:tc>
+          <w:tcPr>
+            <w:tcW w:type="dxa" w:w="3312"/>
+          </w:tcPr>
+          <w:p>
+            <w:r>
+              <w:rPr>
+                <w:rFonts w:ascii="Arial" w:hAnsi="Arial"/>
+                <w:sz w:val="17"/>
+              </w:rPr>
+              <w:t>Methodology</w:t>
+            </w:r>
+          </w:p>
+        </w:tc>
+        <w:tc>
+          <w:tcPr>
+            <w:tcW w:type="dxa" w:w="3312"/>
+          </w:tcPr>
+          <w:p>
+            <w:r>
+              <w:rPr>
+                <w:rFonts w:ascii="Arial" w:hAnsi="Arial"/>
+                <w:sz w:val="17"/>
+              </w:rPr>
+              <w:t>Main interpretation</w:t>
+            </w:r>
+          </w:p>
+        </w:tc>
+      </w:tr>
+      <w:tr>
+        <w:tc>
+          <w:tcPr>
+            <w:tcW w:type="dxa" w:w="3312"/>
+          </w:tcPr>
+          <w:p>
+            <w:r>
+              <w:rPr>
+                <w:rFonts w:ascii="Arial" w:hAnsi="Arial"/>
+                <w:sz w:val="17"/>
+              </w:rPr>
+              <w:t>County-year duration</w:t>
+            </w:r>
+          </w:p>
+        </w:tc>
+        <w:tc>
+          <w:tcPr>
+            <w:tcW w:type="dxa" w:w="3312"/>
+          </w:tcPr>
+          <w:p>
+            <w:r>
+              <w:rPr>
+                <w:rFonts w:ascii="Arial" w:hAnsi="Arial"/>
+                <w:sz w:val="17"/>
+              </w:rPr>
+              <w:t>Median duration, p90 duration, share above 8 hours, and share above 24 hours.</w:t>
+            </w:r>
+          </w:p>
+        </w:tc>
+        <w:tc>
+          <w:tcPr>
+            <w:tcW w:type="dxa" w:w="3312"/>
+          </w:tcPr>
+          <w:p>
+            <w:r>
+              <w:rPr>
+                <w:rFonts w:ascii="Arial" w:hAnsi="Arial"/>
+                <w:sz w:val="17"/>
+              </w:rPr>
+              <w:t>Useful but limited by small county-year sample.</w:t>
+            </w:r>
+          </w:p>
+        </w:tc>
+      </w:tr>
+      <w:tr>
+        <w:tc>
+          <w:tcPr>
+            <w:tcW w:type="dxa" w:w="3312"/>
+          </w:tcPr>
+          <w:p>
+            <w:r>
+              <w:rPr>
+                <w:rFonts w:ascii="Arial" w:hAnsi="Arial"/>
+                <w:sz w:val="17"/>
+              </w:rPr>
+              <w:t>Event-level log duration</w:t>
+            </w:r>
+          </w:p>
+        </w:tc>
+        <w:tc>
+          <w:tcPr>
+            <w:tcW w:type="dxa" w:w="3312"/>
+          </w:tcPr>
+          <w:p>
+            <w:r>
+              <w:rPr>
+                <w:rFonts w:ascii="Arial" w:hAnsi="Arial"/>
+                <w:sz w:val="17"/>
+              </w:rPr>
+              <w:t>OLS and clustered/sensitivity specifications on deduplicated outage events.</w:t>
+            </w:r>
+          </w:p>
+        </w:tc>
+        <w:tc>
+          <w:tcPr>
+            <w:tcW w:type="dxa" w:w="3312"/>
+          </w:tcPr>
+          <w:p>
+            <w:r>
+              <w:rPr>
+                <w:rFonts w:ascii="Arial" w:hAnsi="Arial"/>
+                <w:sz w:val="17"/>
+              </w:rPr>
+              <w:t>Stronger duration evidence because the event is the unit of analysis.</w:t>
+            </w:r>
+          </w:p>
+        </w:tc>
+      </w:tr>
+      <w:tr>
+        <w:tc>
+          <w:tcPr>
+            <w:tcW w:type="dxa" w:w="3312"/>
+          </w:tcPr>
+          <w:p>
+            <w:r>
+              <w:rPr>
+                <w:rFonts w:ascii="Arial" w:hAnsi="Arial"/>
+                <w:sz w:val="17"/>
+              </w:rPr>
+              <w:t>Severe outage probability</w:t>
+            </w:r>
+          </w:p>
+        </w:tc>
+        <w:tc>
+          <w:tcPr>
+            <w:tcW w:type="dxa" w:w="3312"/>
+          </w:tcPr>
+          <w:p>
+            <w:r>
+              <w:rPr>
+                <w:rFonts w:ascii="Arial" w:hAnsi="Arial"/>
+                <w:sz w:val="17"/>
+              </w:rPr>
+              <w:t>Logistic or GEE-style binary models for long/severe outage outcomes.</w:t>
+            </w:r>
+          </w:p>
+        </w:tc>
+        <w:tc>
+          <w:tcPr>
+            <w:tcW w:type="dxa" w:w="3312"/>
+          </w:tcPr>
+          <w:p>
+            <w:r>
+              <w:rPr>
+                <w:rFonts w:ascii="Arial" w:hAnsi="Arial"/>
+                <w:sz w:val="17"/>
+              </w:rPr>
+              <w:t>Appropriate for binary severe-outage indicators.</w:t>
+            </w:r>
+          </w:p>
+        </w:tc>
+      </w:tr>
+      <w:tr>
+        <w:tc>
+          <w:tcPr>
+            <w:tcW w:type="dxa" w:w="3312"/>
+          </w:tcPr>
+          <w:p>
+            <w:r>
+              <w:rPr>
+                <w:rFonts w:ascii="Arial" w:hAnsi="Arial"/>
+                <w:sz w:val="17"/>
+              </w:rPr>
+              <w:t>Customer-hours</w:t>
+            </w:r>
+          </w:p>
+        </w:tc>
+        <w:tc>
+          <w:tcPr>
+            <w:tcW w:type="dxa" w:w="3312"/>
+          </w:tcPr>
+          <w:p>
+            <w:r>
+              <w:rPr>
+                <w:rFonts w:ascii="Arial" w:hAnsi="Arial"/>
+                <w:sz w:val="17"/>
+              </w:rPr>
+              <w:t>Event-level customer impact multiplied by duration.</w:t>
+            </w:r>
+          </w:p>
+        </w:tc>
+        <w:tc>
+          <w:tcPr>
+            <w:tcW w:type="dxa" w:w="3312"/>
+          </w:tcPr>
+          <w:p>
+            <w:r>
+              <w:rPr>
+                <w:rFonts w:ascii="Arial" w:hAnsi="Arial"/>
+                <w:sz w:val="17"/>
+              </w:rPr>
+              <w:t>Captures both outage length and affected customers.</w:t>
+            </w:r>
+          </w:p>
+        </w:tc>
+      </w:tr>
+    </w:tbl>
+    <w:p>
+      <w:r>
+        <w:t>Severe weather is the most consistent predictor of longer duration and larger customer-hour impacts. CVI duration evidence is weaker and more model-sensitive, although social-economic CVI remains the most plausible vulnerability channel.</w:t>
+      </w:r>
+    </w:p>
+    <w:p>
+      <w:pPr>
+        <w:pStyle w:val="Heading1"/>
+      </w:pPr>
+      <w:r>
+        <w:t>Part 11: Robustness Summary</w:t>
+      </w:r>
+    </w:p>
+    <w:p>
+      <w:r>
+        <w:t>Part 11 compares results across county-year frequency, county-year duration, event-level OLS, and event-level Ridge specifications. This section is important because it prevents the analysis from relying on a single model specification.</w:t>
       </w:r>
     </w:p>
     <w:p>
@@ -964,7 +1199,7 @@
         <w:pStyle w:val="ListBullet"/>
       </w:pPr>
       <w:r>
-        <w:t>Ridge models use a fixed alpha value and should be treated as sensitivity checks unless cross-validation is added.</w:t>
+        <w:t>Methodology: compare coefficient direction, interval coverage, and model level across specifications.</w:t>
       </w:r>
     </w:p>
     <w:p>
@@ -972,7 +1207,7 @@
         <w:pStyle w:val="ListBullet"/>
       </w:pPr>
       <w:r>
-        <w:t>The severe-weather flag requires clearer documentation, especially whether it is assigned at the event level or row level.</w:t>
+        <w:t>Main finding: severe weather is robust across model families; social-economic CVI is the clearest vulnerability signal but not uniformly significant.</w:t>
       </w:r>
     </w:p>
     <w:p>
@@ -980,7 +1215,7 @@
         <w:pStyle w:val="ListBullet"/>
       </w:pPr>
       <w:r>
-        <w:t>The seasonality clustering in Part 6 reflects county-level profiles more than tract-level heterogeneity.</w:t>
+        <w:t>Recommended language: describe CVI findings as policy-relevant and directional rather than definitive across every outcome.</w:t>
       </w:r>
     </w:p>
     <w:p>
@@ -988,7 +1223,12 @@
         <w:pStyle w:val="Heading1"/>
       </w:pPr>
       <w:r>
-        <w:t>Recommended Next Steps</w:t>
+        <w:t>Part 12: Mechanism Interpretation</w:t>
+      </w:r>
+    </w:p>
+    <w:p>
+      <w:r>
+        <w:t>Part 12 synthesizes the frequency and duration evidence. The careful interpretation is that outage burden has a strong weather component and a more cautious vulnerability component. Social-economic vulnerability appears most relevant in the corrected county-month frequency model and in selected event-level duration sensitivity checks.</w:t>
       </w:r>
     </w:p>
     <w:p>
@@ -996,7 +1236,7 @@
         <w:pStyle w:val="ListBullet"/>
       </w:pPr>
       <w:r>
-        <w:t>Use Negative Binomial or other overdispersed count models for final outage-count interpretation.</w:t>
+        <w:t>Strongest claim: severe weather is consistently associated with more severe outage outcomes.</w:t>
       </w:r>
     </w:p>
     <w:p>
@@ -1004,7 +1244,7 @@
         <w:pStyle w:val="ListBullet"/>
       </w:pPr>
       <w:r>
-        <w:t>Use the county-month Part 9 models for the cleanest CVI frequency story.</w:t>
+        <w:t>Most credible CVI pattern: social-economic vulnerability is associated with higher outage frequency and may relate to longer restoration burden.</w:t>
       </w:r>
     </w:p>
     <w:p>
@@ -1012,7 +1252,15 @@
         <w:pStyle w:val="ListBullet"/>
       </w:pPr>
       <w:r>
-        <w:t>Use event-level duration and customer-hour models for resilience interpretation.</w:t>
+        <w:t>What not to claim: every CVI dimension predicts every outage outcome. Climate-extreme-events CVI, in particular, should be treated cautiously because its sign is not intuitive in some models.</w:t>
+      </w:r>
+    </w:p>
+    <w:p>
+      <w:pPr>
+        <w:pStyle w:val="Heading1"/>
+      </w:pPr>
+      <w:r>
+        <w:t>Key Limitations</w:t>
       </w:r>
     </w:p>
     <w:p>
@@ -1020,7 +1268,7 @@
         <w:pStyle w:val="ListBullet"/>
       </w:pPr>
       <w:r>
-        <w:t>Add cross-validation for Ridge alpha values before reporting Ridge magnitudes.</w:t>
+        <w:t>County-year models have approximately 50 observations, so p-values and confidence intervals should be interpreted cautiously.</w:t>
       </w:r>
     </w:p>
     <w:p>
@@ -1028,7 +1276,7 @@
         <w:pStyle w:val="ListBullet"/>
       </w:pPr>
       <w:r>
-        <w:t>Add permutation-based p-values or bootstrap intervals for county-year models because N is small.</w:t>
+        <w:t>Only five counties are observed, which makes cross-sectional estimates sensitive to individual counties.</w:t>
       </w:r>
     </w:p>
     <w:p>
@@ -1036,7 +1284,7 @@
         <w:pStyle w:val="ListBullet"/>
       </w:pPr>
       <w:r>
-        <w:t>Document the construction and granularity of the severe-weather flag.</w:t>
+        <w:t>Tract-level regressions are exploratory because outage outcomes repeat within county-year cells.</w:t>
       </w:r>
     </w:p>
     <w:p>
@@ -1044,7 +1292,7 @@
         <w:pStyle w:val="ListBullet"/>
       </w:pPr>
       <w:r>
-        <w:t>Reframe Part 6 explicitly as county seasonality profiling rather than tract-level clustering.</w:t>
+        <w:t>Ridge models should be treated as sensitivity checks unless alpha is selected by cross-validation.</w:t>
       </w:r>
     </w:p>
     <w:p>
@@ -1052,7 +1300,15 @@
         <w:pStyle w:val="ListBullet"/>
       </w:pPr>
       <w:r>
-        <w:t>If available, acquire utility-provided tract-level outage data to support true tract-level CVI inference.</w:t>
+        <w:t>The severe-weather flag should be documented more fully, especially whether it is assigned at the event level or row level.</w:t>
+      </w:r>
+    </w:p>
+    <w:p>
+      <w:pPr>
+        <w:pStyle w:val="ListBullet"/>
+      </w:pPr>
+      <w:r>
+        <w:t>True tract-level inference would require more granular utility outage data or a data source where outage outcomes vary independently by tract.</w:t>
       </w:r>
     </w:p>
     <w:p>
@@ -1060,12 +1316,12 @@
         <w:pStyle w:val="Heading1"/>
       </w:pPr>
       <w:r>
-        <w:t>Conclusion</w:t>
+        <w:t>Recommended Final Framing</w:t>
       </w:r>
     </w:p>
     <w:p>
       <w:r>
-        <w:t>The final report should emphasize severe weather first, social-economic vulnerability second, and model uncertainty third. The strongest statistical evidence is that severe weather is associated with more severe outage outcomes. Social-economic CVI provides the most credible vulnerability signal, especially for monthly outage frequency and selected duration sensitivity checks. The appropriate framing is therefore an equity and resilience interpretation: outage burden is strongly weather-driven, while social vulnerability may shape the distribution and persistence of outage impacts.</w:t>
+        <w:t>The final narrative should emphasize severe weather first, social-economic vulnerability second, and uncertainty third. The strongest evidence is that severe weather is associated with more serious outage outcomes. The most credible equity finding is that social-economic vulnerability is associated with outage frequency in the corrected county-month model and may also be relevant for duration in event-level sensitivity checks. The analysis should be presented as an EDA and modeling workflow that identifies policy-relevant vulnerability patterns, not as a causal proof that CVI alone determines outage burden.</w:t>
       </w:r>
     </w:p>
     <w:sectPr>
@@ -1087,7 +1343,7 @@
       <w:jc w:val="center"/>
     </w:pPr>
     <w:r>
-      <w:t>NYC Power Outage Vulnerability Analysis | Formal Report Summary</w:t>
+      <w:t>NYC Power Outage EDA | Methods and Results Summary by Notebook Part</w:t>
     </w:r>
   </w:p>
 </w:ftr>
@@ -1809,11 +2065,11 @@
       <w:contextualSpacing/>
     </w:pPr>
     <w:rPr>
-      <w:rFonts w:asciiTheme="majorHAnsi" w:eastAsiaTheme="majorEastAsia" w:hAnsiTheme="majorHAnsi" w:cstheme="majorBidi" w:ascii="Arial" w:hAnsi="Arial"/>
+      <w:rFonts w:asciiTheme="majorHAnsi" w:eastAsiaTheme="majorEastAsia" w:hAnsiTheme="majorHAnsi" w:cstheme="majorBidi"/>
       <w:color w:val="17365D" w:themeColor="text2" w:themeShade="BF"/>
       <w:spacing w:val="5"/>
       <w:kern w:val="28"/>
-      <w:sz w:val="32"/>
+      <w:sz w:val="52"/>
       <w:szCs w:val="52"/>
     </w:rPr>
   </w:style>

</xml_diff>

<commit_message>
Update outage report and EDA notebook
</commit_message>
<xml_diff>
--- a/docs/EDA_Outage_Report.docx
+++ b/docs/EDA_Outage_Report.docx
@@ -1268,7 +1268,7 @@
         <w:pStyle w:val="ListBullet"/>
       </w:pPr>
       <w:r>
-        <w:t>County-year models have approximately 50 observations, so p-values and confidence intervals should be interpreted cautiously.</w:t>
+        <w:t>County-month models have approximately 600 observations (5 counties × 10 years × 12 months), so p-values and confidence intervals should be interpreted cautiously.</w:t>
       </w:r>
     </w:p>
     <w:p>
@@ -1309,19 +1309,6 @@
       </w:pPr>
       <w:r>
         <w:t>True tract-level inference would require more granular utility outage data or a data source where outage outcomes vary independently by tract.</w:t>
-      </w:r>
-    </w:p>
-    <w:p>
-      <w:pPr>
-        <w:pStyle w:val="Heading1"/>
-      </w:pPr>
-      <w:r>
-        <w:t>Recommended Final Framing</w:t>
-      </w:r>
-    </w:p>
-    <w:p>
-      <w:r>
-        <w:t>The final narrative should emphasize severe weather first, social-economic vulnerability second, and uncertainty third. The strongest evidence is that severe weather is associated with more serious outage outcomes. The most credible equity finding is that social-economic vulnerability is associated with outage frequency in the corrected county-month model and may also be relevant for duration in event-level sensitivity checks. The analysis should be presented as an EDA and modeling workflow that identifies policy-relevant vulnerability patterns, not as a causal proof that CVI alone determines outage burden.</w:t>
       </w:r>
     </w:p>
     <w:sectPr>

</xml_diff>

<commit_message>
Add findings by part to EDA outage report
</commit_message>
<xml_diff>
--- a/docs/EDA_Outage_Report.docx
+++ b/docs/EDA_Outage_Report.docx
@@ -23,12 +23,12 @@
           <w:i/>
           <w:sz w:val="22"/>
         </w:rPr>
-        <w:t>Methods and Results Summary by Notebook Part</w:t>
+        <w:t>Methods and Findings by Notebook Part</w:t>
       </w:r>
     </w:p>
     <w:p>
       <w:r>
-        <w:t>This document summarizes the analytical workflow used to examine New York City power outage burden from 2014 to 2023. The analysis links outage events with county and tract geography, severe-weather indicators, customer impact measures, outage duration, and Climate Vulnerability Index (CVI) variables. The purpose is to describe how outage frequency and duration vary over time and geography, and to evaluate whether social vulnerability is associated with outage burden after accounting for weather, seasonality, and data structure.</w:t>
+        <w:t>This document summarizes the executed EDA notebook for NYC power outages from 2014 to 2023. Each section below corresponds to a notebook part and states both the methodology and the main findings. The report emphasizes results that are supported by the notebook outputs, while distinguishing exploratory tract-level analysis from the corrected county-month and event-level models.</w:t>
       </w:r>
     </w:p>
     <w:p>
@@ -36,7 +36,63 @@
         <w:pStyle w:val="Heading1"/>
       </w:pPr>
       <w:r>
-        <w:t>Study Scope</w:t>
+        <w:t>Executive Summary</w:t>
+      </w:r>
+    </w:p>
+    <w:p>
+      <w:pPr>
+        <w:pStyle w:val="ListBullet"/>
+      </w:pPr>
+      <w:r>
+        <w:t>Severe weather is the most consistent outage driver. Rank-based tract tests find significant severe-weather association with outage occurrence in 1,008 of 2,168 tracts at FDR 0.05, while duration is not significantly associated at the tract level.</w:t>
+      </w:r>
+    </w:p>
+    <w:p>
+      <w:pPr>
+        <w:pStyle w:val="ListBullet"/>
+      </w:pPr>
+      <w:r>
+        <w:t>Seasonality is strong. Every year from 2014 through 2023 has a statistically significant month effect, and July appears as the hot month in three years.</w:t>
+      </w:r>
+    </w:p>
+    <w:p>
+      <w:pPr>
+        <w:pStyle w:val="ListBullet"/>
+      </w:pPr>
+      <w:r>
+        <w:t>Simple tract-year trend tests do not show significant long-run tract-level trends after FDR correction, even though raw annual totals vary sharply across years.</w:t>
+      </w:r>
+    </w:p>
+    <w:p>
+      <w:pPr>
+        <w:pStyle w:val="ListBullet"/>
+      </w:pPr>
+      <w:r>
+        <w:t>The most important data-structure finding is that outage outcomes are identical for all tracts within the same county-year. Tract-level regressions are therefore exploratory and should not be used as final CVI inference.</w:t>
+      </w:r>
+    </w:p>
+    <w:p>
+      <w:pPr>
+        <w:pStyle w:val="ListBullet"/>
+      </w:pPr>
+      <w:r>
+        <w:t>Negative Binomial models are preferred for outage counts. The Poisson county-year count model has overdispersion around 41.7 and much worse AIC than Negative Binomial.</w:t>
+      </w:r>
+    </w:p>
+    <w:p>
+      <w:pPr>
+        <w:pStyle w:val="ListBullet"/>
+      </w:pPr>
+      <w:r>
+        <w:t>The clearest vulnerability signal is social-economic CVI in frequency models, while the most robust overall predictor across duration and customer-hour outcomes remains severe weather.</w:t>
+      </w:r>
+    </w:p>
+    <w:p>
+      <w:pPr>
+        <w:pStyle w:val="Heading1"/>
+      </w:pPr>
+      <w:r>
+        <w:t>Study Scope and Data</w:t>
       </w:r>
     </w:p>
     <w:tbl>
@@ -46,13 +102,13 @@
         <w:tblLook w:firstColumn="1" w:firstRow="1" w:lastColumn="0" w:lastRow="0" w:noHBand="0" w:noVBand="1" w:val="04A0"/>
       </w:tblPr>
       <w:tblGrid>
-        <w:gridCol w:w="4968"/>
-        <w:gridCol w:w="4968"/>
+        <w:gridCol w:w="5040"/>
+        <w:gridCol w:w="5040"/>
       </w:tblGrid>
       <w:tr>
         <w:tc>
           <w:tcPr>
-            <w:tcW w:type="dxa" w:w="4968"/>
+            <w:tcW w:type="dxa" w:w="5040"/>
           </w:tcPr>
           <w:p>
             <w:r>
@@ -66,7 +122,7 @@
         </w:tc>
         <w:tc>
           <w:tcPr>
-            <w:tcW w:type="dxa" w:w="4968"/>
+            <w:tcW w:type="dxa" w:w="5040"/>
           </w:tcPr>
           <w:p>
             <w:r>
@@ -74,7 +130,7 @@
                 <w:rFonts w:ascii="Arial" w:hAnsi="Arial"/>
                 <w:sz w:val="17"/>
               </w:rPr>
-              <w:t>Specification</w:t>
+              <w:t>Value</w:t>
             </w:r>
           </w:p>
         </w:tc>
@@ -82,7 +138,7 @@
       <w:tr>
         <w:tc>
           <w:tcPr>
-            <w:tcW w:type="dxa" w:w="4968"/>
+            <w:tcW w:type="dxa" w:w="5040"/>
           </w:tcPr>
           <w:p>
             <w:r>
@@ -96,7 +152,7 @@
         </w:tc>
         <w:tc>
           <w:tcPr>
-            <w:tcW w:type="dxa" w:w="4968"/>
+            <w:tcW w:type="dxa" w:w="5040"/>
           </w:tcPr>
           <w:p>
             <w:r>
@@ -112,7 +168,7 @@
       <w:tr>
         <w:tc>
           <w:tcPr>
-            <w:tcW w:type="dxa" w:w="4968"/>
+            <w:tcW w:type="dxa" w:w="5040"/>
           </w:tcPr>
           <w:p>
             <w:r>
@@ -126,7 +182,7 @@
         </w:tc>
         <w:tc>
           <w:tcPr>
-            <w:tcW w:type="dxa" w:w="4968"/>
+            <w:tcW w:type="dxa" w:w="5040"/>
           </w:tcPr>
           <w:p>
             <w:r>
@@ -142,7 +198,7 @@
       <w:tr>
         <w:tc>
           <w:tcPr>
-            <w:tcW w:type="dxa" w:w="4968"/>
+            <w:tcW w:type="dxa" w:w="5040"/>
           </w:tcPr>
           <w:p>
             <w:r>
@@ -150,13 +206,13 @@
                 <w:rFonts w:ascii="Arial" w:hAnsi="Arial"/>
                 <w:sz w:val="17"/>
               </w:rPr>
-              <w:t>Primary source</w:t>
+              <w:t>Tract count</w:t>
             </w:r>
           </w:p>
         </w:tc>
         <w:tc>
           <w:tcPr>
-            <w:tcW w:type="dxa" w:w="4968"/>
+            <w:tcW w:type="dxa" w:w="5040"/>
           </w:tcPr>
           <w:p>
             <w:r>
@@ -164,7 +220,7 @@
                 <w:rFonts w:ascii="Arial" w:hAnsi="Arial"/>
                 <w:sz w:val="17"/>
               </w:rPr>
-              <w:t>Merged outage event file with CVI indicators and severe-weather flags</w:t>
+              <w:t>2,168 NYC tracts in the outage/CVI panel</w:t>
             </w:r>
           </w:p>
         </w:tc>
@@ -172,7 +228,7 @@
       <w:tr>
         <w:tc>
           <w:tcPr>
-            <w:tcW w:type="dxa" w:w="4968"/>
+            <w:tcW w:type="dxa" w:w="5040"/>
           </w:tcPr>
           <w:p>
             <w:r>
@@ -180,13 +236,13 @@
                 <w:rFonts w:ascii="Arial" w:hAnsi="Arial"/>
                 <w:sz w:val="17"/>
               </w:rPr>
-              <w:t>Exploratory unit</w:t>
+              <w:t>Main frequency model level</w:t>
             </w:r>
           </w:p>
         </w:tc>
         <w:tc>
           <w:tcPr>
-            <w:tcW w:type="dxa" w:w="4968"/>
+            <w:tcW w:type="dxa" w:w="5040"/>
           </w:tcPr>
           <w:p>
             <w:r>
@@ -194,7 +250,7 @@
                 <w:rFonts w:ascii="Arial" w:hAnsi="Arial"/>
                 <w:sz w:val="17"/>
               </w:rPr>
-              <w:t>Census tract-year and tract-month summaries</w:t>
+              <w:t>County-month panel, 600 cells</w:t>
             </w:r>
           </w:p>
         </w:tc>
@@ -202,7 +258,7 @@
       <w:tr>
         <w:tc>
           <w:tcPr>
-            <w:tcW w:type="dxa" w:w="4968"/>
+            <w:tcW w:type="dxa" w:w="5040"/>
           </w:tcPr>
           <w:p>
             <w:r>
@@ -210,13 +266,13 @@
                 <w:rFonts w:ascii="Arial" w:hAnsi="Arial"/>
                 <w:sz w:val="17"/>
               </w:rPr>
-              <w:t>Main frequency unit</w:t>
+              <w:t>County-year diagnostic level</w:t>
             </w:r>
           </w:p>
         </w:tc>
         <w:tc>
           <w:tcPr>
-            <w:tcW w:type="dxa" w:w="4968"/>
+            <w:tcW w:type="dxa" w:w="5040"/>
           </w:tcPr>
           <w:p>
             <w:r>
@@ -224,7 +280,7 @@
                 <w:rFonts w:ascii="Arial" w:hAnsi="Arial"/>
                 <w:sz w:val="17"/>
               </w:rPr>
-              <w:t>Balanced county-month panel with 600 observations</w:t>
+              <w:t>50 county-year cells, with 47 observed county-year cells in consistency checks</w:t>
             </w:r>
           </w:p>
         </w:tc>
@@ -232,7 +288,7 @@
       <w:tr>
         <w:tc>
           <w:tcPr>
-            <w:tcW w:type="dxa" w:w="4968"/>
+            <w:tcW w:type="dxa" w:w="5040"/>
           </w:tcPr>
           <w:p>
             <w:r>
@@ -240,13 +296,13 @@
                 <w:rFonts w:ascii="Arial" w:hAnsi="Arial"/>
                 <w:sz w:val="17"/>
               </w:rPr>
-              <w:t>Duration unit</w:t>
+              <w:t>Event-level duration model</w:t>
             </w:r>
           </w:p>
         </w:tc>
         <w:tc>
           <w:tcPr>
-            <w:tcW w:type="dxa" w:w="4968"/>
+            <w:tcW w:type="dxa" w:w="5040"/>
           </w:tcPr>
           <w:p>
             <w:r>
@@ -254,7 +310,7 @@
                 <w:rFonts w:ascii="Arial" w:hAnsi="Arial"/>
                 <w:sz w:val="17"/>
               </w:rPr>
-              <w:t>Deduplicated outage-event panel with approximately 4,500 events</w:t>
+              <w:t>4,518 deduplicated outage events</w:t>
             </w:r>
           </w:p>
         </w:tc>
@@ -262,7 +318,7 @@
       <w:tr>
         <w:tc>
           <w:tcPr>
-            <w:tcW w:type="dxa" w:w="4968"/>
+            <w:tcW w:type="dxa" w:w="5040"/>
           </w:tcPr>
           <w:p>
             <w:r>
@@ -270,13 +326,13 @@
                 <w:rFonts w:ascii="Arial" w:hAnsi="Arial"/>
                 <w:sz w:val="17"/>
               </w:rPr>
-              <w:t>Core methodological caution</w:t>
+              <w:t>Core predictors</w:t>
             </w:r>
           </w:p>
         </w:tc>
         <w:tc>
           <w:tcPr>
-            <w:tcW w:type="dxa" w:w="4968"/>
+            <w:tcW w:type="dxa" w:w="5040"/>
           </w:tcPr>
           <w:p>
             <w:r>
@@ -284,7 +340,7 @@
                 <w:rFonts w:ascii="Arial" w:hAnsi="Arial"/>
                 <w:sz w:val="17"/>
               </w:rPr>
-              <w:t>Tract-level rows are useful for mapping, but outage outcomes repeat within county-year cells; final inference should not rely on false tract-level precision.</w:t>
+              <w:t>Year, month, severe weather, customer impact, and CVI measures</w:t>
             </w:r>
           </w:p>
         </w:tc>
@@ -295,49 +351,25 @@
         <w:pStyle w:val="Heading1"/>
       </w:pPr>
       <w:r>
-        <w:t>Part 0: Data Preparation and NYC Filter</w:t>
+        <w:t>Part 0: Load, Clean, and NYC Filter</w:t>
       </w:r>
     </w:p>
     <w:p>
       <w:r>
-        <w:t>Part 0 prepares the event-level outage/CVI file for analysis. County FIPS and tract FIPS are standardized, outage start times are parsed, years and months are extracted, outage duration is converted to numeric hours, and outage event types are used to create a severe-weather flag. The file is then restricted to the five NYC counties and the 2014-2023 study window.</w:t>
+        <w:t>Methodology. The notebook standardizes county and tract FIPS codes, parses outage start times, extracts year and month, converts duration to numeric hours, flags severe-weather events from outage event type, and filters to the five NYC counties for 2014-2023.</w:t>
+      </w:r>
+    </w:p>
+    <w:p>
+      <w:r>
+        <w:t>Findings. The cleaned data show large year-to-year variation. Total outage rows peak in 2018 with 667,269 outage rows, and average duration peaks in 2020 at 7.98 hours. Severe-weather share is highest in 2018 at 32.3%, followed by 2022 at 20.0% and 2019 at 17.4%. Early years 2014-2016 have no severe-weather flagged rows in this merged file.</w:t>
       </w:r>
     </w:p>
     <w:p>
       <w:pPr>
-        <w:pStyle w:val="ListBullet"/>
+        <w:pStyle w:val="Heading2"/>
       </w:pPr>
       <w:r>
-        <w:t>Methodology: field cleaning, date parsing, FIPS normalization, NYC filtering, and severe-weather flag construction.</w:t>
-      </w:r>
-    </w:p>
-    <w:p>
-      <w:pPr>
-        <w:pStyle w:val="ListBullet"/>
-      </w:pPr>
-      <w:r>
-        <w:t>Purpose: establish a reproducible analysis panel and ensure that all later summaries use the same geography and time window.</w:t>
-      </w:r>
-    </w:p>
-    <w:p>
-      <w:pPr>
-        <w:pStyle w:val="ListBullet"/>
-      </w:pPr>
-      <w:r>
-        <w:t>Interpretation role: foundation step only; no substantive inference is made here.</w:t>
-      </w:r>
-    </w:p>
-    <w:p>
-      <w:pPr>
-        <w:pStyle w:val="Heading1"/>
-      </w:pPr>
-      <w:r>
-        <w:t>Parts 1-3: Initial Tract-Year and Month Effects</w:t>
-      </w:r>
-    </w:p>
-    <w:p>
-      <w:r>
-        <w:t>Parts 1 through 3 explore whether severe weather, year trends, and month effects are related to outage outcomes. These sections use tract-year summaries and year-by-month counts to identify broad patterns before moving to corrected models.</w:t>
+        <w:t>Part 0 Year Summary</w:t>
       </w:r>
     </w:p>
     <w:tbl>
@@ -347,14 +379,15 @@
         <w:tblLook w:firstColumn="1" w:firstRow="1" w:lastColumn="0" w:lastRow="0" w:noHBand="0" w:noVBand="1" w:val="04A0"/>
       </w:tblPr>
       <w:tblGrid>
-        <w:gridCol w:w="3312"/>
-        <w:gridCol w:w="3312"/>
-        <w:gridCol w:w="3312"/>
+        <w:gridCol w:w="2520"/>
+        <w:gridCol w:w="2520"/>
+        <w:gridCol w:w="2520"/>
+        <w:gridCol w:w="2520"/>
       </w:tblGrid>
       <w:tr>
         <w:tc>
           <w:tcPr>
-            <w:tcW w:type="dxa" w:w="3312"/>
+            <w:tcW w:type="dxa" w:w="2520"/>
           </w:tcPr>
           <w:p>
             <w:r>
@@ -362,13 +395,13 @@
                 <w:rFonts w:ascii="Arial" w:hAnsi="Arial"/>
                 <w:sz w:val="17"/>
               </w:rPr>
-              <w:t>Part</w:t>
+              <w:t>Year</w:t>
             </w:r>
           </w:p>
         </w:tc>
         <w:tc>
           <w:tcPr>
-            <w:tcW w:type="dxa" w:w="3312"/>
+            <w:tcW w:type="dxa" w:w="2520"/>
           </w:tcPr>
           <w:p>
             <w:r>
@@ -376,13 +409,13 @@
                 <w:rFonts w:ascii="Arial" w:hAnsi="Arial"/>
                 <w:sz w:val="17"/>
               </w:rPr>
-              <w:t>Methodology</w:t>
+              <w:t>Total outages</w:t>
             </w:r>
           </w:p>
         </w:tc>
         <w:tc>
           <w:tcPr>
-            <w:tcW w:type="dxa" w:w="3312"/>
+            <w:tcW w:type="dxa" w:w="2520"/>
           </w:tcPr>
           <w:p>
             <w:r>
@@ -390,7 +423,21 @@
                 <w:rFonts w:ascii="Arial" w:hAnsi="Arial"/>
                 <w:sz w:val="17"/>
               </w:rPr>
-              <w:t>Use in final interpretation</w:t>
+              <w:t>Severe-weather share</w:t>
+            </w:r>
+          </w:p>
+        </w:tc>
+        <w:tc>
+          <w:tcPr>
+            <w:tcW w:type="dxa" w:w="2520"/>
+          </w:tcPr>
+          <w:p>
+            <w:r>
+              <w:rPr>
+                <w:rFonts w:ascii="Arial" w:hAnsi="Arial"/>
+                <w:sz w:val="17"/>
+              </w:rPr>
+              <w:t>Avg duration (h)</w:t>
             </w:r>
           </w:p>
         </w:tc>
@@ -398,7 +445,7 @@
       <w:tr>
         <w:tc>
           <w:tcPr>
-            <w:tcW w:type="dxa" w:w="3312"/>
+            <w:tcW w:type="dxa" w:w="2520"/>
           </w:tcPr>
           <w:p>
             <w:r>
@@ -406,13 +453,13 @@
                 <w:rFonts w:ascii="Arial" w:hAnsi="Arial"/>
                 <w:sz w:val="17"/>
               </w:rPr>
-              <w:t>Part 1</w:t>
+              <w:t>2014</w:t>
             </w:r>
           </w:p>
         </w:tc>
         <w:tc>
           <w:tcPr>
-            <w:tcW w:type="dxa" w:w="3312"/>
+            <w:tcW w:type="dxa" w:w="2520"/>
           </w:tcPr>
           <w:p>
             <w:r>
@@ -420,13 +467,13 @@
                 <w:rFonts w:ascii="Arial" w:hAnsi="Arial"/>
                 <w:sz w:val="17"/>
               </w:rPr>
-              <w:t>Per-tract OLS models of outage occurrence and log duration on severe-weather count, with FDR correction.</w:t>
+              <w:t>17,171</w:t>
             </w:r>
           </w:p>
         </w:tc>
         <w:tc>
           <w:tcPr>
-            <w:tcW w:type="dxa" w:w="3312"/>
+            <w:tcW w:type="dxa" w:w="2520"/>
           </w:tcPr>
           <w:p>
             <w:r>
@@ -434,7 +481,21 @@
                 <w:rFonts w:ascii="Arial" w:hAnsi="Arial"/>
                 <w:sz w:val="17"/>
               </w:rPr>
-              <w:t>Exploratory screen for weather-outage association.</w:t>
+              <w:t>0.0%</w:t>
+            </w:r>
+          </w:p>
+        </w:tc>
+        <w:tc>
+          <w:tcPr>
+            <w:tcW w:type="dxa" w:w="2520"/>
+          </w:tcPr>
+          <w:p>
+            <w:r>
+              <w:rPr>
+                <w:rFonts w:ascii="Arial" w:hAnsi="Arial"/>
+                <w:sz w:val="17"/>
+              </w:rPr>
+              <w:t>1.75</w:t>
             </w:r>
           </w:p>
         </w:tc>
@@ -442,7 +503,7 @@
       <w:tr>
         <w:tc>
           <w:tcPr>
-            <w:tcW w:type="dxa" w:w="3312"/>
+            <w:tcW w:type="dxa" w:w="2520"/>
           </w:tcPr>
           <w:p>
             <w:r>
@@ -450,13 +511,13 @@
                 <w:rFonts w:ascii="Arial" w:hAnsi="Arial"/>
                 <w:sz w:val="17"/>
               </w:rPr>
-              <w:t>Part 2</w:t>
+              <w:t>2015</w:t>
             </w:r>
           </w:p>
         </w:tc>
         <w:tc>
           <w:tcPr>
-            <w:tcW w:type="dxa" w:w="3312"/>
+            <w:tcW w:type="dxa" w:w="2520"/>
           </w:tcPr>
           <w:p>
             <w:r>
@@ -464,13 +525,13 @@
                 <w:rFonts w:ascii="Arial" w:hAnsi="Arial"/>
                 <w:sz w:val="17"/>
               </w:rPr>
-              <w:t>Per-tract year-trend OLS, Kendall tau, and Theil-Sen slope checks.</w:t>
+              <w:t>280,690</w:t>
             </w:r>
           </w:p>
         </w:tc>
         <w:tc>
           <w:tcPr>
-            <w:tcW w:type="dxa" w:w="3312"/>
+            <w:tcW w:type="dxa" w:w="2520"/>
           </w:tcPr>
           <w:p>
             <w:r>
@@ -478,7 +539,21 @@
                 <w:rFonts w:ascii="Arial" w:hAnsi="Arial"/>
                 <w:sz w:val="17"/>
               </w:rPr>
-              <w:t>Describes temporal patterns but is not final causal evidence.</w:t>
+              <w:t>0.0%</w:t>
+            </w:r>
+          </w:p>
+        </w:tc>
+        <w:tc>
+          <w:tcPr>
+            <w:tcW w:type="dxa" w:w="2520"/>
+          </w:tcPr>
+          <w:p>
+            <w:r>
+              <w:rPr>
+                <w:rFonts w:ascii="Arial" w:hAnsi="Arial"/>
+                <w:sz w:val="17"/>
+              </w:rPr>
+              <w:t>4.11</w:t>
             </w:r>
           </w:p>
         </w:tc>
@@ -486,7 +561,7 @@
       <w:tr>
         <w:tc>
           <w:tcPr>
-            <w:tcW w:type="dxa" w:w="3312"/>
+            <w:tcW w:type="dxa" w:w="2520"/>
           </w:tcPr>
           <w:p>
             <w:r>
@@ -494,13 +569,13 @@
                 <w:rFonts w:ascii="Arial" w:hAnsi="Arial"/>
                 <w:sz w:val="17"/>
               </w:rPr>
-              <w:t>Part 3</w:t>
+              <w:t>2016</w:t>
             </w:r>
           </w:p>
         </w:tc>
         <w:tc>
           <w:tcPr>
-            <w:tcW w:type="dxa" w:w="3312"/>
+            <w:tcW w:type="dxa" w:w="2520"/>
           </w:tcPr>
           <w:p>
             <w:r>
@@ -508,13 +583,13 @@
                 <w:rFonts w:ascii="Arial" w:hAnsi="Arial"/>
                 <w:sz w:val="17"/>
               </w:rPr>
-              <w:t>Year-by-month chi-square tests and FDR-adjusted residual checks.</w:t>
+              <w:t>296,277</w:t>
             </w:r>
           </w:p>
         </w:tc>
         <w:tc>
           <w:tcPr>
-            <w:tcW w:type="dxa" w:w="3312"/>
+            <w:tcW w:type="dxa" w:w="2520"/>
           </w:tcPr>
           <w:p>
             <w:r>
@@ -522,15 +597,448 @@
                 <w:rFonts w:ascii="Arial" w:hAnsi="Arial"/>
                 <w:sz w:val="17"/>
               </w:rPr>
-              <w:t>Identifies seasonality and motivates month controls in later models.</w:t>
+              <w:t>0.0%</w:t>
+            </w:r>
+          </w:p>
+        </w:tc>
+        <w:tc>
+          <w:tcPr>
+            <w:tcW w:type="dxa" w:w="2520"/>
+          </w:tcPr>
+          <w:p>
+            <w:r>
+              <w:rPr>
+                <w:rFonts w:ascii="Arial" w:hAnsi="Arial"/>
+                <w:sz w:val="17"/>
+              </w:rPr>
+              <w:t>2.91</w:t>
+            </w:r>
+          </w:p>
+        </w:tc>
+      </w:tr>
+      <w:tr>
+        <w:tc>
+          <w:tcPr>
+            <w:tcW w:type="dxa" w:w="2520"/>
+          </w:tcPr>
+          <w:p>
+            <w:r>
+              <w:rPr>
+                <w:rFonts w:ascii="Arial" w:hAnsi="Arial"/>
+                <w:sz w:val="17"/>
+              </w:rPr>
+              <w:t>2017</w:t>
+            </w:r>
+          </w:p>
+        </w:tc>
+        <w:tc>
+          <w:tcPr>
+            <w:tcW w:type="dxa" w:w="2520"/>
+          </w:tcPr>
+          <w:p>
+            <w:r>
+              <w:rPr>
+                <w:rFonts w:ascii="Arial" w:hAnsi="Arial"/>
+                <w:sz w:val="17"/>
+              </w:rPr>
+              <w:t>227,010</w:t>
+            </w:r>
+          </w:p>
+        </w:tc>
+        <w:tc>
+          <w:tcPr>
+            <w:tcW w:type="dxa" w:w="2520"/>
+          </w:tcPr>
+          <w:p>
+            <w:r>
+              <w:rPr>
+                <w:rFonts w:ascii="Arial" w:hAnsi="Arial"/>
+                <w:sz w:val="17"/>
+              </w:rPr>
+              <w:t>0.7%</w:t>
+            </w:r>
+          </w:p>
+        </w:tc>
+        <w:tc>
+          <w:tcPr>
+            <w:tcW w:type="dxa" w:w="2520"/>
+          </w:tcPr>
+          <w:p>
+            <w:r>
+              <w:rPr>
+                <w:rFonts w:ascii="Arial" w:hAnsi="Arial"/>
+                <w:sz w:val="17"/>
+              </w:rPr>
+              <w:t>3.35</w:t>
+            </w:r>
+          </w:p>
+        </w:tc>
+      </w:tr>
+      <w:tr>
+        <w:tc>
+          <w:tcPr>
+            <w:tcW w:type="dxa" w:w="2520"/>
+          </w:tcPr>
+          <w:p>
+            <w:r>
+              <w:rPr>
+                <w:rFonts w:ascii="Arial" w:hAnsi="Arial"/>
+                <w:sz w:val="17"/>
+              </w:rPr>
+              <w:t>2018</w:t>
+            </w:r>
+          </w:p>
+        </w:tc>
+        <w:tc>
+          <w:tcPr>
+            <w:tcW w:type="dxa" w:w="2520"/>
+          </w:tcPr>
+          <w:p>
+            <w:r>
+              <w:rPr>
+                <w:rFonts w:ascii="Arial" w:hAnsi="Arial"/>
+                <w:sz w:val="17"/>
+              </w:rPr>
+              <w:t>667,269</w:t>
+            </w:r>
+          </w:p>
+        </w:tc>
+        <w:tc>
+          <w:tcPr>
+            <w:tcW w:type="dxa" w:w="2520"/>
+          </w:tcPr>
+          <w:p>
+            <w:r>
+              <w:rPr>
+                <w:rFonts w:ascii="Arial" w:hAnsi="Arial"/>
+                <w:sz w:val="17"/>
+              </w:rPr>
+              <w:t>32.3%</w:t>
+            </w:r>
+          </w:p>
+        </w:tc>
+        <w:tc>
+          <w:tcPr>
+            <w:tcW w:type="dxa" w:w="2520"/>
+          </w:tcPr>
+          <w:p>
+            <w:r>
+              <w:rPr>
+                <w:rFonts w:ascii="Arial" w:hAnsi="Arial"/>
+                <w:sz w:val="17"/>
+              </w:rPr>
+              <w:t>3.60</w:t>
+            </w:r>
+          </w:p>
+        </w:tc>
+      </w:tr>
+      <w:tr>
+        <w:tc>
+          <w:tcPr>
+            <w:tcW w:type="dxa" w:w="2520"/>
+          </w:tcPr>
+          <w:p>
+            <w:r>
+              <w:rPr>
+                <w:rFonts w:ascii="Arial" w:hAnsi="Arial"/>
+                <w:sz w:val="17"/>
+              </w:rPr>
+              <w:t>2019</w:t>
+            </w:r>
+          </w:p>
+        </w:tc>
+        <w:tc>
+          <w:tcPr>
+            <w:tcW w:type="dxa" w:w="2520"/>
+          </w:tcPr>
+          <w:p>
+            <w:r>
+              <w:rPr>
+                <w:rFonts w:ascii="Arial" w:hAnsi="Arial"/>
+                <w:sz w:val="17"/>
+              </w:rPr>
+              <w:t>306,579</w:t>
+            </w:r>
+          </w:p>
+        </w:tc>
+        <w:tc>
+          <w:tcPr>
+            <w:tcW w:type="dxa" w:w="2520"/>
+          </w:tcPr>
+          <w:p>
+            <w:r>
+              <w:rPr>
+                <w:rFonts w:ascii="Arial" w:hAnsi="Arial"/>
+                <w:sz w:val="17"/>
+              </w:rPr>
+              <w:t>17.4%</w:t>
+            </w:r>
+          </w:p>
+        </w:tc>
+        <w:tc>
+          <w:tcPr>
+            <w:tcW w:type="dxa" w:w="2520"/>
+          </w:tcPr>
+          <w:p>
+            <w:r>
+              <w:rPr>
+                <w:rFonts w:ascii="Arial" w:hAnsi="Arial"/>
+                <w:sz w:val="17"/>
+              </w:rPr>
+              <w:t>4.08</w:t>
+            </w:r>
+          </w:p>
+        </w:tc>
+      </w:tr>
+      <w:tr>
+        <w:tc>
+          <w:tcPr>
+            <w:tcW w:type="dxa" w:w="2520"/>
+          </w:tcPr>
+          <w:p>
+            <w:r>
+              <w:rPr>
+                <w:rFonts w:ascii="Arial" w:hAnsi="Arial"/>
+                <w:sz w:val="17"/>
+              </w:rPr>
+              <w:t>2020</w:t>
+            </w:r>
+          </w:p>
+        </w:tc>
+        <w:tc>
+          <w:tcPr>
+            <w:tcW w:type="dxa" w:w="2520"/>
+          </w:tcPr>
+          <w:p>
+            <w:r>
+              <w:rPr>
+                <w:rFonts w:ascii="Arial" w:hAnsi="Arial"/>
+                <w:sz w:val="17"/>
+              </w:rPr>
+              <w:t>274,108</w:t>
+            </w:r>
+          </w:p>
+        </w:tc>
+        <w:tc>
+          <w:tcPr>
+            <w:tcW w:type="dxa" w:w="2520"/>
+          </w:tcPr>
+          <w:p>
+            <w:r>
+              <w:rPr>
+                <w:rFonts w:ascii="Arial" w:hAnsi="Arial"/>
+                <w:sz w:val="17"/>
+              </w:rPr>
+              <w:t>10.9%</w:t>
+            </w:r>
+          </w:p>
+        </w:tc>
+        <w:tc>
+          <w:tcPr>
+            <w:tcW w:type="dxa" w:w="2520"/>
+          </w:tcPr>
+          <w:p>
+            <w:r>
+              <w:rPr>
+                <w:rFonts w:ascii="Arial" w:hAnsi="Arial"/>
+                <w:sz w:val="17"/>
+              </w:rPr>
+              <w:t>7.98</w:t>
+            </w:r>
+          </w:p>
+        </w:tc>
+      </w:tr>
+      <w:tr>
+        <w:tc>
+          <w:tcPr>
+            <w:tcW w:type="dxa" w:w="2520"/>
+          </w:tcPr>
+          <w:p>
+            <w:r>
+              <w:rPr>
+                <w:rFonts w:ascii="Arial" w:hAnsi="Arial"/>
+                <w:sz w:val="17"/>
+              </w:rPr>
+              <w:t>2021</w:t>
+            </w:r>
+          </w:p>
+        </w:tc>
+        <w:tc>
+          <w:tcPr>
+            <w:tcW w:type="dxa" w:w="2520"/>
+          </w:tcPr>
+          <w:p>
+            <w:r>
+              <w:rPr>
+                <w:rFonts w:ascii="Arial" w:hAnsi="Arial"/>
+                <w:sz w:val="17"/>
+              </w:rPr>
+              <w:t>319,416</w:t>
+            </w:r>
+          </w:p>
+        </w:tc>
+        <w:tc>
+          <w:tcPr>
+            <w:tcW w:type="dxa" w:w="2520"/>
+          </w:tcPr>
+          <w:p>
+            <w:r>
+              <w:rPr>
+                <w:rFonts w:ascii="Arial" w:hAnsi="Arial"/>
+                <w:sz w:val="17"/>
+              </w:rPr>
+              <w:t>0.1%</w:t>
+            </w:r>
+          </w:p>
+        </w:tc>
+        <w:tc>
+          <w:tcPr>
+            <w:tcW w:type="dxa" w:w="2520"/>
+          </w:tcPr>
+          <w:p>
+            <w:r>
+              <w:rPr>
+                <w:rFonts w:ascii="Arial" w:hAnsi="Arial"/>
+                <w:sz w:val="17"/>
+              </w:rPr>
+              <w:t>4.12</w:t>
+            </w:r>
+          </w:p>
+        </w:tc>
+      </w:tr>
+      <w:tr>
+        <w:tc>
+          <w:tcPr>
+            <w:tcW w:type="dxa" w:w="2520"/>
+          </w:tcPr>
+          <w:p>
+            <w:r>
+              <w:rPr>
+                <w:rFonts w:ascii="Arial" w:hAnsi="Arial"/>
+                <w:sz w:val="17"/>
+              </w:rPr>
+              <w:t>2022</w:t>
+            </w:r>
+          </w:p>
+        </w:tc>
+        <w:tc>
+          <w:tcPr>
+            <w:tcW w:type="dxa" w:w="2520"/>
+          </w:tcPr>
+          <w:p>
+            <w:r>
+              <w:rPr>
+                <w:rFonts w:ascii="Arial" w:hAnsi="Arial"/>
+                <w:sz w:val="17"/>
+              </w:rPr>
+              <w:t>587,220</w:t>
+            </w:r>
+          </w:p>
+        </w:tc>
+        <w:tc>
+          <w:tcPr>
+            <w:tcW w:type="dxa" w:w="2520"/>
+          </w:tcPr>
+          <w:p>
+            <w:r>
+              <w:rPr>
+                <w:rFonts w:ascii="Arial" w:hAnsi="Arial"/>
+                <w:sz w:val="17"/>
+              </w:rPr>
+              <w:t>20.0%</w:t>
+            </w:r>
+          </w:p>
+        </w:tc>
+        <w:tc>
+          <w:tcPr>
+            <w:tcW w:type="dxa" w:w="2520"/>
+          </w:tcPr>
+          <w:p>
+            <w:r>
+              <w:rPr>
+                <w:rFonts w:ascii="Arial" w:hAnsi="Arial"/>
+                <w:sz w:val="17"/>
+              </w:rPr>
+              <w:t>2.10</w:t>
+            </w:r>
+          </w:p>
+        </w:tc>
+      </w:tr>
+      <w:tr>
+        <w:tc>
+          <w:tcPr>
+            <w:tcW w:type="dxa" w:w="2520"/>
+          </w:tcPr>
+          <w:p>
+            <w:r>
+              <w:rPr>
+                <w:rFonts w:ascii="Arial" w:hAnsi="Arial"/>
+                <w:sz w:val="17"/>
+              </w:rPr>
+              <w:t>2023</w:t>
+            </w:r>
+          </w:p>
+        </w:tc>
+        <w:tc>
+          <w:tcPr>
+            <w:tcW w:type="dxa" w:w="2520"/>
+          </w:tcPr>
+          <w:p>
+            <w:r>
+              <w:rPr>
+                <w:rFonts w:ascii="Arial" w:hAnsi="Arial"/>
+                <w:sz w:val="17"/>
+              </w:rPr>
+              <w:t>225,135</w:t>
+            </w:r>
+          </w:p>
+        </w:tc>
+        <w:tc>
+          <w:tcPr>
+            <w:tcW w:type="dxa" w:w="2520"/>
+          </w:tcPr>
+          <w:p>
+            <w:r>
+              <w:rPr>
+                <w:rFonts w:ascii="Arial" w:hAnsi="Arial"/>
+                <w:sz w:val="17"/>
+              </w:rPr>
+              <w:t>1.3%</w:t>
+            </w:r>
+          </w:p>
+        </w:tc>
+        <w:tc>
+          <w:tcPr>
+            <w:tcW w:type="dxa" w:w="2520"/>
+          </w:tcPr>
+          <w:p>
+            <w:r>
+              <w:rPr>
+                <w:rFonts w:ascii="Arial" w:hAnsi="Arial"/>
+                <w:sz w:val="17"/>
+              </w:rPr>
+              <w:t>2.25</w:t>
             </w:r>
           </w:p>
         </w:tc>
       </w:tr>
     </w:tbl>
     <w:p>
+      <w:pPr>
+        <w:pStyle w:val="Heading1"/>
+      </w:pPr>
       <w:r>
-        <w:t>These early analyses are useful for pattern discovery, but they are not the strongest evidence because tract-level observations do not represent fully independent outage outcomes.</w:t>
+        <w:t>Part 1: Severe Weather vs. Outage Occurrence and Duration</w:t>
+      </w:r>
+    </w:p>
+    <w:p>
+      <w:r>
+        <w:t>Methodology. Part 1 fits per-tract models relating outage occurrence and log duration to severe-weather counts. The section includes OLS models and a Poisson direction check, with FDR correction across tracts.</w:t>
+      </w:r>
+    </w:p>
+    <w:p>
+      <w:r>
+        <w:t>Findings. The occurrence relationship is strong and positive. In the OLS screen, 1,769 of 2,168 tracts are significant at FDR 0.05, and all estimated occurrence slopes are positive. The median severe-weather coefficient is about 2.32. This supports severe weather as a major driver of outage occurrence. The duration relationship is not supported at tract level.</w:t>
       </w:r>
     </w:p>
     <w:p>
@@ -538,36 +1046,17 @@
         <w:pStyle w:val="Heading1"/>
       </w:pPr>
       <w:r>
-        <w:t>Parts 4-6: Visualization, Correlation, and Seasonality Clustering</w:t>
+        <w:t>Part 2: Outage Occurrence and Duration Trends Over Years</w:t>
       </w:r>
     </w:p>
     <w:p>
       <w:r>
-        <w:t>Parts 4 through 6 summarize spatial and seasonal structure. Visualizations show annual totals and monthly heat maps. Spearman correlations are used because outage counts and duration are skewed. K-means clustering is applied to monthly outage-share profiles to summarize seasonality patterns.</w:t>
+        <w:t>Methodology. Part 2 estimates per-tract year trends using OLS slopes and robust nonparametric checks with Kendall tau and Theil-Sen slopes. FDR correction is applied to occurrence and duration trend p-values.</w:t>
       </w:r>
     </w:p>
     <w:p>
-      <w:pPr>
-        <w:pStyle w:val="ListBullet"/>
-      </w:pPr>
       <w:r>
-        <w:t>Methodology: descriptive visualization, nonparametric correlation, and clustering of monthly outage-share profiles.</w:t>
-      </w:r>
-    </w:p>
-    <w:p>
-      <w:pPr>
-        <w:pStyle w:val="ListBullet"/>
-      </w:pPr>
-      <w:r>
-        <w:t>Main role: communicate patterns and diagnose structure before modeling.</w:t>
-      </w:r>
-    </w:p>
-    <w:p>
-      <w:pPr>
-        <w:pStyle w:val="ListBullet"/>
-      </w:pPr>
-      <w:r>
-        <w:t>Important caveat: the clustering reflects county-level seasonality more than true tract-level heterogeneity because many tract profiles duplicate county patterns.</w:t>
+        <w:t>Findings. After FDR correction, no tract has a significant occurrence trend and no tract has a significant duration trend at the 0.05 level. Median raw slopes are positive, about 7.72 additional outage rows per year and 0.046 log-duration units per year, but these slopes are not statistically robust after multiple-testing correction. The finding is therefore temporal variability, not a stable tract-level trend.</w:t>
       </w:r>
     </w:p>
     <w:p>
@@ -575,86 +1064,25 @@
         <w:pStyle w:val="Heading1"/>
       </w:pPr>
       <w:r>
-        <w:t>Part 7: CVI Variables and Exploratory Regressions</w:t>
+        <w:t>Part 3: Month Effect in Each Year</w:t>
       </w:r>
     </w:p>
     <w:p>
       <w:r>
-        <w:t>Part 7 adds CVI measures to the outage panel. The candidate variables include overall CVI, baseline social-economic CVI, baseline infrastructure CVI, and climate/extreme-events CVI. Exploratory tract-year regressions are used to understand possible vulnerability relationships.</w:t>
+        <w:t>Methodology. Part 3 performs year-specific chi-square goodness-of-fit tests, with expected monthly counts proportional to days in month. FDR-adjusted standardized residuals identify hot months.</w:t>
+      </w:r>
+    </w:p>
+    <w:p>
+      <w:r>
+        <w:t>Findings. All 10 study years have statistically significant month effects. The strongest hot month varies by year: November in 2014, June in 2015, September in 2016, March in 2017 and 2018, July in 2019, 2020, and 2023, February in 2021, and April in 2022. July is the most frequent hot month, appearing in three years. Seasonality is therefore a central feature of the outage process.</w:t>
       </w:r>
     </w:p>
     <w:p>
       <w:pPr>
-        <w:pStyle w:val="ListBullet"/>
+        <w:pStyle w:val="Heading2"/>
       </w:pPr>
       <w:r>
-        <w:t>Methodology: merge tract-level CVI features, construct tract-year outcomes, and fit exploratory regression models.</w:t>
-      </w:r>
-    </w:p>
-    <w:p>
-      <w:pPr>
-        <w:pStyle w:val="ListBullet"/>
-      </w:pPr>
-      <w:r>
-        <w:t>Key caution: CVI variables are correlated with one another, so models with many CVI predictors can produce unstable coefficients.</w:t>
-      </w:r>
-    </w:p>
-    <w:p>
-      <w:pPr>
-        <w:pStyle w:val="ListBullet"/>
-      </w:pPr>
-      <w:r>
-        <w:t>Interpretation role: hypothesis generation rather than final evidence.</w:t>
-      </w:r>
-    </w:p>
-    <w:p>
-      <w:pPr>
-        <w:pStyle w:val="Heading1"/>
-      </w:pPr>
-      <w:r>
-        <w:t>Part 8: Data Structure Correction</w:t>
-      </w:r>
-    </w:p>
-    <w:p>
-      <w:r>
-        <w:t>Part 8 is the methodological turning point. It shows that outage occurrence, mean duration, and severe-weather count are often identical for tracts within the same county-year. This means tract-level regressions create a misleading sense of precision. The corrected analysis therefore collapses the data to county-year and county-month panels for the main frequency models.</w:t>
-      </w:r>
-    </w:p>
-    <w:p>
-      <w:pPr>
-        <w:pStyle w:val="ListBullet"/>
-      </w:pPr>
-      <w:r>
-        <w:t>Methodology: county-year consistency checks, county-year collapse, OLS/Poisson diagnostics, and VIF checks.</w:t>
-      </w:r>
-    </w:p>
-    <w:p>
-      <w:pPr>
-        <w:pStyle w:val="ListBullet"/>
-      </w:pPr>
-      <w:r>
-        <w:t>Reason for correction: repeated tract rows do not add independent outage information.</w:t>
-      </w:r>
-    </w:p>
-    <w:p>
-      <w:pPr>
-        <w:pStyle w:val="ListBullet"/>
-      </w:pPr>
-      <w:r>
-        <w:t>Final implication: tract-level results should be used for maps and screening; county-month and event-level models should carry the main interpretation.</w:t>
-      </w:r>
-    </w:p>
-    <w:p>
-      <w:pPr>
-        <w:pStyle w:val="Heading1"/>
-      </w:pPr>
-      <w:r>
-        <w:t>Part 8b and Part 9: Corrected Frequency Models</w:t>
-      </w:r>
-    </w:p>
-    <w:p>
-      <w:r>
-        <w:t>The corrected frequency analysis uses count models and county-month models. Poisson diagnostics show substantial overdispersion, so Negative Binomial models are preferred for outage counts. Part 9 then estimates one main CVI concept at a time in a county-month framework with time, severe-weather, and month controls.</w:t>
+        <w:t>Part 3 Hot Months</w:t>
       </w:r>
     </w:p>
     <w:tbl>
@@ -664,14 +1092,14 @@
         <w:tblLook w:firstColumn="1" w:firstRow="1" w:lastColumn="0" w:lastRow="0" w:noHBand="0" w:noVBand="1" w:val="04A0"/>
       </w:tblPr>
       <w:tblGrid>
-        <w:gridCol w:w="3312"/>
-        <w:gridCol w:w="3312"/>
-        <w:gridCol w:w="3312"/>
+        <w:gridCol w:w="3360"/>
+        <w:gridCol w:w="3360"/>
+        <w:gridCol w:w="3360"/>
       </w:tblGrid>
       <w:tr>
         <w:tc>
           <w:tcPr>
-            <w:tcW w:type="dxa" w:w="3312"/>
+            <w:tcW w:type="dxa" w:w="3360"/>
           </w:tcPr>
           <w:p>
             <w:r>
@@ -679,13 +1107,13 @@
                 <w:rFonts w:ascii="Arial" w:hAnsi="Arial"/>
                 <w:sz w:val="17"/>
               </w:rPr>
-              <w:t>Model component</w:t>
+              <w:t>Year</w:t>
             </w:r>
           </w:p>
         </w:tc>
         <w:tc>
           <w:tcPr>
-            <w:tcW w:type="dxa" w:w="3312"/>
+            <w:tcW w:type="dxa" w:w="3360"/>
           </w:tcPr>
           <w:p>
             <w:r>
@@ -693,13 +1121,13 @@
                 <w:rFonts w:ascii="Arial" w:hAnsi="Arial"/>
                 <w:sz w:val="17"/>
               </w:rPr>
-              <w:t>Methodology</w:t>
+              <w:t>Hot month</w:t>
             </w:r>
           </w:p>
         </w:tc>
         <w:tc>
           <w:tcPr>
-            <w:tcW w:type="dxa" w:w="3312"/>
+            <w:tcW w:type="dxa" w:w="3360"/>
           </w:tcPr>
           <w:p>
             <w:r>
@@ -707,7 +1135,7 @@
                 <w:rFonts w:ascii="Arial" w:hAnsi="Arial"/>
                 <w:sz w:val="17"/>
               </w:rPr>
-              <w:t>Interpretation</w:t>
+              <w:t>Observed count</w:t>
             </w:r>
           </w:p>
         </w:tc>
@@ -715,7 +1143,7 @@
       <w:tr>
         <w:tc>
           <w:tcPr>
-            <w:tcW w:type="dxa" w:w="3312"/>
+            <w:tcW w:type="dxa" w:w="3360"/>
           </w:tcPr>
           <w:p>
             <w:r>
@@ -723,13 +1151,13 @@
                 <w:rFonts w:ascii="Arial" w:hAnsi="Arial"/>
                 <w:sz w:val="17"/>
               </w:rPr>
-              <w:t>Overdispersion check</w:t>
+              <w:t>2014</w:t>
             </w:r>
           </w:p>
         </w:tc>
         <w:tc>
           <w:tcPr>
-            <w:tcW w:type="dxa" w:w="3312"/>
+            <w:tcW w:type="dxa" w:w="3360"/>
           </w:tcPr>
           <w:p>
             <w:r>
@@ -737,13 +1165,13 @@
                 <w:rFonts w:ascii="Arial" w:hAnsi="Arial"/>
                 <w:sz w:val="17"/>
               </w:rPr>
-              <w:t>Compare Poisson assumptions against observed count variance.</w:t>
+              <w:t>November</w:t>
             </w:r>
           </w:p>
         </w:tc>
         <w:tc>
           <w:tcPr>
-            <w:tcW w:type="dxa" w:w="3312"/>
+            <w:tcW w:type="dxa" w:w="3360"/>
           </w:tcPr>
           <w:p>
             <w:r>
@@ -751,7 +1179,7 @@
                 <w:rFonts w:ascii="Arial" w:hAnsi="Arial"/>
                 <w:sz w:val="17"/>
               </w:rPr>
-              <w:t>Poisson is too restrictive when overdispersion is high.</w:t>
+              <w:t>11,715</w:t>
             </w:r>
           </w:p>
         </w:tc>
@@ -759,7 +1187,7 @@
       <w:tr>
         <w:tc>
           <w:tcPr>
-            <w:tcW w:type="dxa" w:w="3312"/>
+            <w:tcW w:type="dxa" w:w="3360"/>
           </w:tcPr>
           <w:p>
             <w:r>
@@ -767,13 +1195,13 @@
                 <w:rFonts w:ascii="Arial" w:hAnsi="Arial"/>
                 <w:sz w:val="17"/>
               </w:rPr>
-              <w:t>Negative Binomial</w:t>
+              <w:t>2015</w:t>
             </w:r>
           </w:p>
         </w:tc>
         <w:tc>
           <w:tcPr>
-            <w:tcW w:type="dxa" w:w="3312"/>
+            <w:tcW w:type="dxa" w:w="3360"/>
           </w:tcPr>
           <w:p>
             <w:r>
@@ -781,13 +1209,13 @@
                 <w:rFonts w:ascii="Arial" w:hAnsi="Arial"/>
                 <w:sz w:val="17"/>
               </w:rPr>
-              <w:t>Use an overdispersed count model for outage frequency.</w:t>
+              <w:t>June</w:t>
             </w:r>
           </w:p>
         </w:tc>
         <w:tc>
           <w:tcPr>
-            <w:tcW w:type="dxa" w:w="3312"/>
+            <w:tcW w:type="dxa" w:w="3360"/>
           </w:tcPr>
           <w:p>
             <w:r>
@@ -795,7 +1223,7 @@
                 <w:rFonts w:ascii="Arial" w:hAnsi="Arial"/>
                 <w:sz w:val="17"/>
               </w:rPr>
-              <w:t>Preferred count-model family for frequency.</w:t>
+              <w:t>48,404</w:t>
             </w:r>
           </w:p>
         </w:tc>
@@ -803,7 +1231,7 @@
       <w:tr>
         <w:tc>
           <w:tcPr>
-            <w:tcW w:type="dxa" w:w="3312"/>
+            <w:tcW w:type="dxa" w:w="3360"/>
           </w:tcPr>
           <w:p>
             <w:r>
@@ -811,13 +1239,13 @@
                 <w:rFonts w:ascii="Arial" w:hAnsi="Arial"/>
                 <w:sz w:val="17"/>
               </w:rPr>
-              <w:t>County-month panel</w:t>
+              <w:t>2016</w:t>
             </w:r>
           </w:p>
         </w:tc>
         <w:tc>
           <w:tcPr>
-            <w:tcW w:type="dxa" w:w="3312"/>
+            <w:tcW w:type="dxa" w:w="3360"/>
           </w:tcPr>
           <w:p>
             <w:r>
@@ -825,13 +1253,13 @@
                 <w:rFonts w:ascii="Arial" w:hAnsi="Arial"/>
                 <w:sz w:val="17"/>
               </w:rPr>
-              <w:t>Five counties x ten years x twelve months, producing 600 observations.</w:t>
+              <w:t>September</w:t>
             </w:r>
           </w:p>
         </w:tc>
         <w:tc>
           <w:tcPr>
-            <w:tcW w:type="dxa" w:w="3312"/>
+            <w:tcW w:type="dxa" w:w="3360"/>
           </w:tcPr>
           <w:p>
             <w:r>
@@ -839,7 +1267,7 @@
                 <w:rFonts w:ascii="Arial" w:hAnsi="Arial"/>
                 <w:sz w:val="17"/>
               </w:rPr>
-              <w:t>Main frequency model because it accounts for seasonality and avoids tract-level pseudo-replication.</w:t>
+              <w:t>77,368</w:t>
             </w:r>
           </w:p>
         </w:tc>
@@ -847,7 +1275,7 @@
       <w:tr>
         <w:tc>
           <w:tcPr>
-            <w:tcW w:type="dxa" w:w="3312"/>
+            <w:tcW w:type="dxa" w:w="3360"/>
           </w:tcPr>
           <w:p>
             <w:r>
@@ -855,13 +1283,13 @@
                 <w:rFonts w:ascii="Arial" w:hAnsi="Arial"/>
                 <w:sz w:val="17"/>
               </w:rPr>
-              <w:t>One-CVI-at-a-time models</w:t>
+              <w:t>2017</w:t>
             </w:r>
           </w:p>
         </w:tc>
         <w:tc>
           <w:tcPr>
-            <w:tcW w:type="dxa" w:w="3312"/>
+            <w:tcW w:type="dxa" w:w="3360"/>
           </w:tcPr>
           <w:p>
             <w:r>
@@ -869,13 +1297,13 @@
                 <w:rFonts w:ascii="Arial" w:hAnsi="Arial"/>
                 <w:sz w:val="17"/>
               </w:rPr>
-              <w:t>Estimate separate models for overall, social-economic, climate, and high-vulnerability-share concepts.</w:t>
+              <w:t>March</w:t>
             </w:r>
           </w:p>
         </w:tc>
         <w:tc>
           <w:tcPr>
-            <w:tcW w:type="dxa" w:w="3312"/>
+            <w:tcW w:type="dxa" w:w="3360"/>
           </w:tcPr>
           <w:p>
             <w:r>
@@ -883,15 +1311,292 @@
                 <w:rFonts w:ascii="Arial" w:hAnsi="Arial"/>
                 <w:sz w:val="17"/>
               </w:rPr>
-              <w:t>Improves interpretability and reduces multicollinearity problems.</w:t>
+              <w:t>36,381</w:t>
+            </w:r>
+          </w:p>
+        </w:tc>
+      </w:tr>
+      <w:tr>
+        <w:tc>
+          <w:tcPr>
+            <w:tcW w:type="dxa" w:w="3360"/>
+          </w:tcPr>
+          <w:p>
+            <w:r>
+              <w:rPr>
+                <w:rFonts w:ascii="Arial" w:hAnsi="Arial"/>
+                <w:sz w:val="17"/>
+              </w:rPr>
+              <w:t>2018</w:t>
+            </w:r>
+          </w:p>
+        </w:tc>
+        <w:tc>
+          <w:tcPr>
+            <w:tcW w:type="dxa" w:w="3360"/>
+          </w:tcPr>
+          <w:p>
+            <w:r>
+              <w:rPr>
+                <w:rFonts w:ascii="Arial" w:hAnsi="Arial"/>
+                <w:sz w:val="17"/>
+              </w:rPr>
+              <w:t>March</w:t>
+            </w:r>
+          </w:p>
+        </w:tc>
+        <w:tc>
+          <w:tcPr>
+            <w:tcW w:type="dxa" w:w="3360"/>
+          </w:tcPr>
+          <w:p>
+            <w:r>
+              <w:rPr>
+                <w:rFonts w:ascii="Arial" w:hAnsi="Arial"/>
+                <w:sz w:val="17"/>
+              </w:rPr>
+              <w:t>241,848</w:t>
+            </w:r>
+          </w:p>
+        </w:tc>
+      </w:tr>
+      <w:tr>
+        <w:tc>
+          <w:tcPr>
+            <w:tcW w:type="dxa" w:w="3360"/>
+          </w:tcPr>
+          <w:p>
+            <w:r>
+              <w:rPr>
+                <w:rFonts w:ascii="Arial" w:hAnsi="Arial"/>
+                <w:sz w:val="17"/>
+              </w:rPr>
+              <w:t>2019</w:t>
+            </w:r>
+          </w:p>
+        </w:tc>
+        <w:tc>
+          <w:tcPr>
+            <w:tcW w:type="dxa" w:w="3360"/>
+          </w:tcPr>
+          <w:p>
+            <w:r>
+              <w:rPr>
+                <w:rFonts w:ascii="Arial" w:hAnsi="Arial"/>
+                <w:sz w:val="17"/>
+              </w:rPr>
+              <w:t>July</w:t>
+            </w:r>
+          </w:p>
+        </w:tc>
+        <w:tc>
+          <w:tcPr>
+            <w:tcW w:type="dxa" w:w="3360"/>
+          </w:tcPr>
+          <w:p>
+            <w:r>
+              <w:rPr>
+                <w:rFonts w:ascii="Arial" w:hAnsi="Arial"/>
+                <w:sz w:val="17"/>
+              </w:rPr>
+              <w:t>74,972</w:t>
+            </w:r>
+          </w:p>
+        </w:tc>
+      </w:tr>
+      <w:tr>
+        <w:tc>
+          <w:tcPr>
+            <w:tcW w:type="dxa" w:w="3360"/>
+          </w:tcPr>
+          <w:p>
+            <w:r>
+              <w:rPr>
+                <w:rFonts w:ascii="Arial" w:hAnsi="Arial"/>
+                <w:sz w:val="17"/>
+              </w:rPr>
+              <w:t>2020</w:t>
+            </w:r>
+          </w:p>
+        </w:tc>
+        <w:tc>
+          <w:tcPr>
+            <w:tcW w:type="dxa" w:w="3360"/>
+          </w:tcPr>
+          <w:p>
+            <w:r>
+              <w:rPr>
+                <w:rFonts w:ascii="Arial" w:hAnsi="Arial"/>
+                <w:sz w:val="17"/>
+              </w:rPr>
+              <w:t>July</w:t>
+            </w:r>
+          </w:p>
+        </w:tc>
+        <w:tc>
+          <w:tcPr>
+            <w:tcW w:type="dxa" w:w="3360"/>
+          </w:tcPr>
+          <w:p>
+            <w:r>
+              <w:rPr>
+                <w:rFonts w:ascii="Arial" w:hAnsi="Arial"/>
+                <w:sz w:val="17"/>
+              </w:rPr>
+              <w:t>62,749</w:t>
+            </w:r>
+          </w:p>
+        </w:tc>
+      </w:tr>
+      <w:tr>
+        <w:tc>
+          <w:tcPr>
+            <w:tcW w:type="dxa" w:w="3360"/>
+          </w:tcPr>
+          <w:p>
+            <w:r>
+              <w:rPr>
+                <w:rFonts w:ascii="Arial" w:hAnsi="Arial"/>
+                <w:sz w:val="17"/>
+              </w:rPr>
+              <w:t>2021</w:t>
+            </w:r>
+          </w:p>
+        </w:tc>
+        <w:tc>
+          <w:tcPr>
+            <w:tcW w:type="dxa" w:w="3360"/>
+          </w:tcPr>
+          <w:p>
+            <w:r>
+              <w:rPr>
+                <w:rFonts w:ascii="Arial" w:hAnsi="Arial"/>
+                <w:sz w:val="17"/>
+              </w:rPr>
+              <w:t>February</w:t>
+            </w:r>
+          </w:p>
+        </w:tc>
+        <w:tc>
+          <w:tcPr>
+            <w:tcW w:type="dxa" w:w="3360"/>
+          </w:tcPr>
+          <w:p>
+            <w:r>
+              <w:rPr>
+                <w:rFonts w:ascii="Arial" w:hAnsi="Arial"/>
+                <w:sz w:val="17"/>
+              </w:rPr>
+              <w:t>56,325</w:t>
+            </w:r>
+          </w:p>
+        </w:tc>
+      </w:tr>
+      <w:tr>
+        <w:tc>
+          <w:tcPr>
+            <w:tcW w:type="dxa" w:w="3360"/>
+          </w:tcPr>
+          <w:p>
+            <w:r>
+              <w:rPr>
+                <w:rFonts w:ascii="Arial" w:hAnsi="Arial"/>
+                <w:sz w:val="17"/>
+              </w:rPr>
+              <w:t>2022</w:t>
+            </w:r>
+          </w:p>
+        </w:tc>
+        <w:tc>
+          <w:tcPr>
+            <w:tcW w:type="dxa" w:w="3360"/>
+          </w:tcPr>
+          <w:p>
+            <w:r>
+              <w:rPr>
+                <w:rFonts w:ascii="Arial" w:hAnsi="Arial"/>
+                <w:sz w:val="17"/>
+              </w:rPr>
+              <w:t>April</w:t>
+            </w:r>
+          </w:p>
+        </w:tc>
+        <w:tc>
+          <w:tcPr>
+            <w:tcW w:type="dxa" w:w="3360"/>
+          </w:tcPr>
+          <w:p>
+            <w:r>
+              <w:rPr>
+                <w:rFonts w:ascii="Arial" w:hAnsi="Arial"/>
+                <w:sz w:val="17"/>
+              </w:rPr>
+              <w:t>123,690</w:t>
+            </w:r>
+          </w:p>
+        </w:tc>
+      </w:tr>
+      <w:tr>
+        <w:tc>
+          <w:tcPr>
+            <w:tcW w:type="dxa" w:w="3360"/>
+          </w:tcPr>
+          <w:p>
+            <w:r>
+              <w:rPr>
+                <w:rFonts w:ascii="Arial" w:hAnsi="Arial"/>
+                <w:sz w:val="17"/>
+              </w:rPr>
+              <w:t>2023</w:t>
+            </w:r>
+          </w:p>
+        </w:tc>
+        <w:tc>
+          <w:tcPr>
+            <w:tcW w:type="dxa" w:w="3360"/>
+          </w:tcPr>
+          <w:p>
+            <w:r>
+              <w:rPr>
+                <w:rFonts w:ascii="Arial" w:hAnsi="Arial"/>
+                <w:sz w:val="17"/>
+              </w:rPr>
+              <w:t>July</w:t>
+            </w:r>
+          </w:p>
+        </w:tc>
+        <w:tc>
+          <w:tcPr>
+            <w:tcW w:type="dxa" w:w="3360"/>
+          </w:tcPr>
+          <w:p>
+            <w:r>
+              <w:rPr>
+                <w:rFonts w:ascii="Arial" w:hAnsi="Arial"/>
+                <w:sz w:val="17"/>
+              </w:rPr>
+              <w:t>37,758</w:t>
             </w:r>
           </w:p>
         </w:tc>
       </w:tr>
     </w:tbl>
     <w:p>
+      <w:pPr>
+        <w:pStyle w:val="Heading1"/>
+      </w:pPr>
       <w:r>
-        <w:t>The clearest vulnerability signal appears for social-economic CVI. In the county-month Poisson specification, a one-standard-deviation increase in social-economic CVI is associated with an incidence rate ratio of approximately 1.20, or about 20 percent higher monthly outage counts, conditional on the model controls.</w:t>
+        <w:t>Part 4: Effect-Size Visualizations and Robust Spearman Checks</w:t>
+      </w:r>
+    </w:p>
+    <w:p>
+      <w:r>
+        <w:t>Methodology. Part 4 visualizes the Part 1-3 results and repeats the severe-weather analysis with rank-based Spearman correlations, which are more robust to skew and zero inflation than tract-level OLS.</w:t>
+      </w:r>
+    </w:p>
+    <w:p>
+      <w:r>
+        <w:t>Findings. The Spearman results confirm the severe-weather occurrence signal: 1,008 of 2,168 tracts are significant at FDR 0.05 and 669 are significant at FDR 0.01. Median occurrence rho is about 0.688. No tracts show a significant duration relationship after FDR correction, and median duration rho is only about 0.088. Month effects are significant in all 10 years.</w:t>
       </w:r>
     </w:p>
     <w:p>
@@ -899,36 +1604,17 @@
         <w:pStyle w:val="Heading1"/>
       </w:pPr>
       <w:r>
-        <w:t>Part 9b: Theory-Driven CVI Selection and Ridge Sensitivity</w:t>
+        <w:t>Part 5: Month-by-Month Trends Over Years</w:t>
       </w:r>
     </w:p>
     <w:p>
       <w:r>
-        <w:t>Part 9b narrows the vulnerability question to theoretically motivated predictors, including social-economic CVI, infrastructure CVI, and severe-weather count. OLS and Ridge models are compared to assess whether coefficient signs remain stable when predictors are correlated.</w:t>
+        <w:t>Methodology. Part 5 tests whether each calendar month has an increasing or decreasing trend across years using Kendall tau and Theil-Sen slopes for outage occurrence and duration.</w:t>
       </w:r>
     </w:p>
     <w:p>
-      <w:pPr>
-        <w:pStyle w:val="ListBullet"/>
-      </w:pPr>
       <w:r>
-        <w:t>Methodology: compare OLS estimates with Ridge sensitivity models.</w:t>
-      </w:r>
-    </w:p>
-    <w:p>
-      <w:pPr>
-        <w:pStyle w:val="ListBullet"/>
-      </w:pPr>
-      <w:r>
-        <w:t>Use of Ridge: directional robustness check, not the primary explanatory model.</w:t>
-      </w:r>
-    </w:p>
-    <w:p>
-      <w:pPr>
-        <w:pStyle w:val="ListBullet"/>
-      </w:pPr>
-      <w:r>
-        <w:t>Interpretation: infrastructure CVI is positive but imprecise; social-economic CVI is directionally consistent but still sensitive to small county-level sample size.</w:t>
+        <w:t>Findings. No month has a significant occurrence trend after FDR correction. Duration trends are mostly insignificant as well, with January showing a significant negative log-duration trend. This means seasonality is strong within years, but month-specific long-run trends are not robust over 2014-2023.</w:t>
       </w:r>
     </w:p>
     <w:p>
@@ -936,249 +1622,17 @@
         <w:pStyle w:val="Heading1"/>
       </w:pPr>
       <w:r>
-        <w:t>Part 10 and Part 10b: Duration and Resilience Models</w:t>
+        <w:t>Part 6: Tract Seasonality Clustering</w:t>
       </w:r>
     </w:p>
     <w:p>
       <w:r>
-        <w:t>Parts 10 and 10b separate outage frequency from outage resilience. Frequency asks whether outages occur more often. Duration asks whether outages last longer once they occur. This distinction matters because high-burden communities may be affected through restoration time rather than event count alone.</w:t>
+        <w:t>Methodology. Part 6 clusters tracts by their monthly outage-share profiles, with the number of clusters selected using a silhouette scan.</w:t>
       </w:r>
     </w:p>
-    <w:tbl>
-      <w:tblPr>
-        <w:tblStyle w:val="TableGrid"/>
-        <w:tblW w:type="auto" w:w="0"/>
-        <w:tblLook w:firstColumn="1" w:firstRow="1" w:lastColumn="0" w:lastRow="0" w:noHBand="0" w:noVBand="1" w:val="04A0"/>
-      </w:tblPr>
-      <w:tblGrid>
-        <w:gridCol w:w="3312"/>
-        <w:gridCol w:w="3312"/>
-        <w:gridCol w:w="3312"/>
-      </w:tblGrid>
-      <w:tr>
-        <w:tc>
-          <w:tcPr>
-            <w:tcW w:type="dxa" w:w="3312"/>
-          </w:tcPr>
-          <w:p>
-            <w:r>
-              <w:rPr>
-                <w:rFonts w:ascii="Arial" w:hAnsi="Arial"/>
-                <w:sz w:val="17"/>
-              </w:rPr>
-              <w:t>Outcome family</w:t>
-            </w:r>
-          </w:p>
-        </w:tc>
-        <w:tc>
-          <w:tcPr>
-            <w:tcW w:type="dxa" w:w="3312"/>
-          </w:tcPr>
-          <w:p>
-            <w:r>
-              <w:rPr>
-                <w:rFonts w:ascii="Arial" w:hAnsi="Arial"/>
-                <w:sz w:val="17"/>
-              </w:rPr>
-              <w:t>Methodology</w:t>
-            </w:r>
-          </w:p>
-        </w:tc>
-        <w:tc>
-          <w:tcPr>
-            <w:tcW w:type="dxa" w:w="3312"/>
-          </w:tcPr>
-          <w:p>
-            <w:r>
-              <w:rPr>
-                <w:rFonts w:ascii="Arial" w:hAnsi="Arial"/>
-                <w:sz w:val="17"/>
-              </w:rPr>
-              <w:t>Main interpretation</w:t>
-            </w:r>
-          </w:p>
-        </w:tc>
-      </w:tr>
-      <w:tr>
-        <w:tc>
-          <w:tcPr>
-            <w:tcW w:type="dxa" w:w="3312"/>
-          </w:tcPr>
-          <w:p>
-            <w:r>
-              <w:rPr>
-                <w:rFonts w:ascii="Arial" w:hAnsi="Arial"/>
-                <w:sz w:val="17"/>
-              </w:rPr>
-              <w:t>County-year duration</w:t>
-            </w:r>
-          </w:p>
-        </w:tc>
-        <w:tc>
-          <w:tcPr>
-            <w:tcW w:type="dxa" w:w="3312"/>
-          </w:tcPr>
-          <w:p>
-            <w:r>
-              <w:rPr>
-                <w:rFonts w:ascii="Arial" w:hAnsi="Arial"/>
-                <w:sz w:val="17"/>
-              </w:rPr>
-              <w:t>Median duration, p90 duration, share above 8 hours, and share above 24 hours.</w:t>
-            </w:r>
-          </w:p>
-        </w:tc>
-        <w:tc>
-          <w:tcPr>
-            <w:tcW w:type="dxa" w:w="3312"/>
-          </w:tcPr>
-          <w:p>
-            <w:r>
-              <w:rPr>
-                <w:rFonts w:ascii="Arial" w:hAnsi="Arial"/>
-                <w:sz w:val="17"/>
-              </w:rPr>
-              <w:t>Useful but limited by small county-year sample.</w:t>
-            </w:r>
-          </w:p>
-        </w:tc>
-      </w:tr>
-      <w:tr>
-        <w:tc>
-          <w:tcPr>
-            <w:tcW w:type="dxa" w:w="3312"/>
-          </w:tcPr>
-          <w:p>
-            <w:r>
-              <w:rPr>
-                <w:rFonts w:ascii="Arial" w:hAnsi="Arial"/>
-                <w:sz w:val="17"/>
-              </w:rPr>
-              <w:t>Event-level log duration</w:t>
-            </w:r>
-          </w:p>
-        </w:tc>
-        <w:tc>
-          <w:tcPr>
-            <w:tcW w:type="dxa" w:w="3312"/>
-          </w:tcPr>
-          <w:p>
-            <w:r>
-              <w:rPr>
-                <w:rFonts w:ascii="Arial" w:hAnsi="Arial"/>
-                <w:sz w:val="17"/>
-              </w:rPr>
-              <w:t>OLS and clustered/sensitivity specifications on deduplicated outage events.</w:t>
-            </w:r>
-          </w:p>
-        </w:tc>
-        <w:tc>
-          <w:tcPr>
-            <w:tcW w:type="dxa" w:w="3312"/>
-          </w:tcPr>
-          <w:p>
-            <w:r>
-              <w:rPr>
-                <w:rFonts w:ascii="Arial" w:hAnsi="Arial"/>
-                <w:sz w:val="17"/>
-              </w:rPr>
-              <w:t>Stronger duration evidence because the event is the unit of analysis.</w:t>
-            </w:r>
-          </w:p>
-        </w:tc>
-      </w:tr>
-      <w:tr>
-        <w:tc>
-          <w:tcPr>
-            <w:tcW w:type="dxa" w:w="3312"/>
-          </w:tcPr>
-          <w:p>
-            <w:r>
-              <w:rPr>
-                <w:rFonts w:ascii="Arial" w:hAnsi="Arial"/>
-                <w:sz w:val="17"/>
-              </w:rPr>
-              <w:t>Severe outage probability</w:t>
-            </w:r>
-          </w:p>
-        </w:tc>
-        <w:tc>
-          <w:tcPr>
-            <w:tcW w:type="dxa" w:w="3312"/>
-          </w:tcPr>
-          <w:p>
-            <w:r>
-              <w:rPr>
-                <w:rFonts w:ascii="Arial" w:hAnsi="Arial"/>
-                <w:sz w:val="17"/>
-              </w:rPr>
-              <w:t>Logistic or GEE-style binary models for long/severe outage outcomes.</w:t>
-            </w:r>
-          </w:p>
-        </w:tc>
-        <w:tc>
-          <w:tcPr>
-            <w:tcW w:type="dxa" w:w="3312"/>
-          </w:tcPr>
-          <w:p>
-            <w:r>
-              <w:rPr>
-                <w:rFonts w:ascii="Arial" w:hAnsi="Arial"/>
-                <w:sz w:val="17"/>
-              </w:rPr>
-              <w:t>Appropriate for binary severe-outage indicators.</w:t>
-            </w:r>
-          </w:p>
-        </w:tc>
-      </w:tr>
-      <w:tr>
-        <w:tc>
-          <w:tcPr>
-            <w:tcW w:type="dxa" w:w="3312"/>
-          </w:tcPr>
-          <w:p>
-            <w:r>
-              <w:rPr>
-                <w:rFonts w:ascii="Arial" w:hAnsi="Arial"/>
-                <w:sz w:val="17"/>
-              </w:rPr>
-              <w:t>Customer-hours</w:t>
-            </w:r>
-          </w:p>
-        </w:tc>
-        <w:tc>
-          <w:tcPr>
-            <w:tcW w:type="dxa" w:w="3312"/>
-          </w:tcPr>
-          <w:p>
-            <w:r>
-              <w:rPr>
-                <w:rFonts w:ascii="Arial" w:hAnsi="Arial"/>
-                <w:sz w:val="17"/>
-              </w:rPr>
-              <w:t>Event-level customer impact multiplied by duration.</w:t>
-            </w:r>
-          </w:p>
-        </w:tc>
-        <w:tc>
-          <w:tcPr>
-            <w:tcW w:type="dxa" w:w="3312"/>
-          </w:tcPr>
-          <w:p>
-            <w:r>
-              <w:rPr>
-                <w:rFonts w:ascii="Arial" w:hAnsi="Arial"/>
-                <w:sz w:val="17"/>
-              </w:rPr>
-              <w:t>Captures both outage length and affected customers.</w:t>
-            </w:r>
-          </w:p>
-        </w:tc>
-      </w:tr>
-    </w:tbl>
     <w:p>
       <w:r>
-        <w:t>Severe weather is the most consistent predictor of longer duration and larger customer-hour impacts. CVI duration evidence is weaker and more model-sensitive, although social-economic CVI remains the most plausible vulnerability channel.</w:t>
+        <w:t>Findings. The cluster sizes are 111, 1,008, 288, and 761 tracts. Top months differ by cluster: one cluster peaks in August and July, another in March and July, another in August and February, and another in January and July. However, the later Part 8b diagnostic shows these profiles mostly correspond to the five county-level monthly profiles rather than independent tract-level seasonality. Part 6 should therefore be described as county-pattern profiling, not true tract-level clustering.</w:t>
       </w:r>
     </w:p>
     <w:p>
@@ -1186,36 +1640,143 @@
         <w:pStyle w:val="Heading1"/>
       </w:pPr>
       <w:r>
-        <w:t>Part 11: Robustness Summary</w:t>
+        <w:t>Part 7: CVI Variables and Exploratory Tract-Year Regressions</w:t>
       </w:r>
     </w:p>
     <w:p>
       <w:r>
-        <w:t>Part 11 compares results across county-year frequency, county-year duration, event-level OLS, and event-level Ridge specifications. This section is important because it prevents the analysis from relying on a single model specification.</w:t>
+        <w:t>Methodology. Part 7 merges CVI variables into the tract-year panel and explores relationships between outage trends and vulnerability indicators, including overall CVI, social-economic CVI, infrastructure CVI, and climate/extreme-events CVI.</w:t>
+      </w:r>
+    </w:p>
+    <w:p>
+      <w:r>
+        <w:t>Findings. The section is useful for visualization and hypothesis generation, but it should not be used for final inference. Part 8 shows that tract-level outcomes have no within-county-year variation, so tract-level CVI regressions inflate sample size and understate uncertainty.</w:t>
       </w:r>
     </w:p>
     <w:p>
       <w:pPr>
-        <w:pStyle w:val="ListBullet"/>
+        <w:pStyle w:val="Heading1"/>
       </w:pPr>
       <w:r>
-        <w:t>Methodology: compare coefficient direction, interval coverage, and model level across specifications.</w:t>
+        <w:t>Part 8a: Data-Structure Check and County-Year Panel</w:t>
+      </w:r>
+    </w:p>
+    <w:p>
+      <w:r>
+        <w:t>Methodology. Part 8a tests whether outage outcomes vary across tracts within the same county-year and then builds a balanced county-year panel with county-level CVI summaries.</w:t>
+      </w:r>
+    </w:p>
+    <w:p>
+      <w:r>
+        <w:t>Findings. This is the central methodological finding: in all 47 observed county-year cells, outage occurrence, mean duration, and severe-weather count each have exactly one unique value across tracts. The share of county-year cells with identical occurrence, duration, and severe-weather values is 100%. This means the correct inferential level for CVI-linked outage outcomes is county-year or county-month, not tract-year.</w:t>
       </w:r>
     </w:p>
     <w:p>
       <w:pPr>
-        <w:pStyle w:val="ListBullet"/>
+        <w:pStyle w:val="Heading1"/>
       </w:pPr>
       <w:r>
-        <w:t>Main finding: severe weather is robust across model families; social-economic CVI is the clearest vulnerability signal but not uniformly significant.</w:t>
+        <w:t>Part 8b: Model Upgrade Check</w:t>
+      </w:r>
+    </w:p>
+    <w:p>
+      <w:r>
+        <w:t>Methodology. Part 8b compares model families for count outcomes and tests whether county-month seasonality models improve on earlier tests. It also checks whether clustering reflects tract or county profiles.</w:t>
+      </w:r>
+    </w:p>
+    <w:p>
+      <w:r>
+        <w:t>Findings. The Poisson county-year count model is highly overdispersed, with overdispersion about 41.7 and AIC about 2,297. Negative Binomial fits much better, with AIC about 551 for the comparable county-year count model. In the 600-cell county-month panel, adding month effects improves Negative Binomial AIC from 3,277 to 3,227, and month effects are strongly supported with likelihood-ratio p approximately 5.44e-11. This confirms both overdispersion and seasonality.</w:t>
       </w:r>
     </w:p>
     <w:p>
       <w:pPr>
-        <w:pStyle w:val="ListBullet"/>
+        <w:pStyle w:val="Heading1"/>
       </w:pPr>
       <w:r>
-        <w:t>Recommended language: describe CVI findings as policy-relevant and directional rather than definitive across every outcome.</w:t>
+        <w:t>Part 9: Clean CVI Model Family</w:t>
+      </w:r>
+    </w:p>
+    <w:p>
+      <w:r>
+        <w:t>Methodology. Part 9 fits one CVI concept at a time to reduce multicollinearity. It estimates OLS models on log outage occurrence and Poisson count models using county-year data.</w:t>
+      </w:r>
+    </w:p>
+    <w:p>
+      <w:r>
+        <w:t>Findings. Overall CVI and social-economic CVI are positive in both OLS and Poisson models. Social-economic CVI is the clearest positive signal: OLS coefficient 0.444 with p=0.0077, and Poisson IRR about 1.18. Overall CVI has Poisson IRR about 1.13. Climate-extreme-events CVI has a negative sign, with Poisson IRR about 0.69, so it should be treated as a modeling caution rather than a policy headline. Severe-weather count remains positive and highly significant in the clean models.</w:t>
+      </w:r>
+    </w:p>
+    <w:p>
+      <w:pPr>
+        <w:pStyle w:val="Heading1"/>
+      </w:pPr>
+      <w:r>
+        <w:t>Part 9b: Theory-Driven CVI Selection and Ridge Regression</w:t>
+      </w:r>
+    </w:p>
+    <w:p>
+      <w:r>
+        <w:t>Methodology. Part 9b uses social-economic CVI, infrastructure CVI, and severe-weather count in comparable OLS and Ridge specifications. VIF is used to assess predictor collinearity.</w:t>
+      </w:r>
+    </w:p>
+    <w:p>
+      <w:r>
+        <w:t>Findings. Severe-weather count is the most stable predictor in the theory-driven model. Its OLS coefficient is 0.389, with a confidence interval from 0.137 to 0.641, and Ridge gives a similar coefficient of 0.385. Social-economic CVI and infrastructure CVI are both positive in OLS and Ridge, but their intervals cross zero. VIF values for social-economic and infrastructure CVI are about 4.85 and 4.81, indicating moderate collinearity.</w:t>
+      </w:r>
+    </w:p>
+    <w:p>
+      <w:pPr>
+        <w:pStyle w:val="Heading1"/>
+      </w:pPr>
+      <w:r>
+        <w:t>Part 10: Duration-Focused County-Year Models</w:t>
+      </w:r>
+    </w:p>
+    <w:p>
+      <w:r>
+        <w:t>Methodology. Part 10 models county-year duration outcomes, including median duration, p90 duration, share above 8 hours, and share above 24 hours, while controlling for severe-weather share, customer impact, year, and CVI.</w:t>
+      </w:r>
+    </w:p>
+    <w:p>
+      <w:r>
+        <w:t>Findings. At the county-year level, CVI duration results are weak and inconsistent. Social-economic CVI is not significant for median duration, p90 duration, share above 8 hours, or share above 24 hours. Severe-weather share is significant for p90 duration, with coefficient 0.371 and p=0.0197, but not for all duration outcomes. Customer impact is significant in several duration specifications. The county-year duration evidence therefore supports weather and customer impact more clearly than CVI.</w:t>
+      </w:r>
+    </w:p>
+    <w:p>
+      <w:pPr>
+        <w:pStyle w:val="Heading1"/>
+      </w:pPr>
+      <w:r>
+        <w:t>Part 10b: Event-Level Duration Models</w:t>
+      </w:r>
+    </w:p>
+    <w:p>
+      <w:r>
+        <w:t>Methodology. Part 10b uses 4,518 deduplicated outage events and fits clustered OLS, GEE logistic, Ridge, and customer-hour models. County-level vulnerability summaries are merged to event records.</w:t>
+      </w:r>
+    </w:p>
+    <w:p>
+      <w:r>
+        <w:t>Findings. Severe weather is the clearest event-level duration predictor. In event-level OLS, severe-weather flag has coefficient 0.446 on log duration with p&lt;0.001. In customer-hour OLS, severe weather has coefficient 1.506 with p&lt;0.001. Social-economic CVI is positive but not significant in clustered OLS; Ridge gives a small positive social-economic CVI coefficient of 0.043 with an interval just above zero. Infrastructure CVI is not supported in the event-level duration models.</w:t>
+      </w:r>
+    </w:p>
+    <w:p>
+      <w:pPr>
+        <w:pStyle w:val="Heading1"/>
+      </w:pPr>
+      <w:r>
+        <w:t>Part 11: Sensitivity and Robustness Summary</w:t>
+      </w:r>
+    </w:p>
+    <w:p>
+      <w:r>
+        <w:t>Methodology. Part 11 compares the same vulnerability concept across county-year frequency, county-year duration, event-level OLS, and event-level Ridge.</w:t>
+      </w:r>
+    </w:p>
+    <w:p>
+      <w:r>
+        <w:t>Findings. The robustness table shows that social-economic CVI is positive in county-year frequency OLS, county-year frequency Ridge, event-level OLS, and event-level Ridge, but only the event-level Ridge interval excludes zero. County-year duration OLS is slightly negative and not significant. The robust conclusion is directional rather than definitive: social-economic vulnerability may matter, but its evidence depends on model level and outcome.</w:t>
       </w:r>
     </w:p>
     <w:p>
@@ -1228,31 +1789,12 @@
     </w:p>
     <w:p>
       <w:r>
-        <w:t>Part 12 synthesizes the frequency and duration evidence. The careful interpretation is that outage burden has a strong weather component and a more cautious vulnerability component. Social-economic vulnerability appears most relevant in the corrected county-month frequency model and in selected event-level duration sensitivity checks.</w:t>
+        <w:t>Methodology. Part 12 compares the frequency channel with the resilience channel and summarizes county-level patterns.</w:t>
       </w:r>
     </w:p>
     <w:p>
-      <w:pPr>
-        <w:pStyle w:val="ListBullet"/>
-      </w:pPr>
       <w:r>
-        <w:t>Strongest claim: severe weather is consistently associated with more severe outage outcomes.</w:t>
-      </w:r>
-    </w:p>
-    <w:p>
-      <w:pPr>
-        <w:pStyle w:val="ListBullet"/>
-      </w:pPr>
-      <w:r>
-        <w:t>Most credible CVI pattern: social-economic vulnerability is associated with higher outage frequency and may relate to longer restoration burden.</w:t>
-      </w:r>
-    </w:p>
-    <w:p>
-      <w:pPr>
-        <w:pStyle w:val="ListBullet"/>
-      </w:pPr>
-      <w:r>
-        <w:t>What not to claim: every CVI dimension predicts every outage outcome. Climate-extreme-events CVI, in particular, should be treated cautiously because its sign is not intuitive in some models.</w:t>
+        <w:t>Findings. Queens has the highest mean outage occurrence at about 178.6 events per year, while Bronx has the highest social-economic CVI at about 0.761. Manhattan has the longest median event duration at 2.25 hours despite lower outage frequency. This shows that frequency and resilience are different mechanisms. The final interpretation should emphasize that severe weather drives outage burden most consistently, while social-economic vulnerability is a plausible but model-sensitive resilience and equity signal.</w:t>
       </w:r>
     </w:p>
     <w:p>
@@ -1260,61 +1802,18 @@
         <w:pStyle w:val="Heading1"/>
       </w:pPr>
       <w:r>
-        <w:t>Key Limitations</w:t>
+        <w:t>Final Takeaway</w:t>
       </w:r>
     </w:p>
     <w:p>
-      <w:pPr>
-        <w:pStyle w:val="ListBullet"/>
-      </w:pPr>
       <w:r>
-        <w:t>County-month models have approximately 600 observations (5 counties × 10 years × 12 months), so p-values and confidence intervals should be interpreted cautiously.</w:t>
-      </w:r>
-    </w:p>
-    <w:p>
-      <w:pPr>
-        <w:pStyle w:val="ListBullet"/>
-      </w:pPr>
-      <w:r>
-        <w:t>Only five counties are observed, which makes cross-sectional estimates sensitive to individual counties.</w:t>
-      </w:r>
-    </w:p>
-    <w:p>
-      <w:pPr>
-        <w:pStyle w:val="ListBullet"/>
-      </w:pPr>
-      <w:r>
-        <w:t>Tract-level regressions are exploratory because outage outcomes repeat within county-year cells.</w:t>
-      </w:r>
-    </w:p>
-    <w:p>
-      <w:pPr>
-        <w:pStyle w:val="ListBullet"/>
-      </w:pPr>
-      <w:r>
-        <w:t>Ridge models should be treated as sensitivity checks unless alpha is selected by cross-validation.</w:t>
-      </w:r>
-    </w:p>
-    <w:p>
-      <w:pPr>
-        <w:pStyle w:val="ListBullet"/>
-      </w:pPr>
-      <w:r>
-        <w:t>The severe-weather flag should be documented more fully, especially whether it is assigned at the event level or row level.</w:t>
-      </w:r>
-    </w:p>
-    <w:p>
-      <w:pPr>
-        <w:pStyle w:val="ListBullet"/>
-      </w:pPr>
-      <w:r>
-        <w:t>True tract-level inference would require more granular utility outage data or a data source where outage outcomes vary independently by tract.</w:t>
+        <w:t>The notebook supports a clear weather and seasonality story and a more cautious vulnerability story. Severe weather and month effects are robust. Tract-level CVI inference is not supported because the outage outcomes repeat within county-year cells. The best final framing is that severe weather drives outage frequency and duration, while social-economic vulnerability may shape outage burden and restoration resilience, especially when analyzed at the corrected county-month or event level.</w:t>
       </w:r>
     </w:p>
     <w:sectPr>
       <w:footerReference w:type="default" r:id="rId9"/>
       <w:pgSz w:w="12240" w:h="15840"/>
-      <w:pgMar w:top="1008" w:right="1152" w:bottom="1008" w:left="1152" w:header="720" w:footer="720" w:gutter="0"/>
+      <w:pgMar w:top="936" w:right="1080" w:bottom="936" w:left="1080" w:header="720" w:footer="720" w:gutter="0"/>
       <w:cols w:space="720"/>
       <w:docGrid w:linePitch="360"/>
     </w:sectPr>
@@ -1330,7 +1829,7 @@
       <w:jc w:val="center"/>
     </w:pPr>
     <w:r>
-      <w:t>NYC Power Outage EDA | Methods and Results Summary by Notebook Part</w:t>
+      <w:t>NYC Power Outage EDA | Methods and Findings by Notebook Part</w:t>
     </w:r>
   </w:p>
 </w:ftr>
@@ -2052,11 +2551,11 @@
       <w:contextualSpacing/>
     </w:pPr>
     <w:rPr>
-      <w:rFonts w:asciiTheme="majorHAnsi" w:eastAsiaTheme="majorEastAsia" w:hAnsiTheme="majorHAnsi" w:cstheme="majorBidi"/>
+      <w:rFonts w:asciiTheme="majorHAnsi" w:eastAsiaTheme="majorEastAsia" w:hAnsiTheme="majorHAnsi" w:cstheme="majorBidi" w:ascii="Arial" w:hAnsi="Arial"/>
       <w:color w:val="17365D" w:themeColor="text2" w:themeShade="BF"/>
       <w:spacing w:val="5"/>
       <w:kern w:val="28"/>
-      <w:sz w:val="52"/>
+      <w:sz w:val="32"/>
       <w:szCs w:val="52"/>
     </w:rPr>
   </w:style>

</xml_diff>

<commit_message>
Append findings to EDA outage report sections
</commit_message>
<xml_diff>
--- a/docs/EDA_Outage_Report.docx
+++ b/docs/EDA_Outage_Report.docx
@@ -23,12 +23,12 @@
           <w:i/>
           <w:sz w:val="22"/>
         </w:rPr>
-        <w:t>Methods and Findings by Notebook Part</w:t>
+        <w:t>Methods and Results Summary by Notebook Part</w:t>
       </w:r>
     </w:p>
     <w:p>
       <w:r>
-        <w:t>This document summarizes the executed EDA notebook for NYC power outages from 2014 to 2023. Each section below corresponds to a notebook part and states both the methodology and the main findings. The report emphasizes results that are supported by the notebook outputs, while distinguishing exploratory tract-level analysis from the corrected county-month and event-level models.</w:t>
+        <w:t>This document summarizes the analytical workflow used to examine New York City power outage burden from 2014 to 2023. The analysis links outage events with county and tract geography, severe-weather indicators, customer impact measures, outage duration, and Climate Vulnerability Index (CVI) variables. The purpose is to describe how outage frequency and duration vary over time and geography, and to evaluate whether social vulnerability is associated with outage burden after accounting for weather, seasonality, and data structure.</w:t>
       </w:r>
     </w:p>
     <w:p>
@@ -36,63 +36,7 @@
         <w:pStyle w:val="Heading1"/>
       </w:pPr>
       <w:r>
-        <w:t>Executive Summary</w:t>
-      </w:r>
-    </w:p>
-    <w:p>
-      <w:pPr>
-        <w:pStyle w:val="ListBullet"/>
-      </w:pPr>
-      <w:r>
-        <w:t>Severe weather is the most consistent outage driver. Rank-based tract tests find significant severe-weather association with outage occurrence in 1,008 of 2,168 tracts at FDR 0.05, while duration is not significantly associated at the tract level.</w:t>
-      </w:r>
-    </w:p>
-    <w:p>
-      <w:pPr>
-        <w:pStyle w:val="ListBullet"/>
-      </w:pPr>
-      <w:r>
-        <w:t>Seasonality is strong. Every year from 2014 through 2023 has a statistically significant month effect, and July appears as the hot month in three years.</w:t>
-      </w:r>
-    </w:p>
-    <w:p>
-      <w:pPr>
-        <w:pStyle w:val="ListBullet"/>
-      </w:pPr>
-      <w:r>
-        <w:t>Simple tract-year trend tests do not show significant long-run tract-level trends after FDR correction, even though raw annual totals vary sharply across years.</w:t>
-      </w:r>
-    </w:p>
-    <w:p>
-      <w:pPr>
-        <w:pStyle w:val="ListBullet"/>
-      </w:pPr>
-      <w:r>
-        <w:t>The most important data-structure finding is that outage outcomes are identical for all tracts within the same county-year. Tract-level regressions are therefore exploratory and should not be used as final CVI inference.</w:t>
-      </w:r>
-    </w:p>
-    <w:p>
-      <w:pPr>
-        <w:pStyle w:val="ListBullet"/>
-      </w:pPr>
-      <w:r>
-        <w:t>Negative Binomial models are preferred for outage counts. The Poisson county-year count model has overdispersion around 41.7 and much worse AIC than Negative Binomial.</w:t>
-      </w:r>
-    </w:p>
-    <w:p>
-      <w:pPr>
-        <w:pStyle w:val="ListBullet"/>
-      </w:pPr>
-      <w:r>
-        <w:t>The clearest vulnerability signal is social-economic CVI in frequency models, while the most robust overall predictor across duration and customer-hour outcomes remains severe weather.</w:t>
-      </w:r>
-    </w:p>
-    <w:p>
-      <w:pPr>
-        <w:pStyle w:val="Heading1"/>
-      </w:pPr>
-      <w:r>
-        <w:t>Study Scope and Data</w:t>
+        <w:t>Study Scope</w:t>
       </w:r>
     </w:p>
     <w:tbl>
@@ -102,13 +46,13 @@
         <w:tblLook w:firstColumn="1" w:firstRow="1" w:lastColumn="0" w:lastRow="0" w:noHBand="0" w:noVBand="1" w:val="04A0"/>
       </w:tblPr>
       <w:tblGrid>
-        <w:gridCol w:w="5040"/>
-        <w:gridCol w:w="5040"/>
+        <w:gridCol w:w="4968"/>
+        <w:gridCol w:w="4968"/>
       </w:tblGrid>
       <w:tr>
         <w:tc>
           <w:tcPr>
-            <w:tcW w:type="dxa" w:w="5040"/>
+            <w:tcW w:type="dxa" w:w="4968"/>
           </w:tcPr>
           <w:p>
             <w:r>
@@ -122,7 +66,7 @@
         </w:tc>
         <w:tc>
           <w:tcPr>
-            <w:tcW w:type="dxa" w:w="5040"/>
+            <w:tcW w:type="dxa" w:w="4968"/>
           </w:tcPr>
           <w:p>
             <w:r>
@@ -130,7 +74,7 @@
                 <w:rFonts w:ascii="Arial" w:hAnsi="Arial"/>
                 <w:sz w:val="17"/>
               </w:rPr>
-              <w:t>Value</w:t>
+              <w:t>Specification</w:t>
             </w:r>
           </w:p>
         </w:tc>
@@ -138,7 +82,7 @@
       <w:tr>
         <w:tc>
           <w:tcPr>
-            <w:tcW w:type="dxa" w:w="5040"/>
+            <w:tcW w:type="dxa" w:w="4968"/>
           </w:tcPr>
           <w:p>
             <w:r>
@@ -152,7 +96,7 @@
         </w:tc>
         <w:tc>
           <w:tcPr>
-            <w:tcW w:type="dxa" w:w="5040"/>
+            <w:tcW w:type="dxa" w:w="4968"/>
           </w:tcPr>
           <w:p>
             <w:r>
@@ -168,7 +112,7 @@
       <w:tr>
         <w:tc>
           <w:tcPr>
-            <w:tcW w:type="dxa" w:w="5040"/>
+            <w:tcW w:type="dxa" w:w="4968"/>
           </w:tcPr>
           <w:p>
             <w:r>
@@ -182,7 +126,7 @@
         </w:tc>
         <w:tc>
           <w:tcPr>
-            <w:tcW w:type="dxa" w:w="5040"/>
+            <w:tcW w:type="dxa" w:w="4968"/>
           </w:tcPr>
           <w:p>
             <w:r>
@@ -198,7 +142,7 @@
       <w:tr>
         <w:tc>
           <w:tcPr>
-            <w:tcW w:type="dxa" w:w="5040"/>
+            <w:tcW w:type="dxa" w:w="4968"/>
           </w:tcPr>
           <w:p>
             <w:r>
@@ -206,13 +150,13 @@
                 <w:rFonts w:ascii="Arial" w:hAnsi="Arial"/>
                 <w:sz w:val="17"/>
               </w:rPr>
-              <w:t>Tract count</w:t>
+              <w:t>Primary source</w:t>
             </w:r>
           </w:p>
         </w:tc>
         <w:tc>
           <w:tcPr>
-            <w:tcW w:type="dxa" w:w="5040"/>
+            <w:tcW w:type="dxa" w:w="4968"/>
           </w:tcPr>
           <w:p>
             <w:r>
@@ -220,7 +164,7 @@
                 <w:rFonts w:ascii="Arial" w:hAnsi="Arial"/>
                 <w:sz w:val="17"/>
               </w:rPr>
-              <w:t>2,168 NYC tracts in the outage/CVI panel</w:t>
+              <w:t>Merged outage event file with CVI indicators and severe-weather flags</w:t>
             </w:r>
           </w:p>
         </w:tc>
@@ -228,7 +172,7 @@
       <w:tr>
         <w:tc>
           <w:tcPr>
-            <w:tcW w:type="dxa" w:w="5040"/>
+            <w:tcW w:type="dxa" w:w="4968"/>
           </w:tcPr>
           <w:p>
             <w:r>
@@ -236,13 +180,13 @@
                 <w:rFonts w:ascii="Arial" w:hAnsi="Arial"/>
                 <w:sz w:val="17"/>
               </w:rPr>
-              <w:t>Main frequency model level</w:t>
+              <w:t>Exploratory unit</w:t>
             </w:r>
           </w:p>
         </w:tc>
         <w:tc>
           <w:tcPr>
-            <w:tcW w:type="dxa" w:w="5040"/>
+            <w:tcW w:type="dxa" w:w="4968"/>
           </w:tcPr>
           <w:p>
             <w:r>
@@ -250,7 +194,7 @@
                 <w:rFonts w:ascii="Arial" w:hAnsi="Arial"/>
                 <w:sz w:val="17"/>
               </w:rPr>
-              <w:t>County-month panel, 600 cells</w:t>
+              <w:t>Census tract-year and tract-month summaries</w:t>
             </w:r>
           </w:p>
         </w:tc>
@@ -258,7 +202,7 @@
       <w:tr>
         <w:tc>
           <w:tcPr>
-            <w:tcW w:type="dxa" w:w="5040"/>
+            <w:tcW w:type="dxa" w:w="4968"/>
           </w:tcPr>
           <w:p>
             <w:r>
@@ -266,13 +210,13 @@
                 <w:rFonts w:ascii="Arial" w:hAnsi="Arial"/>
                 <w:sz w:val="17"/>
               </w:rPr>
-              <w:t>County-year diagnostic level</w:t>
+              <w:t>Main frequency unit</w:t>
             </w:r>
           </w:p>
         </w:tc>
         <w:tc>
           <w:tcPr>
-            <w:tcW w:type="dxa" w:w="5040"/>
+            <w:tcW w:type="dxa" w:w="4968"/>
           </w:tcPr>
           <w:p>
             <w:r>
@@ -280,7 +224,7 @@
                 <w:rFonts w:ascii="Arial" w:hAnsi="Arial"/>
                 <w:sz w:val="17"/>
               </w:rPr>
-              <w:t>50 county-year cells, with 47 observed county-year cells in consistency checks</w:t>
+              <w:t>Balanced county-month panel with 600 observations</w:t>
             </w:r>
           </w:p>
         </w:tc>
@@ -288,7 +232,7 @@
       <w:tr>
         <w:tc>
           <w:tcPr>
-            <w:tcW w:type="dxa" w:w="5040"/>
+            <w:tcW w:type="dxa" w:w="4968"/>
           </w:tcPr>
           <w:p>
             <w:r>
@@ -296,13 +240,13 @@
                 <w:rFonts w:ascii="Arial" w:hAnsi="Arial"/>
                 <w:sz w:val="17"/>
               </w:rPr>
-              <w:t>Event-level duration model</w:t>
+              <w:t>Duration unit</w:t>
             </w:r>
           </w:p>
         </w:tc>
         <w:tc>
           <w:tcPr>
-            <w:tcW w:type="dxa" w:w="5040"/>
+            <w:tcW w:type="dxa" w:w="4968"/>
           </w:tcPr>
           <w:p>
             <w:r>
@@ -310,7 +254,7 @@
                 <w:rFonts w:ascii="Arial" w:hAnsi="Arial"/>
                 <w:sz w:val="17"/>
               </w:rPr>
-              <w:t>4,518 deduplicated outage events</w:t>
+              <w:t>Deduplicated outage-event panel with approximately 4,500 events</w:t>
             </w:r>
           </w:p>
         </w:tc>
@@ -318,7 +262,7 @@
       <w:tr>
         <w:tc>
           <w:tcPr>
-            <w:tcW w:type="dxa" w:w="5040"/>
+            <w:tcW w:type="dxa" w:w="4968"/>
           </w:tcPr>
           <w:p>
             <w:r>
@@ -326,13 +270,13 @@
                 <w:rFonts w:ascii="Arial" w:hAnsi="Arial"/>
                 <w:sz w:val="17"/>
               </w:rPr>
-              <w:t>Core predictors</w:t>
+              <w:t>Core methodological caution</w:t>
             </w:r>
           </w:p>
         </w:tc>
         <w:tc>
           <w:tcPr>
-            <w:tcW w:type="dxa" w:w="5040"/>
+            <w:tcW w:type="dxa" w:w="4968"/>
           </w:tcPr>
           <w:p>
             <w:r>
@@ -340,7 +284,7 @@
                 <w:rFonts w:ascii="Arial" w:hAnsi="Arial"/>
                 <w:sz w:val="17"/>
               </w:rPr>
-              <w:t>Year, month, severe weather, customer impact, and CVI measures</w:t>
+              <w:t>Tract-level rows are useful for mapping, but outage outcomes repeat within county-year cells; final inference should not rely on false tract-level precision.</w:t>
             </w:r>
           </w:p>
         </w:tc>
@@ -351,25 +295,69 @@
         <w:pStyle w:val="Heading1"/>
       </w:pPr>
       <w:r>
-        <w:t>Part 0: Load, Clean, and NYC Filter</w:t>
+        <w:t>Part 0: Data Preparation and NYC Filter</w:t>
       </w:r>
     </w:p>
     <w:p>
       <w:r>
-        <w:t>Methodology. The notebook standardizes county and tract FIPS codes, parses outage start times, extracts year and month, converts duration to numeric hours, flags severe-weather events from outage event type, and filters to the five NYC counties for 2014-2023.</w:t>
+        <w:t>Part 0 prepares the event-level outage/CVI file for analysis. County FIPS and tract FIPS are standardized, outage start times are parsed, years and months are extracted, outage duration is converted to numeric hours, and outage event types are used to create a severe-weather flag. The file is then restricted to the five NYC counties and the 2014-2023 study window.</w:t>
+      </w:r>
+    </w:p>
+    <w:p>
+      <w:pPr>
+        <w:pStyle w:val="ListBullet"/>
+      </w:pPr>
+      <w:r>
+        <w:t>Methodology: field cleaning, date parsing, FIPS normalization, NYC filtering, and severe-weather flag construction.</w:t>
+      </w:r>
+    </w:p>
+    <w:p>
+      <w:pPr>
+        <w:pStyle w:val="ListBullet"/>
+      </w:pPr>
+      <w:r>
+        <w:t>Purpose: establish a reproducible analysis panel and ensure that all later summaries use the same geography and time window.</w:t>
+      </w:r>
+    </w:p>
+    <w:p>
+      <w:pPr>
+        <w:pStyle w:val="ListBullet"/>
+      </w:pPr>
+      <w:r>
+        <w:t>Interpretation role: foundation step only; no substantive inference is made here.</w:t>
+      </w:r>
+    </w:p>
+    <w:p>
+      <w:pPr/>
+      <w:r>
+        <w:rPr>
+          <w:b/>
+        </w:rPr>
+        <w:t xml:space="preserve">Findings: </w:t>
+      </w:r>
+      <w:r>
+        <w:t>The cleaned NYC panel covers five borough counties from 2014 through 2023. Total outage rows are lowest in 2014 (17,171) and highest in 2018 (667,269), with another large year in 2022 (587,220). The severe-weather share is also highest in 2018 (32.3%), while average duration peaks in 2020 at about 7.98 hours.</w:t>
+      </w:r>
+    </w:p>
+    <w:p>
+      <w:pPr>
+        <w:ind w:left="360"/>
+      </w:pPr>
+      <w:r>
+        <w:t>This means the dataset is useful for comparing outage burden across boroughs and years, but the high-burden years are not evenly distributed. Later models therefore treat severe-weather exposure and time structure as important context rather than assuming a smooth annual trend.</w:t>
+      </w:r>
+    </w:p>
+    <w:p>
+      <w:pPr>
+        <w:pStyle w:val="Heading1"/>
+      </w:pPr>
+      <w:r>
+        <w:t>Parts 1-3: Initial Tract-Year and Month Effects</w:t>
       </w:r>
     </w:p>
     <w:p>
       <w:r>
-        <w:t>Findings. The cleaned data show large year-to-year variation. Total outage rows peak in 2018 with 667,269 outage rows, and average duration peaks in 2020 at 7.98 hours. Severe-weather share is highest in 2018 at 32.3%, followed by 2022 at 20.0% and 2019 at 17.4%. Early years 2014-2016 have no severe-weather flagged rows in this merged file.</w:t>
-      </w:r>
-    </w:p>
-    <w:p>
-      <w:pPr>
-        <w:pStyle w:val="Heading2"/>
-      </w:pPr>
-      <w:r>
-        <w:t>Part 0 Year Summary</w:t>
+        <w:t>Parts 1 through 3 explore whether severe weather, year trends, and month effects are related to outage outcomes. These sections use tract-year summaries and year-by-month counts to identify broad patterns before moving to corrected models.</w:t>
       </w:r>
     </w:p>
     <w:tbl>
@@ -379,15 +367,14 @@
         <w:tblLook w:firstColumn="1" w:firstRow="1" w:lastColumn="0" w:lastRow="0" w:noHBand="0" w:noVBand="1" w:val="04A0"/>
       </w:tblPr>
       <w:tblGrid>
-        <w:gridCol w:w="2520"/>
-        <w:gridCol w:w="2520"/>
-        <w:gridCol w:w="2520"/>
-        <w:gridCol w:w="2520"/>
+        <w:gridCol w:w="3312"/>
+        <w:gridCol w:w="3312"/>
+        <w:gridCol w:w="3312"/>
       </w:tblGrid>
       <w:tr>
         <w:tc>
           <w:tcPr>
-            <w:tcW w:type="dxa" w:w="2520"/>
+            <w:tcW w:type="dxa" w:w="3312"/>
           </w:tcPr>
           <w:p>
             <w:r>
@@ -395,13 +382,13 @@
                 <w:rFonts w:ascii="Arial" w:hAnsi="Arial"/>
                 <w:sz w:val="17"/>
               </w:rPr>
-              <w:t>Year</w:t>
+              <w:t>Part</w:t>
             </w:r>
           </w:p>
         </w:tc>
         <w:tc>
           <w:tcPr>
-            <w:tcW w:type="dxa" w:w="2520"/>
+            <w:tcW w:type="dxa" w:w="3312"/>
           </w:tcPr>
           <w:p>
             <w:r>
@@ -409,13 +396,13 @@
                 <w:rFonts w:ascii="Arial" w:hAnsi="Arial"/>
                 <w:sz w:val="17"/>
               </w:rPr>
-              <w:t>Total outages</w:t>
+              <w:t>Methodology</w:t>
             </w:r>
           </w:p>
         </w:tc>
         <w:tc>
           <w:tcPr>
-            <w:tcW w:type="dxa" w:w="2520"/>
+            <w:tcW w:type="dxa" w:w="3312"/>
           </w:tcPr>
           <w:p>
             <w:r>
@@ -423,13 +410,15 @@
                 <w:rFonts w:ascii="Arial" w:hAnsi="Arial"/>
                 <w:sz w:val="17"/>
               </w:rPr>
-              <w:t>Severe-weather share</w:t>
+              <w:t>Use in final interpretation</w:t>
             </w:r>
           </w:p>
         </w:tc>
+      </w:tr>
+      <w:tr>
         <w:tc>
           <w:tcPr>
-            <w:tcW w:type="dxa" w:w="2520"/>
+            <w:tcW w:type="dxa" w:w="3312"/>
           </w:tcPr>
           <w:p>
             <w:r>
@@ -437,7 +426,35 @@
                 <w:rFonts w:ascii="Arial" w:hAnsi="Arial"/>
                 <w:sz w:val="17"/>
               </w:rPr>
-              <w:t>Avg duration (h)</w:t>
+              <w:t>Part 1</w:t>
+            </w:r>
+          </w:p>
+        </w:tc>
+        <w:tc>
+          <w:tcPr>
+            <w:tcW w:type="dxa" w:w="3312"/>
+          </w:tcPr>
+          <w:p>
+            <w:r>
+              <w:rPr>
+                <w:rFonts w:ascii="Arial" w:hAnsi="Arial"/>
+                <w:sz w:val="17"/>
+              </w:rPr>
+              <w:t>Per-tract OLS models of outage occurrence and log duration on severe-weather count, with FDR correction.</w:t>
+            </w:r>
+          </w:p>
+        </w:tc>
+        <w:tc>
+          <w:tcPr>
+            <w:tcW w:type="dxa" w:w="3312"/>
+          </w:tcPr>
+          <w:p>
+            <w:r>
+              <w:rPr>
+                <w:rFonts w:ascii="Arial" w:hAnsi="Arial"/>
+                <w:sz w:val="17"/>
+              </w:rPr>
+              <w:t>Exploratory screen for weather-outage association.</w:t>
             </w:r>
           </w:p>
         </w:tc>
@@ -445,7 +462,7 @@
       <w:tr>
         <w:tc>
           <w:tcPr>
-            <w:tcW w:type="dxa" w:w="2520"/>
+            <w:tcW w:type="dxa" w:w="3312"/>
           </w:tcPr>
           <w:p>
             <w:r>
@@ -453,13 +470,13 @@
                 <w:rFonts w:ascii="Arial" w:hAnsi="Arial"/>
                 <w:sz w:val="17"/>
               </w:rPr>
-              <w:t>2014</w:t>
+              <w:t>Part 2</w:t>
             </w:r>
           </w:p>
         </w:tc>
         <w:tc>
           <w:tcPr>
-            <w:tcW w:type="dxa" w:w="2520"/>
+            <w:tcW w:type="dxa" w:w="3312"/>
           </w:tcPr>
           <w:p>
             <w:r>
@@ -467,13 +484,13 @@
                 <w:rFonts w:ascii="Arial" w:hAnsi="Arial"/>
                 <w:sz w:val="17"/>
               </w:rPr>
-              <w:t>17,171</w:t>
+              <w:t>Per-tract year-trend OLS, Kendall tau, and Theil-Sen slope checks.</w:t>
             </w:r>
           </w:p>
         </w:tc>
         <w:tc>
           <w:tcPr>
-            <w:tcW w:type="dxa" w:w="2520"/>
+            <w:tcW w:type="dxa" w:w="3312"/>
           </w:tcPr>
           <w:p>
             <w:r>
@@ -481,13 +498,15 @@
                 <w:rFonts w:ascii="Arial" w:hAnsi="Arial"/>
                 <w:sz w:val="17"/>
               </w:rPr>
-              <w:t>0.0%</w:t>
+              <w:t>Describes temporal patterns but is not final causal evidence.</w:t>
             </w:r>
           </w:p>
         </w:tc>
+      </w:tr>
+      <w:tr>
         <w:tc>
           <w:tcPr>
-            <w:tcW w:type="dxa" w:w="2520"/>
+            <w:tcW w:type="dxa" w:w="3312"/>
           </w:tcPr>
           <w:p>
             <w:r>
@@ -495,15 +514,13 @@
                 <w:rFonts w:ascii="Arial" w:hAnsi="Arial"/>
                 <w:sz w:val="17"/>
               </w:rPr>
-              <w:t>1.75</w:t>
+              <w:t>Part 3</w:t>
             </w:r>
           </w:p>
         </w:tc>
-      </w:tr>
-      <w:tr>
         <w:tc>
           <w:tcPr>
-            <w:tcW w:type="dxa" w:w="2520"/>
+            <w:tcW w:type="dxa" w:w="3312"/>
           </w:tcPr>
           <w:p>
             <w:r>
@@ -511,13 +528,13 @@
                 <w:rFonts w:ascii="Arial" w:hAnsi="Arial"/>
                 <w:sz w:val="17"/>
               </w:rPr>
-              <w:t>2015</w:t>
+              <w:t>Year-by-month chi-square tests and FDR-adjusted residual checks.</w:t>
             </w:r>
           </w:p>
         </w:tc>
         <w:tc>
           <w:tcPr>
-            <w:tcW w:type="dxa" w:w="2520"/>
+            <w:tcW w:type="dxa" w:w="3312"/>
           </w:tcPr>
           <w:p>
             <w:r>
@@ -525,520 +542,51 @@
                 <w:rFonts w:ascii="Arial" w:hAnsi="Arial"/>
                 <w:sz w:val="17"/>
               </w:rPr>
-              <w:t>280,690</w:t>
-            </w:r>
-          </w:p>
-        </w:tc>
-        <w:tc>
-          <w:tcPr>
-            <w:tcW w:type="dxa" w:w="2520"/>
-          </w:tcPr>
-          <w:p>
-            <w:r>
-              <w:rPr>
-                <w:rFonts w:ascii="Arial" w:hAnsi="Arial"/>
-                <w:sz w:val="17"/>
-              </w:rPr>
-              <w:t>0.0%</w:t>
-            </w:r>
-          </w:p>
-        </w:tc>
-        <w:tc>
-          <w:tcPr>
-            <w:tcW w:type="dxa" w:w="2520"/>
-          </w:tcPr>
-          <w:p>
-            <w:r>
-              <w:rPr>
-                <w:rFonts w:ascii="Arial" w:hAnsi="Arial"/>
-                <w:sz w:val="17"/>
-              </w:rPr>
-              <w:t>4.11</w:t>
-            </w:r>
-          </w:p>
-        </w:tc>
-      </w:tr>
-      <w:tr>
-        <w:tc>
-          <w:tcPr>
-            <w:tcW w:type="dxa" w:w="2520"/>
-          </w:tcPr>
-          <w:p>
-            <w:r>
-              <w:rPr>
-                <w:rFonts w:ascii="Arial" w:hAnsi="Arial"/>
-                <w:sz w:val="17"/>
-              </w:rPr>
-              <w:t>2016</w:t>
-            </w:r>
-          </w:p>
-        </w:tc>
-        <w:tc>
-          <w:tcPr>
-            <w:tcW w:type="dxa" w:w="2520"/>
-          </w:tcPr>
-          <w:p>
-            <w:r>
-              <w:rPr>
-                <w:rFonts w:ascii="Arial" w:hAnsi="Arial"/>
-                <w:sz w:val="17"/>
-              </w:rPr>
-              <w:t>296,277</w:t>
-            </w:r>
-          </w:p>
-        </w:tc>
-        <w:tc>
-          <w:tcPr>
-            <w:tcW w:type="dxa" w:w="2520"/>
-          </w:tcPr>
-          <w:p>
-            <w:r>
-              <w:rPr>
-                <w:rFonts w:ascii="Arial" w:hAnsi="Arial"/>
-                <w:sz w:val="17"/>
-              </w:rPr>
-              <w:t>0.0%</w:t>
-            </w:r>
-          </w:p>
-        </w:tc>
-        <w:tc>
-          <w:tcPr>
-            <w:tcW w:type="dxa" w:w="2520"/>
-          </w:tcPr>
-          <w:p>
-            <w:r>
-              <w:rPr>
-                <w:rFonts w:ascii="Arial" w:hAnsi="Arial"/>
-                <w:sz w:val="17"/>
-              </w:rPr>
-              <w:t>2.91</w:t>
-            </w:r>
-          </w:p>
-        </w:tc>
-      </w:tr>
-      <w:tr>
-        <w:tc>
-          <w:tcPr>
-            <w:tcW w:type="dxa" w:w="2520"/>
-          </w:tcPr>
-          <w:p>
-            <w:r>
-              <w:rPr>
-                <w:rFonts w:ascii="Arial" w:hAnsi="Arial"/>
-                <w:sz w:val="17"/>
-              </w:rPr>
-              <w:t>2017</w:t>
-            </w:r>
-          </w:p>
-        </w:tc>
-        <w:tc>
-          <w:tcPr>
-            <w:tcW w:type="dxa" w:w="2520"/>
-          </w:tcPr>
-          <w:p>
-            <w:r>
-              <w:rPr>
-                <w:rFonts w:ascii="Arial" w:hAnsi="Arial"/>
-                <w:sz w:val="17"/>
-              </w:rPr>
-              <w:t>227,010</w:t>
-            </w:r>
-          </w:p>
-        </w:tc>
-        <w:tc>
-          <w:tcPr>
-            <w:tcW w:type="dxa" w:w="2520"/>
-          </w:tcPr>
-          <w:p>
-            <w:r>
-              <w:rPr>
-                <w:rFonts w:ascii="Arial" w:hAnsi="Arial"/>
-                <w:sz w:val="17"/>
-              </w:rPr>
-              <w:t>0.7%</w:t>
-            </w:r>
-          </w:p>
-        </w:tc>
-        <w:tc>
-          <w:tcPr>
-            <w:tcW w:type="dxa" w:w="2520"/>
-          </w:tcPr>
-          <w:p>
-            <w:r>
-              <w:rPr>
-                <w:rFonts w:ascii="Arial" w:hAnsi="Arial"/>
-                <w:sz w:val="17"/>
-              </w:rPr>
-              <w:t>3.35</w:t>
-            </w:r>
-          </w:p>
-        </w:tc>
-      </w:tr>
-      <w:tr>
-        <w:tc>
-          <w:tcPr>
-            <w:tcW w:type="dxa" w:w="2520"/>
-          </w:tcPr>
-          <w:p>
-            <w:r>
-              <w:rPr>
-                <w:rFonts w:ascii="Arial" w:hAnsi="Arial"/>
-                <w:sz w:val="17"/>
-              </w:rPr>
-              <w:t>2018</w:t>
-            </w:r>
-          </w:p>
-        </w:tc>
-        <w:tc>
-          <w:tcPr>
-            <w:tcW w:type="dxa" w:w="2520"/>
-          </w:tcPr>
-          <w:p>
-            <w:r>
-              <w:rPr>
-                <w:rFonts w:ascii="Arial" w:hAnsi="Arial"/>
-                <w:sz w:val="17"/>
-              </w:rPr>
-              <w:t>667,269</w:t>
-            </w:r>
-          </w:p>
-        </w:tc>
-        <w:tc>
-          <w:tcPr>
-            <w:tcW w:type="dxa" w:w="2520"/>
-          </w:tcPr>
-          <w:p>
-            <w:r>
-              <w:rPr>
-                <w:rFonts w:ascii="Arial" w:hAnsi="Arial"/>
-                <w:sz w:val="17"/>
-              </w:rPr>
-              <w:t>32.3%</w:t>
-            </w:r>
-          </w:p>
-        </w:tc>
-        <w:tc>
-          <w:tcPr>
-            <w:tcW w:type="dxa" w:w="2520"/>
-          </w:tcPr>
-          <w:p>
-            <w:r>
-              <w:rPr>
-                <w:rFonts w:ascii="Arial" w:hAnsi="Arial"/>
-                <w:sz w:val="17"/>
-              </w:rPr>
-              <w:t>3.60</w:t>
-            </w:r>
-          </w:p>
-        </w:tc>
-      </w:tr>
-      <w:tr>
-        <w:tc>
-          <w:tcPr>
-            <w:tcW w:type="dxa" w:w="2520"/>
-          </w:tcPr>
-          <w:p>
-            <w:r>
-              <w:rPr>
-                <w:rFonts w:ascii="Arial" w:hAnsi="Arial"/>
-                <w:sz w:val="17"/>
-              </w:rPr>
-              <w:t>2019</w:t>
-            </w:r>
-          </w:p>
-        </w:tc>
-        <w:tc>
-          <w:tcPr>
-            <w:tcW w:type="dxa" w:w="2520"/>
-          </w:tcPr>
-          <w:p>
-            <w:r>
-              <w:rPr>
-                <w:rFonts w:ascii="Arial" w:hAnsi="Arial"/>
-                <w:sz w:val="17"/>
-              </w:rPr>
-              <w:t>306,579</w:t>
-            </w:r>
-          </w:p>
-        </w:tc>
-        <w:tc>
-          <w:tcPr>
-            <w:tcW w:type="dxa" w:w="2520"/>
-          </w:tcPr>
-          <w:p>
-            <w:r>
-              <w:rPr>
-                <w:rFonts w:ascii="Arial" w:hAnsi="Arial"/>
-                <w:sz w:val="17"/>
-              </w:rPr>
-              <w:t>17.4%</w:t>
-            </w:r>
-          </w:p>
-        </w:tc>
-        <w:tc>
-          <w:tcPr>
-            <w:tcW w:type="dxa" w:w="2520"/>
-          </w:tcPr>
-          <w:p>
-            <w:r>
-              <w:rPr>
-                <w:rFonts w:ascii="Arial" w:hAnsi="Arial"/>
-                <w:sz w:val="17"/>
-              </w:rPr>
-              <w:t>4.08</w:t>
-            </w:r>
-          </w:p>
-        </w:tc>
-      </w:tr>
-      <w:tr>
-        <w:tc>
-          <w:tcPr>
-            <w:tcW w:type="dxa" w:w="2520"/>
-          </w:tcPr>
-          <w:p>
-            <w:r>
-              <w:rPr>
-                <w:rFonts w:ascii="Arial" w:hAnsi="Arial"/>
-                <w:sz w:val="17"/>
-              </w:rPr>
-              <w:t>2020</w:t>
-            </w:r>
-          </w:p>
-        </w:tc>
-        <w:tc>
-          <w:tcPr>
-            <w:tcW w:type="dxa" w:w="2520"/>
-          </w:tcPr>
-          <w:p>
-            <w:r>
-              <w:rPr>
-                <w:rFonts w:ascii="Arial" w:hAnsi="Arial"/>
-                <w:sz w:val="17"/>
-              </w:rPr>
-              <w:t>274,108</w:t>
-            </w:r>
-          </w:p>
-        </w:tc>
-        <w:tc>
-          <w:tcPr>
-            <w:tcW w:type="dxa" w:w="2520"/>
-          </w:tcPr>
-          <w:p>
-            <w:r>
-              <w:rPr>
-                <w:rFonts w:ascii="Arial" w:hAnsi="Arial"/>
-                <w:sz w:val="17"/>
-              </w:rPr>
-              <w:t>10.9%</w:t>
-            </w:r>
-          </w:p>
-        </w:tc>
-        <w:tc>
-          <w:tcPr>
-            <w:tcW w:type="dxa" w:w="2520"/>
-          </w:tcPr>
-          <w:p>
-            <w:r>
-              <w:rPr>
-                <w:rFonts w:ascii="Arial" w:hAnsi="Arial"/>
-                <w:sz w:val="17"/>
-              </w:rPr>
-              <w:t>7.98</w:t>
-            </w:r>
-          </w:p>
-        </w:tc>
-      </w:tr>
-      <w:tr>
-        <w:tc>
-          <w:tcPr>
-            <w:tcW w:type="dxa" w:w="2520"/>
-          </w:tcPr>
-          <w:p>
-            <w:r>
-              <w:rPr>
-                <w:rFonts w:ascii="Arial" w:hAnsi="Arial"/>
-                <w:sz w:val="17"/>
-              </w:rPr>
-              <w:t>2021</w:t>
-            </w:r>
-          </w:p>
-        </w:tc>
-        <w:tc>
-          <w:tcPr>
-            <w:tcW w:type="dxa" w:w="2520"/>
-          </w:tcPr>
-          <w:p>
-            <w:r>
-              <w:rPr>
-                <w:rFonts w:ascii="Arial" w:hAnsi="Arial"/>
-                <w:sz w:val="17"/>
-              </w:rPr>
-              <w:t>319,416</w:t>
-            </w:r>
-          </w:p>
-        </w:tc>
-        <w:tc>
-          <w:tcPr>
-            <w:tcW w:type="dxa" w:w="2520"/>
-          </w:tcPr>
-          <w:p>
-            <w:r>
-              <w:rPr>
-                <w:rFonts w:ascii="Arial" w:hAnsi="Arial"/>
-                <w:sz w:val="17"/>
-              </w:rPr>
-              <w:t>0.1%</w:t>
-            </w:r>
-          </w:p>
-        </w:tc>
-        <w:tc>
-          <w:tcPr>
-            <w:tcW w:type="dxa" w:w="2520"/>
-          </w:tcPr>
-          <w:p>
-            <w:r>
-              <w:rPr>
-                <w:rFonts w:ascii="Arial" w:hAnsi="Arial"/>
-                <w:sz w:val="17"/>
-              </w:rPr>
-              <w:t>4.12</w:t>
-            </w:r>
-          </w:p>
-        </w:tc>
-      </w:tr>
-      <w:tr>
-        <w:tc>
-          <w:tcPr>
-            <w:tcW w:type="dxa" w:w="2520"/>
-          </w:tcPr>
-          <w:p>
-            <w:r>
-              <w:rPr>
-                <w:rFonts w:ascii="Arial" w:hAnsi="Arial"/>
-                <w:sz w:val="17"/>
-              </w:rPr>
-              <w:t>2022</w:t>
-            </w:r>
-          </w:p>
-        </w:tc>
-        <w:tc>
-          <w:tcPr>
-            <w:tcW w:type="dxa" w:w="2520"/>
-          </w:tcPr>
-          <w:p>
-            <w:r>
-              <w:rPr>
-                <w:rFonts w:ascii="Arial" w:hAnsi="Arial"/>
-                <w:sz w:val="17"/>
-              </w:rPr>
-              <w:t>587,220</w:t>
-            </w:r>
-          </w:p>
-        </w:tc>
-        <w:tc>
-          <w:tcPr>
-            <w:tcW w:type="dxa" w:w="2520"/>
-          </w:tcPr>
-          <w:p>
-            <w:r>
-              <w:rPr>
-                <w:rFonts w:ascii="Arial" w:hAnsi="Arial"/>
-                <w:sz w:val="17"/>
-              </w:rPr>
-              <w:t>20.0%</w:t>
-            </w:r>
-          </w:p>
-        </w:tc>
-        <w:tc>
-          <w:tcPr>
-            <w:tcW w:type="dxa" w:w="2520"/>
-          </w:tcPr>
-          <w:p>
-            <w:r>
-              <w:rPr>
-                <w:rFonts w:ascii="Arial" w:hAnsi="Arial"/>
-                <w:sz w:val="17"/>
-              </w:rPr>
-              <w:t>2.10</w:t>
-            </w:r>
-          </w:p>
-        </w:tc>
-      </w:tr>
-      <w:tr>
-        <w:tc>
-          <w:tcPr>
-            <w:tcW w:type="dxa" w:w="2520"/>
-          </w:tcPr>
-          <w:p>
-            <w:r>
-              <w:rPr>
-                <w:rFonts w:ascii="Arial" w:hAnsi="Arial"/>
-                <w:sz w:val="17"/>
-              </w:rPr>
-              <w:t>2023</w:t>
-            </w:r>
-          </w:p>
-        </w:tc>
-        <w:tc>
-          <w:tcPr>
-            <w:tcW w:type="dxa" w:w="2520"/>
-          </w:tcPr>
-          <w:p>
-            <w:r>
-              <w:rPr>
-                <w:rFonts w:ascii="Arial" w:hAnsi="Arial"/>
-                <w:sz w:val="17"/>
-              </w:rPr>
-              <w:t>225,135</w:t>
-            </w:r>
-          </w:p>
-        </w:tc>
-        <w:tc>
-          <w:tcPr>
-            <w:tcW w:type="dxa" w:w="2520"/>
-          </w:tcPr>
-          <w:p>
-            <w:r>
-              <w:rPr>
-                <w:rFonts w:ascii="Arial" w:hAnsi="Arial"/>
-                <w:sz w:val="17"/>
-              </w:rPr>
-              <w:t>1.3%</w:t>
-            </w:r>
-          </w:p>
-        </w:tc>
-        <w:tc>
-          <w:tcPr>
-            <w:tcW w:type="dxa" w:w="2520"/>
-          </w:tcPr>
-          <w:p>
-            <w:r>
-              <w:rPr>
-                <w:rFonts w:ascii="Arial" w:hAnsi="Arial"/>
-                <w:sz w:val="17"/>
-              </w:rPr>
-              <w:t>2.25</w:t>
+              <w:t>Identifies seasonality and motivates month controls in later models.</w:t>
             </w:r>
           </w:p>
         </w:tc>
       </w:tr>
     </w:tbl>
     <w:p>
-      <w:pPr>
-        <w:pStyle w:val="Heading1"/>
-      </w:pPr>
       <w:r>
-        <w:t>Part 1: Severe Weather vs. Outage Occurrence and Duration</w:t>
+        <w:t>These early analyses are useful for pattern discovery, but they are not the strongest evidence because tract-level observations do not represent fully independent outage outcomes.</w:t>
       </w:r>
     </w:p>
     <w:p>
+      <w:pPr/>
       <w:r>
-        <w:t>Methodology. Part 1 fits per-tract models relating outage occurrence and log duration to severe-weather counts. The section includes OLS models and a Poisson direction check, with FDR correction across tracts.</w:t>
+        <w:rPr>
+          <w:b/>
+        </w:rPr>
+        <w:t xml:space="preserve">Findings: </w:t>
+      </w:r>
+      <w:r>
+        <w:t>The first severe-weather screen shows a broad positive relationship between severe weather and outage occurrence: 1,769 of 2,168 tracts are significant at FDR 0.05 in the initial OLS screen, and all significant slopes are positive. The median severe-weather coefficient is about 2.32.</w:t>
       </w:r>
     </w:p>
     <w:p>
+      <w:pPr>
+        <w:ind w:left="360"/>
+      </w:pPr>
       <w:r>
-        <w:t>Findings. The occurrence relationship is strong and positive. In the OLS screen, 1,769 of 2,168 tracts are significant at FDR 0.05, and all estimated occurrence slopes are positive. The median severe-weather coefficient is about 2.32. This supports severe weather as a major driver of outage occurrence. The duration relationship is not supported at tract level.</w:t>
+        <w:t>After switching to the more robust Spearman version, the occurrence result remains visible but weaker: 1,008 of 2,168 tracts are significant at FDR 0.05 and 669 are significant at FDR 0.01, with median rho about 0.69. Duration does not show the same robust tract-level relationship.</w:t>
+      </w:r>
+    </w:p>
+    <w:p>
+      <w:pPr>
+        <w:ind w:left="360"/>
+      </w:pPr>
+      <w:r>
+        <w:t>The annual trend screen does not support a clean 2014-2023 time trend after FDR correction. Raw occurrence slopes are often positive, but no tract-level occurrence or duration trend survives the multiple-testing adjustment.</w:t>
+      </w:r>
+    </w:p>
+    <w:p>
+      <w:pPr>
+        <w:ind w:left="360"/>
+      </w:pPr>
+      <w:r>
+        <w:t>Month effects are much clearer than linear year trends. Every year has a significant month effect, with high-outage months shifting across years; July appears as the top month in three years, and March appears in two years.</w:t>
       </w:r>
     </w:p>
     <w:p>
@@ -1046,17 +594,64 @@
         <w:pStyle w:val="Heading1"/>
       </w:pPr>
       <w:r>
-        <w:t>Part 2: Outage Occurrence and Duration Trends Over Years</w:t>
+        <w:t>Parts 4-6: Visualization, Correlation, and Seasonality Clustering</w:t>
       </w:r>
     </w:p>
     <w:p>
       <w:r>
-        <w:t>Methodology. Part 2 estimates per-tract year trends using OLS slopes and robust nonparametric checks with Kendall tau and Theil-Sen slopes. FDR correction is applied to occurrence and duration trend p-values.</w:t>
+        <w:t>Parts 4 through 6 summarize spatial and seasonal structure. Visualizations show annual totals and monthly heat maps. Spearman correlations are used because outage counts and duration are skewed. K-means clustering is applied to monthly outage-share profiles to summarize seasonality patterns.</w:t>
       </w:r>
     </w:p>
     <w:p>
+      <w:pPr>
+        <w:pStyle w:val="ListBullet"/>
+      </w:pPr>
       <w:r>
-        <w:t>Findings. After FDR correction, no tract has a significant occurrence trend and no tract has a significant duration trend at the 0.05 level. Median raw slopes are positive, about 7.72 additional outage rows per year and 0.046 log-duration units per year, but these slopes are not statistically robust after multiple-testing correction. The finding is therefore temporal variability, not a stable tract-level trend.</w:t>
+        <w:t>Methodology: descriptive visualization, nonparametric correlation, and clustering of monthly outage-share profiles.</w:t>
+      </w:r>
+    </w:p>
+    <w:p>
+      <w:pPr>
+        <w:pStyle w:val="ListBullet"/>
+      </w:pPr>
+      <w:r>
+        <w:t>Main role: communicate patterns and diagnose structure before modeling.</w:t>
+      </w:r>
+    </w:p>
+    <w:p>
+      <w:pPr>
+        <w:pStyle w:val="ListBullet"/>
+      </w:pPr>
+      <w:r>
+        <w:t>Important caveat: the clustering reflects county-level seasonality more than true tract-level heterogeneity because many tract profiles duplicate county patterns.</w:t>
+      </w:r>
+    </w:p>
+    <w:p>
+      <w:pPr/>
+      <w:r>
+        <w:rPr>
+          <w:b/>
+        </w:rPr>
+        <w:t xml:space="preserve">Findings: </w:t>
+      </w:r>
+      <w:r>
+        <w:t>The corrected significance summary supports severe weather and seasonality as the two strongest descriptive patterns. Severe weather versus occurrence is significant for 1,008 tracts at FDR 0.05 and 669 at FDR 0.01, while severe weather versus duration is significant for zero tracts.</w:t>
+      </w:r>
+    </w:p>
+    <w:p>
+      <w:pPr>
+        <w:ind w:left="360"/>
+      </w:pPr>
+      <w:r>
+        <w:t>Monthly trend testing finds no month with a significant occurrence trend after FDR correction. January is the only month with a significant negative duration trend, so the notebook should not claim broad month-specific improvement or deterioration over time.</w:t>
+      </w:r>
+    </w:p>
+    <w:p>
+      <w:pPr>
+        <w:ind w:left="360"/>
+      </w:pPr>
+      <w:r>
+        <w:t>The seasonality clustering produces four groups with sizes 111, 1,008, 288, and 761 tracts. Their top months differ, but later diagnostics show that these clusters mostly reflect county-level seasonal profiles rather than independent tract-level behavioral types.</w:t>
       </w:r>
     </w:p>
     <w:p>
@@ -1064,25 +659,126 @@
         <w:pStyle w:val="Heading1"/>
       </w:pPr>
       <w:r>
-        <w:t>Part 3: Month Effect in Each Year</w:t>
+        <w:t>Part 7: CVI Variables and Exploratory Regressions</w:t>
       </w:r>
     </w:p>
     <w:p>
       <w:r>
-        <w:t>Methodology. Part 3 performs year-specific chi-square goodness-of-fit tests, with expected monthly counts proportional to days in month. FDR-adjusted standardized residuals identify hot months.</w:t>
+        <w:t>Part 7 adds CVI measures to the outage panel. The candidate variables include overall CVI, baseline social-economic CVI, baseline infrastructure CVI, and climate/extreme-events CVI. Exploratory tract-year regressions are used to understand possible vulnerability relationships.</w:t>
+      </w:r>
+    </w:p>
+    <w:p>
+      <w:pPr>
+        <w:pStyle w:val="ListBullet"/>
+      </w:pPr>
+      <w:r>
+        <w:t>Methodology: merge tract-level CVI features, construct tract-year outcomes, and fit exploratory regression models.</w:t>
+      </w:r>
+    </w:p>
+    <w:p>
+      <w:pPr>
+        <w:pStyle w:val="ListBullet"/>
+      </w:pPr>
+      <w:r>
+        <w:t>Key caution: CVI variables are correlated with one another, so models with many CVI predictors can produce unstable coefficients.</w:t>
+      </w:r>
+    </w:p>
+    <w:p>
+      <w:pPr>
+        <w:pStyle w:val="ListBullet"/>
+      </w:pPr>
+      <w:r>
+        <w:t>Interpretation role: hypothesis generation rather than final evidence.</w:t>
+      </w:r>
+    </w:p>
+    <w:p>
+      <w:pPr/>
+      <w:r>
+        <w:rPr>
+          <w:b/>
+        </w:rPr>
+        <w:t xml:space="preserve">Findings: </w:t>
+      </w:r>
+      <w:r>
+        <w:t>The exploratory CVI regressions suggest that social and economic vulnerability is more relevant to outage burden than several other CVI dimensions. However, the CVI variables are correlated, so this section is best read as a variable-screening step rather than final evidence.</w:t>
+      </w:r>
+    </w:p>
+    <w:p>
+      <w:pPr>
+        <w:ind w:left="360"/>
+      </w:pPr>
+      <w:r>
+        <w:t>In the cleaner county-year frequency setup, overall CVI is positively associated with outage frequency in OLS (coef. 0.426, p = 0.016), and the social-economic CVI component is also positive (coef. 0.444, p = 0.008). The high-vulnerability share is not significant in OLS.</w:t>
+      </w:r>
+    </w:p>
+    <w:p>
+      <w:pPr>
+        <w:pStyle w:val="Heading1"/>
+      </w:pPr>
+      <w:r>
+        <w:t>Part 8: Data Structure Correction</w:t>
       </w:r>
     </w:p>
     <w:p>
       <w:r>
-        <w:t>Findings. All 10 study years have statistically significant month effects. The strongest hot month varies by year: November in 2014, June in 2015, September in 2016, March in 2017 and 2018, July in 2019, 2020, and 2023, February in 2021, and April in 2022. July is the most frequent hot month, appearing in three years. Seasonality is therefore a central feature of the outage process.</w:t>
+        <w:t>Part 8 is the methodological turning point. It shows that outage occurrence, mean duration, and severe-weather count are often identical for tracts within the same county-year. This means tract-level regressions create a misleading sense of precision. The corrected analysis therefore collapses the data to county-year and county-month panels for the main frequency models.</w:t>
       </w:r>
     </w:p>
     <w:p>
       <w:pPr>
-        <w:pStyle w:val="Heading2"/>
+        <w:pStyle w:val="ListBullet"/>
       </w:pPr>
       <w:r>
-        <w:t>Part 3 Hot Months</w:t>
+        <w:t>Methodology: county-year consistency checks, county-year collapse, OLS/Poisson diagnostics, and VIF checks.</w:t>
+      </w:r>
+    </w:p>
+    <w:p>
+      <w:pPr>
+        <w:pStyle w:val="ListBullet"/>
+      </w:pPr>
+      <w:r>
+        <w:t>Reason for correction: repeated tract rows do not add independent outage information.</w:t>
+      </w:r>
+    </w:p>
+    <w:p>
+      <w:pPr>
+        <w:pStyle w:val="ListBullet"/>
+      </w:pPr>
+      <w:r>
+        <w:t>Final implication: tract-level results should be used for maps and screening; county-month and event-level models should carry the main interpretation.</w:t>
+      </w:r>
+    </w:p>
+    <w:p>
+      <w:pPr/>
+      <w:r>
+        <w:rPr>
+          <w:b/>
+        </w:rPr>
+        <w:t xml:space="preserve">Findings: </w:t>
+      </w:r>
+      <w:r>
+        <w:t>The data-structure check confirms why the original tract-level interpretation needed correction: within each county-year, outage occurrence, duration, and severe-weather indicators are repeated consistently across tracts. In the 47 county-year rows checked, the unique-value consistency rate is 100% for occurrence, duration, and severe-weather variables.</w:t>
+      </w:r>
+    </w:p>
+    <w:p>
+      <w:pPr>
+        <w:ind w:left="360"/>
+      </w:pPr>
+      <w:r>
+        <w:t>This finding changes the most defensible unit of inference. Tract maps and CVI joins remain useful for description, but final frequency models should be interpreted at the county-year or county-month level.</w:t>
+      </w:r>
+    </w:p>
+    <w:p>
+      <w:pPr>
+        <w:pStyle w:val="Heading1"/>
+      </w:pPr>
+      <w:r>
+        <w:t>Part 8b and Part 9: Corrected Frequency Models</w:t>
+      </w:r>
+    </w:p>
+    <w:p>
+      <w:r>
+        <w:t>The corrected frequency analysis uses count models and county-month models. Poisson diagnostics show substantial overdispersion, so Negative Binomial models are preferred for outage counts. Part 9 then estimates one main CVI concept at a time in a county-month framework with time, severe-weather, and month controls.</w:t>
       </w:r>
     </w:p>
     <w:tbl>
@@ -1092,14 +788,14 @@
         <w:tblLook w:firstColumn="1" w:firstRow="1" w:lastColumn="0" w:lastRow="0" w:noHBand="0" w:noVBand="1" w:val="04A0"/>
       </w:tblPr>
       <w:tblGrid>
-        <w:gridCol w:w="3360"/>
-        <w:gridCol w:w="3360"/>
-        <w:gridCol w:w="3360"/>
+        <w:gridCol w:w="3312"/>
+        <w:gridCol w:w="3312"/>
+        <w:gridCol w:w="3312"/>
       </w:tblGrid>
       <w:tr>
         <w:tc>
           <w:tcPr>
-            <w:tcW w:type="dxa" w:w="3360"/>
+            <w:tcW w:type="dxa" w:w="3312"/>
           </w:tcPr>
           <w:p>
             <w:r>
@@ -1107,13 +803,13 @@
                 <w:rFonts w:ascii="Arial" w:hAnsi="Arial"/>
                 <w:sz w:val="17"/>
               </w:rPr>
-              <w:t>Year</w:t>
+              <w:t>Model component</w:t>
             </w:r>
           </w:p>
         </w:tc>
         <w:tc>
           <w:tcPr>
-            <w:tcW w:type="dxa" w:w="3360"/>
+            <w:tcW w:type="dxa" w:w="3312"/>
           </w:tcPr>
           <w:p>
             <w:r>
@@ -1121,13 +817,13 @@
                 <w:rFonts w:ascii="Arial" w:hAnsi="Arial"/>
                 <w:sz w:val="17"/>
               </w:rPr>
-              <w:t>Hot month</w:t>
+              <w:t>Methodology</w:t>
             </w:r>
           </w:p>
         </w:tc>
         <w:tc>
           <w:tcPr>
-            <w:tcW w:type="dxa" w:w="3360"/>
+            <w:tcW w:type="dxa" w:w="3312"/>
           </w:tcPr>
           <w:p>
             <w:r>
@@ -1135,7 +831,7 @@
                 <w:rFonts w:ascii="Arial" w:hAnsi="Arial"/>
                 <w:sz w:val="17"/>
               </w:rPr>
-              <w:t>Observed count</w:t>
+              <w:t>Interpretation</w:t>
             </w:r>
           </w:p>
         </w:tc>
@@ -1143,7 +839,7 @@
       <w:tr>
         <w:tc>
           <w:tcPr>
-            <w:tcW w:type="dxa" w:w="3360"/>
+            <w:tcW w:type="dxa" w:w="3312"/>
           </w:tcPr>
           <w:p>
             <w:r>
@@ -1151,13 +847,13 @@
                 <w:rFonts w:ascii="Arial" w:hAnsi="Arial"/>
                 <w:sz w:val="17"/>
               </w:rPr>
-              <w:t>2014</w:t>
+              <w:t>Overdispersion check</w:t>
             </w:r>
           </w:p>
         </w:tc>
         <w:tc>
           <w:tcPr>
-            <w:tcW w:type="dxa" w:w="3360"/>
+            <w:tcW w:type="dxa" w:w="3312"/>
           </w:tcPr>
           <w:p>
             <w:r>
@@ -1165,13 +861,13 @@
                 <w:rFonts w:ascii="Arial" w:hAnsi="Arial"/>
                 <w:sz w:val="17"/>
               </w:rPr>
-              <w:t>November</w:t>
+              <w:t>Compare Poisson assumptions against observed count variance.</w:t>
             </w:r>
           </w:p>
         </w:tc>
         <w:tc>
           <w:tcPr>
-            <w:tcW w:type="dxa" w:w="3360"/>
+            <w:tcW w:type="dxa" w:w="3312"/>
           </w:tcPr>
           <w:p>
             <w:r>
@@ -1179,7 +875,7 @@
                 <w:rFonts w:ascii="Arial" w:hAnsi="Arial"/>
                 <w:sz w:val="17"/>
               </w:rPr>
-              <w:t>11,715</w:t>
+              <w:t>Poisson is too restrictive when overdispersion is high.</w:t>
             </w:r>
           </w:p>
         </w:tc>
@@ -1187,7 +883,7 @@
       <w:tr>
         <w:tc>
           <w:tcPr>
-            <w:tcW w:type="dxa" w:w="3360"/>
+            <w:tcW w:type="dxa" w:w="3312"/>
           </w:tcPr>
           <w:p>
             <w:r>
@@ -1195,13 +891,13 @@
                 <w:rFonts w:ascii="Arial" w:hAnsi="Arial"/>
                 <w:sz w:val="17"/>
               </w:rPr>
-              <w:t>2015</w:t>
+              <w:t>Negative Binomial</w:t>
             </w:r>
           </w:p>
         </w:tc>
         <w:tc>
           <w:tcPr>
-            <w:tcW w:type="dxa" w:w="3360"/>
+            <w:tcW w:type="dxa" w:w="3312"/>
           </w:tcPr>
           <w:p>
             <w:r>
@@ -1209,13 +905,13 @@
                 <w:rFonts w:ascii="Arial" w:hAnsi="Arial"/>
                 <w:sz w:val="17"/>
               </w:rPr>
-              <w:t>June</w:t>
+              <w:t>Use an overdispersed count model for outage frequency.</w:t>
             </w:r>
           </w:p>
         </w:tc>
         <w:tc>
           <w:tcPr>
-            <w:tcW w:type="dxa" w:w="3360"/>
+            <w:tcW w:type="dxa" w:w="3312"/>
           </w:tcPr>
           <w:p>
             <w:r>
@@ -1223,7 +919,7 @@
                 <w:rFonts w:ascii="Arial" w:hAnsi="Arial"/>
                 <w:sz w:val="17"/>
               </w:rPr>
-              <w:t>48,404</w:t>
+              <w:t>Preferred count-model family for frequency.</w:t>
             </w:r>
           </w:p>
         </w:tc>
@@ -1231,7 +927,7 @@
       <w:tr>
         <w:tc>
           <w:tcPr>
-            <w:tcW w:type="dxa" w:w="3360"/>
+            <w:tcW w:type="dxa" w:w="3312"/>
           </w:tcPr>
           <w:p>
             <w:r>
@@ -1239,13 +935,13 @@
                 <w:rFonts w:ascii="Arial" w:hAnsi="Arial"/>
                 <w:sz w:val="17"/>
               </w:rPr>
-              <w:t>2016</w:t>
+              <w:t>County-month panel</w:t>
             </w:r>
           </w:p>
         </w:tc>
         <w:tc>
           <w:tcPr>
-            <w:tcW w:type="dxa" w:w="3360"/>
+            <w:tcW w:type="dxa" w:w="3312"/>
           </w:tcPr>
           <w:p>
             <w:r>
@@ -1253,13 +949,13 @@
                 <w:rFonts w:ascii="Arial" w:hAnsi="Arial"/>
                 <w:sz w:val="17"/>
               </w:rPr>
-              <w:t>September</w:t>
+              <w:t>Five counties x ten years x twelve months, producing 600 observations.</w:t>
             </w:r>
           </w:p>
         </w:tc>
         <w:tc>
           <w:tcPr>
-            <w:tcW w:type="dxa" w:w="3360"/>
+            <w:tcW w:type="dxa" w:w="3312"/>
           </w:tcPr>
           <w:p>
             <w:r>
@@ -1267,7 +963,7 @@
                 <w:rFonts w:ascii="Arial" w:hAnsi="Arial"/>
                 <w:sz w:val="17"/>
               </w:rPr>
-              <w:t>77,368</w:t>
+              <w:t>Main frequency model because it accounts for seasonality and avoids tract-level pseudo-replication.</w:t>
             </w:r>
           </w:p>
         </w:tc>
@@ -1275,7 +971,7 @@
       <w:tr>
         <w:tc>
           <w:tcPr>
-            <w:tcW w:type="dxa" w:w="3360"/>
+            <w:tcW w:type="dxa" w:w="3312"/>
           </w:tcPr>
           <w:p>
             <w:r>
@@ -1283,13 +979,13 @@
                 <w:rFonts w:ascii="Arial" w:hAnsi="Arial"/>
                 <w:sz w:val="17"/>
               </w:rPr>
-              <w:t>2017</w:t>
+              <w:t>One-CVI-at-a-time models</w:t>
             </w:r>
           </w:p>
         </w:tc>
         <w:tc>
           <w:tcPr>
-            <w:tcW w:type="dxa" w:w="3360"/>
+            <w:tcW w:type="dxa" w:w="3312"/>
           </w:tcPr>
           <w:p>
             <w:r>
@@ -1297,13 +993,13 @@
                 <w:rFonts w:ascii="Arial" w:hAnsi="Arial"/>
                 <w:sz w:val="17"/>
               </w:rPr>
-              <w:t>March</w:t>
+              <w:t>Estimate separate models for overall, social-economic, climate, and high-vulnerability-share concepts.</w:t>
             </w:r>
           </w:p>
         </w:tc>
         <w:tc>
           <w:tcPr>
-            <w:tcW w:type="dxa" w:w="3360"/>
+            <w:tcW w:type="dxa" w:w="3312"/>
           </w:tcPr>
           <w:p>
             <w:r>
@@ -1311,7 +1007,174 @@
                 <w:rFonts w:ascii="Arial" w:hAnsi="Arial"/>
                 <w:sz w:val="17"/>
               </w:rPr>
-              <w:t>36,381</w:t>
+              <w:t>Improves interpretability and reduces multicollinearity problems.</w:t>
+            </w:r>
+          </w:p>
+        </w:tc>
+      </w:tr>
+    </w:tbl>
+    <w:p>
+      <w:r>
+        <w:t>The clearest vulnerability signal appears for social-economic CVI. In the county-month Poisson specification, a one-standard-deviation increase in social-economic CVI is associated with an incidence rate ratio of approximately 1.20, or about 20 percent higher monthly outage counts, conditional on the model controls.</w:t>
+      </w:r>
+    </w:p>
+    <w:p>
+      <w:pPr/>
+      <w:r>
+        <w:rPr>
+          <w:b/>
+        </w:rPr>
+        <w:t xml:space="preserve">Findings: </w:t>
+      </w:r>
+      <w:r>
+        <w:t>The count-model diagnostics support Negative Binomial models over simple Poisson models. The county-year Poisson model has strong overdispersion, with dispersion about 41.7 and AIC about 2,297, while the comparable Negative Binomial model has much lower AIC, about 551.</w:t>
+      </w:r>
+    </w:p>
+    <w:p>
+      <w:pPr>
+        <w:ind w:left="360"/>
+      </w:pPr>
+      <w:r>
+        <w:t>At the county-month level, adding month effects improves the Negative Binomial model: AIC decreases from about 3,277 to 3,227, and the likelihood-ratio test for month effects is highly significant (p about 5.44e-11). The county-month panel contains 600 cells, including 126 zero-outage cells.</w:t>
+      </w:r>
+    </w:p>
+    <w:p>
+      <w:pPr>
+        <w:ind w:left="360"/>
+      </w:pPr>
+      <w:r>
+        <w:t>In the CVI frequency models, social-economic CVI is the clearest positive vulnerability signal. The Poisson incidence-rate ratio is about 1.18 for social-economic CVI, while severe-weather exposure remains a positive predictor in the cleaner models.</w:t>
+      </w:r>
+    </w:p>
+    <w:p>
+      <w:pPr>
+        <w:pStyle w:val="Heading1"/>
+      </w:pPr>
+      <w:r>
+        <w:t>Part 9b: Theory-Driven CVI Selection and Ridge Sensitivity</w:t>
+      </w:r>
+    </w:p>
+    <w:p>
+      <w:r>
+        <w:t>Part 9b narrows the vulnerability question to theoretically motivated predictors, including social-economic CVI, infrastructure CVI, and severe-weather count. OLS and Ridge models are compared to assess whether coefficient signs remain stable when predictors are correlated.</w:t>
+      </w:r>
+    </w:p>
+    <w:p>
+      <w:pPr>
+        <w:pStyle w:val="ListBullet"/>
+      </w:pPr>
+      <w:r>
+        <w:t>Methodology: compare OLS estimates with Ridge sensitivity models.</w:t>
+      </w:r>
+    </w:p>
+    <w:p>
+      <w:pPr>
+        <w:pStyle w:val="ListBullet"/>
+      </w:pPr>
+      <w:r>
+        <w:t>Use of Ridge: directional robustness check, not the primary explanatory model.</w:t>
+      </w:r>
+    </w:p>
+    <w:p>
+      <w:pPr>
+        <w:pStyle w:val="ListBullet"/>
+      </w:pPr>
+      <w:r>
+        <w:t>Interpretation: infrastructure CVI is positive but imprecise; social-economic CVI is directionally consistent but still sensitive to small county-level sample size.</w:t>
+      </w:r>
+    </w:p>
+    <w:p>
+      <w:pPr/>
+      <w:r>
+        <w:rPr>
+          <w:b/>
+        </w:rPr>
+        <w:t xml:space="preserve">Findings: </w:t>
+      </w:r>
+      <w:r>
+        <w:t>The theory-driven sensitivity check keeps the social-economic and infrastructure CVI components together with severe-weather exposure. In this more conservative setup, social-economic CVI remains positive in both OLS and Ridge, but its confidence interval crosses zero.</w:t>
+      </w:r>
+    </w:p>
+    <w:p>
+      <w:pPr>
+        <w:ind w:left="360"/>
+      </w:pPr>
+      <w:r>
+        <w:t>Infrastructure CVI is also positive but uncertain. Severe-weather exposure is the most stable predictor: OLS coefficient about 0.389 with 95% CI 0.137 to 0.641, and Ridge coefficient about 0.385 with interval 0.208 to 0.763.</w:t>
+      </w:r>
+    </w:p>
+    <w:p>
+      <w:pPr>
+        <w:ind w:left="360"/>
+      </w:pPr>
+      <w:r>
+        <w:t>The VIF values for social-economic and infrastructure CVI are about 4.85 and 4.81, confirming moderate collinearity. This is why the report should describe CVI results as suggestive and model-sensitive, while treating severe weather as the most robust signal.</w:t>
+      </w:r>
+    </w:p>
+    <w:p>
+      <w:pPr>
+        <w:pStyle w:val="Heading1"/>
+      </w:pPr>
+      <w:r>
+        <w:t>Part 10 and Part 10b: Duration and Resilience Models</w:t>
+      </w:r>
+    </w:p>
+    <w:p>
+      <w:r>
+        <w:t>Parts 10 and 10b separate outage frequency from outage resilience. Frequency asks whether outages occur more often. Duration asks whether outages last longer once they occur. This distinction matters because high-burden communities may be affected through restoration time rather than event count alone.</w:t>
+      </w:r>
+    </w:p>
+    <w:tbl>
+      <w:tblPr>
+        <w:tblStyle w:val="TableGrid"/>
+        <w:tblW w:type="auto" w:w="0"/>
+        <w:tblLook w:firstColumn="1" w:firstRow="1" w:lastColumn="0" w:lastRow="0" w:noHBand="0" w:noVBand="1" w:val="04A0"/>
+      </w:tblPr>
+      <w:tblGrid>
+        <w:gridCol w:w="3312"/>
+        <w:gridCol w:w="3312"/>
+        <w:gridCol w:w="3312"/>
+      </w:tblGrid>
+      <w:tr>
+        <w:tc>
+          <w:tcPr>
+            <w:tcW w:type="dxa" w:w="3312"/>
+          </w:tcPr>
+          <w:p>
+            <w:r>
+              <w:rPr>
+                <w:rFonts w:ascii="Arial" w:hAnsi="Arial"/>
+                <w:sz w:val="17"/>
+              </w:rPr>
+              <w:t>Outcome family</w:t>
+            </w:r>
+          </w:p>
+        </w:tc>
+        <w:tc>
+          <w:tcPr>
+            <w:tcW w:type="dxa" w:w="3312"/>
+          </w:tcPr>
+          <w:p>
+            <w:r>
+              <w:rPr>
+                <w:rFonts w:ascii="Arial" w:hAnsi="Arial"/>
+                <w:sz w:val="17"/>
+              </w:rPr>
+              <w:t>Methodology</w:t>
+            </w:r>
+          </w:p>
+        </w:tc>
+        <w:tc>
+          <w:tcPr>
+            <w:tcW w:type="dxa" w:w="3312"/>
+          </w:tcPr>
+          <w:p>
+            <w:r>
+              <w:rPr>
+                <w:rFonts w:ascii="Arial" w:hAnsi="Arial"/>
+                <w:sz w:val="17"/>
+              </w:rPr>
+              <w:t>Main interpretation</w:t>
             </w:r>
           </w:p>
         </w:tc>
@@ -1319,7 +1182,7 @@
       <w:tr>
         <w:tc>
           <w:tcPr>
-            <w:tcW w:type="dxa" w:w="3360"/>
+            <w:tcW w:type="dxa" w:w="3312"/>
           </w:tcPr>
           <w:p>
             <w:r>
@@ -1327,13 +1190,13 @@
                 <w:rFonts w:ascii="Arial" w:hAnsi="Arial"/>
                 <w:sz w:val="17"/>
               </w:rPr>
-              <w:t>2018</w:t>
+              <w:t>County-year duration</w:t>
             </w:r>
           </w:p>
         </w:tc>
         <w:tc>
           <w:tcPr>
-            <w:tcW w:type="dxa" w:w="3360"/>
+            <w:tcW w:type="dxa" w:w="3312"/>
           </w:tcPr>
           <w:p>
             <w:r>
@@ -1341,13 +1204,13 @@
                 <w:rFonts w:ascii="Arial" w:hAnsi="Arial"/>
                 <w:sz w:val="17"/>
               </w:rPr>
-              <w:t>March</w:t>
+              <w:t>Median duration, p90 duration, share above 8 hours, and share above 24 hours.</w:t>
             </w:r>
           </w:p>
         </w:tc>
         <w:tc>
           <w:tcPr>
-            <w:tcW w:type="dxa" w:w="3360"/>
+            <w:tcW w:type="dxa" w:w="3312"/>
           </w:tcPr>
           <w:p>
             <w:r>
@@ -1355,7 +1218,7 @@
                 <w:rFonts w:ascii="Arial" w:hAnsi="Arial"/>
                 <w:sz w:val="17"/>
               </w:rPr>
-              <w:t>241,848</w:t>
+              <w:t>Useful but limited by small county-year sample.</w:t>
             </w:r>
           </w:p>
         </w:tc>
@@ -1363,7 +1226,7 @@
       <w:tr>
         <w:tc>
           <w:tcPr>
-            <w:tcW w:type="dxa" w:w="3360"/>
+            <w:tcW w:type="dxa" w:w="3312"/>
           </w:tcPr>
           <w:p>
             <w:r>
@@ -1371,13 +1234,13 @@
                 <w:rFonts w:ascii="Arial" w:hAnsi="Arial"/>
                 <w:sz w:val="17"/>
               </w:rPr>
-              <w:t>2019</w:t>
+              <w:t>Event-level log duration</w:t>
             </w:r>
           </w:p>
         </w:tc>
         <w:tc>
           <w:tcPr>
-            <w:tcW w:type="dxa" w:w="3360"/>
+            <w:tcW w:type="dxa" w:w="3312"/>
           </w:tcPr>
           <w:p>
             <w:r>
@@ -1385,13 +1248,13 @@
                 <w:rFonts w:ascii="Arial" w:hAnsi="Arial"/>
                 <w:sz w:val="17"/>
               </w:rPr>
-              <w:t>July</w:t>
+              <w:t>OLS and clustered/sensitivity specifications on deduplicated outage events.</w:t>
             </w:r>
           </w:p>
         </w:tc>
         <w:tc>
           <w:tcPr>
-            <w:tcW w:type="dxa" w:w="3360"/>
+            <w:tcW w:type="dxa" w:w="3312"/>
           </w:tcPr>
           <w:p>
             <w:r>
@@ -1399,7 +1262,7 @@
                 <w:rFonts w:ascii="Arial" w:hAnsi="Arial"/>
                 <w:sz w:val="17"/>
               </w:rPr>
-              <w:t>74,972</w:t>
+              <w:t>Stronger duration evidence because the event is the unit of analysis.</w:t>
             </w:r>
           </w:p>
         </w:tc>
@@ -1407,7 +1270,7 @@
       <w:tr>
         <w:tc>
           <w:tcPr>
-            <w:tcW w:type="dxa" w:w="3360"/>
+            <w:tcW w:type="dxa" w:w="3312"/>
           </w:tcPr>
           <w:p>
             <w:r>
@@ -1415,13 +1278,13 @@
                 <w:rFonts w:ascii="Arial" w:hAnsi="Arial"/>
                 <w:sz w:val="17"/>
               </w:rPr>
-              <w:t>2020</w:t>
+              <w:t>Severe outage probability</w:t>
             </w:r>
           </w:p>
         </w:tc>
         <w:tc>
           <w:tcPr>
-            <w:tcW w:type="dxa" w:w="3360"/>
+            <w:tcW w:type="dxa" w:w="3312"/>
           </w:tcPr>
           <w:p>
             <w:r>
@@ -1429,13 +1292,13 @@
                 <w:rFonts w:ascii="Arial" w:hAnsi="Arial"/>
                 <w:sz w:val="17"/>
               </w:rPr>
-              <w:t>July</w:t>
+              <w:t>Logistic or GEE-style binary models for long/severe outage outcomes.</w:t>
             </w:r>
           </w:p>
         </w:tc>
         <w:tc>
           <w:tcPr>
-            <w:tcW w:type="dxa" w:w="3360"/>
+            <w:tcW w:type="dxa" w:w="3312"/>
           </w:tcPr>
           <w:p>
             <w:r>
@@ -1443,7 +1306,7 @@
                 <w:rFonts w:ascii="Arial" w:hAnsi="Arial"/>
                 <w:sz w:val="17"/>
               </w:rPr>
-              <w:t>62,749</w:t>
+              <w:t>Appropriate for binary severe-outage indicators.</w:t>
             </w:r>
           </w:p>
         </w:tc>
@@ -1451,7 +1314,7 @@
       <w:tr>
         <w:tc>
           <w:tcPr>
-            <w:tcW w:type="dxa" w:w="3360"/>
+            <w:tcW w:type="dxa" w:w="3312"/>
           </w:tcPr>
           <w:p>
             <w:r>
@@ -1459,13 +1322,13 @@
                 <w:rFonts w:ascii="Arial" w:hAnsi="Arial"/>
                 <w:sz w:val="17"/>
               </w:rPr>
-              <w:t>2021</w:t>
+              <w:t>Customer-hours</w:t>
             </w:r>
           </w:p>
         </w:tc>
         <w:tc>
           <w:tcPr>
-            <w:tcW w:type="dxa" w:w="3360"/>
+            <w:tcW w:type="dxa" w:w="3312"/>
           </w:tcPr>
           <w:p>
             <w:r>
@@ -1473,13 +1336,13 @@
                 <w:rFonts w:ascii="Arial" w:hAnsi="Arial"/>
                 <w:sz w:val="17"/>
               </w:rPr>
-              <w:t>February</w:t>
+              <w:t>Event-level customer impact multiplied by duration.</w:t>
             </w:r>
           </w:p>
         </w:tc>
         <w:tc>
           <w:tcPr>
-            <w:tcW w:type="dxa" w:w="3360"/>
+            <w:tcW w:type="dxa" w:w="3312"/>
           </w:tcPr>
           <w:p>
             <w:r>
@@ -1487,116 +1350,43 @@
                 <w:rFonts w:ascii="Arial" w:hAnsi="Arial"/>
                 <w:sz w:val="17"/>
               </w:rPr>
-              <w:t>56,325</w:t>
-            </w:r>
-          </w:p>
-        </w:tc>
-      </w:tr>
-      <w:tr>
-        <w:tc>
-          <w:tcPr>
-            <w:tcW w:type="dxa" w:w="3360"/>
-          </w:tcPr>
-          <w:p>
-            <w:r>
-              <w:rPr>
-                <w:rFonts w:ascii="Arial" w:hAnsi="Arial"/>
-                <w:sz w:val="17"/>
-              </w:rPr>
-              <w:t>2022</w:t>
-            </w:r>
-          </w:p>
-        </w:tc>
-        <w:tc>
-          <w:tcPr>
-            <w:tcW w:type="dxa" w:w="3360"/>
-          </w:tcPr>
-          <w:p>
-            <w:r>
-              <w:rPr>
-                <w:rFonts w:ascii="Arial" w:hAnsi="Arial"/>
-                <w:sz w:val="17"/>
-              </w:rPr>
-              <w:t>April</w:t>
-            </w:r>
-          </w:p>
-        </w:tc>
-        <w:tc>
-          <w:tcPr>
-            <w:tcW w:type="dxa" w:w="3360"/>
-          </w:tcPr>
-          <w:p>
-            <w:r>
-              <w:rPr>
-                <w:rFonts w:ascii="Arial" w:hAnsi="Arial"/>
-                <w:sz w:val="17"/>
-              </w:rPr>
-              <w:t>123,690</w:t>
-            </w:r>
-          </w:p>
-        </w:tc>
-      </w:tr>
-      <w:tr>
-        <w:tc>
-          <w:tcPr>
-            <w:tcW w:type="dxa" w:w="3360"/>
-          </w:tcPr>
-          <w:p>
-            <w:r>
-              <w:rPr>
-                <w:rFonts w:ascii="Arial" w:hAnsi="Arial"/>
-                <w:sz w:val="17"/>
-              </w:rPr>
-              <w:t>2023</w:t>
-            </w:r>
-          </w:p>
-        </w:tc>
-        <w:tc>
-          <w:tcPr>
-            <w:tcW w:type="dxa" w:w="3360"/>
-          </w:tcPr>
-          <w:p>
-            <w:r>
-              <w:rPr>
-                <w:rFonts w:ascii="Arial" w:hAnsi="Arial"/>
-                <w:sz w:val="17"/>
-              </w:rPr>
-              <w:t>July</w:t>
-            </w:r>
-          </w:p>
-        </w:tc>
-        <w:tc>
-          <w:tcPr>
-            <w:tcW w:type="dxa" w:w="3360"/>
-          </w:tcPr>
-          <w:p>
-            <w:r>
-              <w:rPr>
-                <w:rFonts w:ascii="Arial" w:hAnsi="Arial"/>
-                <w:sz w:val="17"/>
-              </w:rPr>
-              <w:t>37,758</w:t>
+              <w:t>Captures both outage length and affected customers.</w:t>
             </w:r>
           </w:p>
         </w:tc>
       </w:tr>
     </w:tbl>
     <w:p>
-      <w:pPr>
-        <w:pStyle w:val="Heading1"/>
-      </w:pPr>
       <w:r>
-        <w:t>Part 4: Effect-Size Visualizations and Robust Spearman Checks</w:t>
+        <w:t>Severe weather is the most consistent predictor of longer duration and larger customer-hour impacts. CVI duration evidence is weaker and more model-sensitive, although social-economic CVI remains the most plausible vulnerability channel.</w:t>
       </w:r>
     </w:p>
     <w:p>
+      <w:pPr/>
       <w:r>
-        <w:t>Methodology. Part 4 visualizes the Part 1-3 results and repeats the severe-weather analysis with rank-based Spearman correlations, which are more robust to skew and zero inflation than tract-level OLS.</w:t>
+        <w:rPr>
+          <w:b/>
+        </w:rPr>
+        <w:t xml:space="preserve">Findings: </w:t>
+      </w:r>
+      <w:r>
+        <w:t>The county-year duration models do not show a stable social-economic CVI effect for median duration, 90th-percentile duration, outages longer than 8 hours, or outages longer than 24 hours. Severe-weather share is significant for 90th-percentile duration (coef. about 0.371, p = 0.020), which suggests weather is more important for extreme duration than for typical duration.</w:t>
       </w:r>
     </w:p>
     <w:p>
+      <w:pPr>
+        <w:ind w:left="360"/>
+      </w:pPr>
       <w:r>
-        <w:t>Findings. The Spearman results confirm the severe-weather occurrence signal: 1,008 of 2,168 tracts are significant at FDR 0.05 and 669 are significant at FDR 0.01. Median occurrence rho is about 0.688. No tracts show a significant duration relationship after FDR correction, and median duration rho is only about 0.088. Month effects are significant in all 10 years.</w:t>
+        <w:t>The event-level models provide the strongest duration evidence. Across 4,518 outage events, severe-weather events have significantly longer log duration (coef. about 0.446, p &lt; 0.001) and much larger customer-hour impacts (coef. about 1.506, p &lt; 0.001).</w:t>
+      </w:r>
+    </w:p>
+    <w:p>
+      <w:pPr>
+        <w:ind w:left="360"/>
+      </w:pPr>
+      <w:r>
+        <w:t>Event-level social-economic CVI is not significant in ordinary OLS (coef. about 0.042, p = 0.728), but the Ridge sensitivity check gives a small positive coefficient with an interval barely above zero. This supports a cautious statement: social vulnerability may matter for resilience, but the evidence is weaker than the severe-weather effect.</w:t>
       </w:r>
     </w:p>
     <w:p>
@@ -1604,179 +1394,56 @@
         <w:pStyle w:val="Heading1"/>
       </w:pPr>
       <w:r>
-        <w:t>Part 5: Month-by-Month Trends Over Years</w:t>
+        <w:t>Part 11: Robustness Summary</w:t>
       </w:r>
     </w:p>
     <w:p>
       <w:r>
-        <w:t>Methodology. Part 5 tests whether each calendar month has an increasing or decreasing trend across years using Kendall tau and Theil-Sen slopes for outage occurrence and duration.</w:t>
-      </w:r>
-    </w:p>
-    <w:p>
-      <w:r>
-        <w:t>Findings. No month has a significant occurrence trend after FDR correction. Duration trends are mostly insignificant as well, with January showing a significant negative log-duration trend. This means seasonality is strong within years, but month-specific long-run trends are not robust over 2014-2023.</w:t>
+        <w:t>Part 11 compares results across county-year frequency, county-year duration, event-level OLS, and event-level Ridge specifications. This section is important because it prevents the analysis from relying on a single model specification.</w:t>
       </w:r>
     </w:p>
     <w:p>
       <w:pPr>
-        <w:pStyle w:val="Heading1"/>
+        <w:pStyle w:val="ListBullet"/>
       </w:pPr>
       <w:r>
-        <w:t>Part 6: Tract Seasonality Clustering</w:t>
-      </w:r>
-    </w:p>
-    <w:p>
-      <w:r>
-        <w:t>Methodology. Part 6 clusters tracts by their monthly outage-share profiles, with the number of clusters selected using a silhouette scan.</w:t>
-      </w:r>
-    </w:p>
-    <w:p>
-      <w:r>
-        <w:t>Findings. The cluster sizes are 111, 1,008, 288, and 761 tracts. Top months differ by cluster: one cluster peaks in August and July, another in March and July, another in August and February, and another in January and July. However, the later Part 8b diagnostic shows these profiles mostly correspond to the five county-level monthly profiles rather than independent tract-level seasonality. Part 6 should therefore be described as county-pattern profiling, not true tract-level clustering.</w:t>
+        <w:t>Methodology: compare coefficient direction, interval coverage, and model level across specifications.</w:t>
       </w:r>
     </w:p>
     <w:p>
       <w:pPr>
-        <w:pStyle w:val="Heading1"/>
+        <w:pStyle w:val="ListBullet"/>
       </w:pPr>
       <w:r>
-        <w:t>Part 7: CVI Variables and Exploratory Tract-Year Regressions</w:t>
-      </w:r>
-    </w:p>
-    <w:p>
-      <w:r>
-        <w:t>Methodology. Part 7 merges CVI variables into the tract-year panel and explores relationships between outage trends and vulnerability indicators, including overall CVI, social-economic CVI, infrastructure CVI, and climate/extreme-events CVI.</w:t>
-      </w:r>
-    </w:p>
-    <w:p>
-      <w:r>
-        <w:t>Findings. The section is useful for visualization and hypothesis generation, but it should not be used for final inference. Part 8 shows that tract-level outcomes have no within-county-year variation, so tract-level CVI regressions inflate sample size and understate uncertainty.</w:t>
+        <w:t>Main finding: severe weather is robust across model families; social-economic CVI is the clearest vulnerability signal but not uniformly significant.</w:t>
       </w:r>
     </w:p>
     <w:p>
       <w:pPr>
-        <w:pStyle w:val="Heading1"/>
+        <w:pStyle w:val="ListBullet"/>
       </w:pPr>
       <w:r>
-        <w:t>Part 8a: Data-Structure Check and County-Year Panel</w:t>
+        <w:t>Recommended language: describe CVI findings as policy-relevant and directional rather than definitive across every outcome.</w:t>
       </w:r>
     </w:p>
     <w:p>
+      <w:pPr/>
       <w:r>
-        <w:t>Methodology. Part 8a tests whether outage outcomes vary across tracts within the same county-year and then builds a balanced county-year panel with county-level CVI summaries.</w:t>
+        <w:rPr>
+          <w:b/>
+        </w:rPr>
+        <w:t xml:space="preserve">Findings: </w:t>
       </w:r>
-    </w:p>
-    <w:p>
       <w:r>
-        <w:t>Findings. This is the central methodological finding: in all 47 observed county-year cells, outage occurrence, mean duration, and severe-weather count each have exactly one unique value across tracts. The share of county-year cells with identical occurrence, duration, and severe-weather values is 100%. This means the correct inferential level for CVI-linked outage outcomes is county-year or county-month, not tract-year.</w:t>
+        <w:t>The robustness table supports the final wording. Social-economic CVI is positive in the county-year frequency OLS, county-year frequency Ridge, event-level OLS, and event-level Ridge models, but most intervals cross zero. It is negative and near zero in the county-year duration OLS model.</w:t>
       </w:r>
     </w:p>
     <w:p>
       <w:pPr>
-        <w:pStyle w:val="Heading1"/>
+        <w:ind w:left="360"/>
       </w:pPr>
       <w:r>
-        <w:t>Part 8b: Model Upgrade Check</w:t>
-      </w:r>
-    </w:p>
-    <w:p>
-      <w:r>
-        <w:t>Methodology. Part 8b compares model families for count outcomes and tests whether county-month seasonality models improve on earlier tests. It also checks whether clustering reflects tract or county profiles.</w:t>
-      </w:r>
-    </w:p>
-    <w:p>
-      <w:r>
-        <w:t>Findings. The Poisson county-year count model is highly overdispersed, with overdispersion about 41.7 and AIC about 2,297. Negative Binomial fits much better, with AIC about 551 for the comparable county-year count model. In the 600-cell county-month panel, adding month effects improves Negative Binomial AIC from 3,277 to 3,227, and month effects are strongly supported with likelihood-ratio p approximately 5.44e-11. This confirms both overdispersion and seasonality.</w:t>
-      </w:r>
-    </w:p>
-    <w:p>
-      <w:pPr>
-        <w:pStyle w:val="Heading1"/>
-      </w:pPr>
-      <w:r>
-        <w:t>Part 9: Clean CVI Model Family</w:t>
-      </w:r>
-    </w:p>
-    <w:p>
-      <w:r>
-        <w:t>Methodology. Part 9 fits one CVI concept at a time to reduce multicollinearity. It estimates OLS models on log outage occurrence and Poisson count models using county-year data.</w:t>
-      </w:r>
-    </w:p>
-    <w:p>
-      <w:r>
-        <w:t>Findings. Overall CVI and social-economic CVI are positive in both OLS and Poisson models. Social-economic CVI is the clearest positive signal: OLS coefficient 0.444 with p=0.0077, and Poisson IRR about 1.18. Overall CVI has Poisson IRR about 1.13. Climate-extreme-events CVI has a negative sign, with Poisson IRR about 0.69, so it should be treated as a modeling caution rather than a policy headline. Severe-weather count remains positive and highly significant in the clean models.</w:t>
-      </w:r>
-    </w:p>
-    <w:p>
-      <w:pPr>
-        <w:pStyle w:val="Heading1"/>
-      </w:pPr>
-      <w:r>
-        <w:t>Part 9b: Theory-Driven CVI Selection and Ridge Regression</w:t>
-      </w:r>
-    </w:p>
-    <w:p>
-      <w:r>
-        <w:t>Methodology. Part 9b uses social-economic CVI, infrastructure CVI, and severe-weather count in comparable OLS and Ridge specifications. VIF is used to assess predictor collinearity.</w:t>
-      </w:r>
-    </w:p>
-    <w:p>
-      <w:r>
-        <w:t>Findings. Severe-weather count is the most stable predictor in the theory-driven model. Its OLS coefficient is 0.389, with a confidence interval from 0.137 to 0.641, and Ridge gives a similar coefficient of 0.385. Social-economic CVI and infrastructure CVI are both positive in OLS and Ridge, but their intervals cross zero. VIF values for social-economic and infrastructure CVI are about 4.85 and 4.81, indicating moderate collinearity.</w:t>
-      </w:r>
-    </w:p>
-    <w:p>
-      <w:pPr>
-        <w:pStyle w:val="Heading1"/>
-      </w:pPr>
-      <w:r>
-        <w:t>Part 10: Duration-Focused County-Year Models</w:t>
-      </w:r>
-    </w:p>
-    <w:p>
-      <w:r>
-        <w:t>Methodology. Part 10 models county-year duration outcomes, including median duration, p90 duration, share above 8 hours, and share above 24 hours, while controlling for severe-weather share, customer impact, year, and CVI.</w:t>
-      </w:r>
-    </w:p>
-    <w:p>
-      <w:r>
-        <w:t>Findings. At the county-year level, CVI duration results are weak and inconsistent. Social-economic CVI is not significant for median duration, p90 duration, share above 8 hours, or share above 24 hours. Severe-weather share is significant for p90 duration, with coefficient 0.371 and p=0.0197, but not for all duration outcomes. Customer impact is significant in several duration specifications. The county-year duration evidence therefore supports weather and customer impact more clearly than CVI.</w:t>
-      </w:r>
-    </w:p>
-    <w:p>
-      <w:pPr>
-        <w:pStyle w:val="Heading1"/>
-      </w:pPr>
-      <w:r>
-        <w:t>Part 10b: Event-Level Duration Models</w:t>
-      </w:r>
-    </w:p>
-    <w:p>
-      <w:r>
-        <w:t>Methodology. Part 10b uses 4,518 deduplicated outage events and fits clustered OLS, GEE logistic, Ridge, and customer-hour models. County-level vulnerability summaries are merged to event records.</w:t>
-      </w:r>
-    </w:p>
-    <w:p>
-      <w:r>
-        <w:t>Findings. Severe weather is the clearest event-level duration predictor. In event-level OLS, severe-weather flag has coefficient 0.446 on log duration with p&lt;0.001. In customer-hour OLS, severe weather has coefficient 1.506 with p&lt;0.001. Social-economic CVI is positive but not significant in clustered OLS; Ridge gives a small positive social-economic CVI coefficient of 0.043 with an interval just above zero. Infrastructure CVI is not supported in the event-level duration models.</w:t>
-      </w:r>
-    </w:p>
-    <w:p>
-      <w:pPr>
-        <w:pStyle w:val="Heading1"/>
-      </w:pPr>
-      <w:r>
-        <w:t>Part 11: Sensitivity and Robustness Summary</w:t>
-      </w:r>
-    </w:p>
-    <w:p>
-      <w:r>
-        <w:t>Methodology. Part 11 compares the same vulnerability concept across county-year frequency, county-year duration, event-level OLS, and event-level Ridge.</w:t>
-      </w:r>
-    </w:p>
-    <w:p>
-      <w:r>
-        <w:t>Findings. The robustness table shows that social-economic CVI is positive in county-year frequency OLS, county-year frequency Ridge, event-level OLS, and event-level Ridge, but only the event-level Ridge interval excludes zero. County-year duration OLS is slightly negative and not significant. The robust conclusion is directional rather than definitive: social-economic vulnerability may matter, but its evidence depends on model level and outcome.</w:t>
+        <w:t>Only the event-level Ridge version gives a positive social-economic CVI interval that excludes zero. Therefore, the notebook supports a careful interpretation of recurring positive direction, not a strong causal claim.</w:t>
       </w:r>
     </w:p>
     <w:p>
@@ -1789,12 +1456,59 @@
     </w:p>
     <w:p>
       <w:r>
-        <w:t>Methodology. Part 12 compares the frequency channel with the resilience channel and summarizes county-level patterns.</w:t>
+        <w:t>Part 12 synthesizes the frequency and duration evidence. The careful interpretation is that outage burden has a strong weather component and a more cautious vulnerability component. Social-economic vulnerability appears most relevant in the corrected county-month frequency model and in selected event-level duration sensitivity checks.</w:t>
       </w:r>
     </w:p>
     <w:p>
+      <w:pPr>
+        <w:pStyle w:val="ListBullet"/>
+      </w:pPr>
       <w:r>
-        <w:t>Findings. Queens has the highest mean outage occurrence at about 178.6 events per year, while Bronx has the highest social-economic CVI at about 0.761. Manhattan has the longest median event duration at 2.25 hours despite lower outage frequency. This shows that frequency and resilience are different mechanisms. The final interpretation should emphasize that severe weather drives outage burden most consistently, while social-economic vulnerability is a plausible but model-sensitive resilience and equity signal.</w:t>
+        <w:t>Strongest claim: severe weather is consistently associated with more severe outage outcomes.</w:t>
+      </w:r>
+    </w:p>
+    <w:p>
+      <w:pPr>
+        <w:pStyle w:val="ListBullet"/>
+      </w:pPr>
+      <w:r>
+        <w:t>Most credible CVI pattern: social-economic vulnerability is associated with higher outage frequency and may relate to longer restoration burden.</w:t>
+      </w:r>
+    </w:p>
+    <w:p>
+      <w:pPr>
+        <w:pStyle w:val="ListBullet"/>
+      </w:pPr>
+      <w:r>
+        <w:t>What not to claim: every CVI dimension predicts every outage outcome. Climate-extreme-events CVI, in particular, should be treated cautiously because its sign is not intuitive in some models.</w:t>
+      </w:r>
+    </w:p>
+    <w:p>
+      <w:pPr/>
+      <w:r>
+        <w:rPr>
+          <w:b/>
+        </w:rPr>
+        <w:t xml:space="preserve">Findings: </w:t>
+      </w:r>
+      <w:r>
+        <w:t>County summaries show that Queens has the highest mean outage occurrence, about 178.6, followed by Brooklyn at 104.0 and the Bronx at 86.5. Manhattan has the lowest mean outage occurrence, about 32.8, but has a higher median event duration than most boroughs.</w:t>
+      </w:r>
+    </w:p>
+    <w:p>
+      <w:pPr>
+        <w:ind w:left="360"/>
+      </w:pPr>
+      <w:r>
+        <w:t>The Bronx has the highest social-economic CVI among the five counties, about 0.761, while Brooklyn and Queens are also elevated at about 0.586 and 0.575. This helps explain why vulnerability and outage burden do not map perfectly onto each other: exposure, infrastructure, and event severity operate through different channels.</w:t>
+      </w:r>
+    </w:p>
+    <w:p>
+      <w:pPr>
+        <w:ind w:left="360"/>
+      </w:pPr>
+      <w:r>
+        <w:t>The final interpretation should separate frequency from resilience. Severe weather is the most consistent predictor across the notebook; social-economic vulnerability is a plausible equity signal, but it is more sensitive to model choice and aggregation level.</w:t>
       </w:r>
     </w:p>
     <w:p>
@@ -1802,18 +1516,61 @@
         <w:pStyle w:val="Heading1"/>
       </w:pPr>
       <w:r>
-        <w:t>Final Takeaway</w:t>
+        <w:t>Key Limitations</w:t>
       </w:r>
     </w:p>
     <w:p>
+      <w:pPr>
+        <w:pStyle w:val="ListBullet"/>
+      </w:pPr>
       <w:r>
-        <w:t>The notebook supports a clear weather and seasonality story and a more cautious vulnerability story. Severe weather and month effects are robust. Tract-level CVI inference is not supported because the outage outcomes repeat within county-year cells. The best final framing is that severe weather drives outage frequency and duration, while social-economic vulnerability may shape outage burden and restoration resilience, especially when analyzed at the corrected county-month or event level.</w:t>
+        <w:t>County-month models have approximately 600 observations (5 counties × 10 years × 12 months), so p-values and confidence intervals should be interpreted cautiously.</w:t>
+      </w:r>
+    </w:p>
+    <w:p>
+      <w:pPr>
+        <w:pStyle w:val="ListBullet"/>
+      </w:pPr>
+      <w:r>
+        <w:t>Only five counties are observed, which makes cross-sectional estimates sensitive to individual counties.</w:t>
+      </w:r>
+    </w:p>
+    <w:p>
+      <w:pPr>
+        <w:pStyle w:val="ListBullet"/>
+      </w:pPr>
+      <w:r>
+        <w:t>Tract-level regressions are exploratory because outage outcomes repeat within county-year cells.</w:t>
+      </w:r>
+    </w:p>
+    <w:p>
+      <w:pPr>
+        <w:pStyle w:val="ListBullet"/>
+      </w:pPr>
+      <w:r>
+        <w:t>Ridge models should be treated as sensitivity checks unless alpha is selected by cross-validation.</w:t>
+      </w:r>
+    </w:p>
+    <w:p>
+      <w:pPr>
+        <w:pStyle w:val="ListBullet"/>
+      </w:pPr>
+      <w:r>
+        <w:t>The severe-weather flag should be documented more fully, especially whether it is assigned at the event level or row level.</w:t>
+      </w:r>
+    </w:p>
+    <w:p>
+      <w:pPr>
+        <w:pStyle w:val="ListBullet"/>
+      </w:pPr>
+      <w:r>
+        <w:t>True tract-level inference would require more granular utility outage data or a data source where outage outcomes vary independently by tract.</w:t>
       </w:r>
     </w:p>
     <w:sectPr>
       <w:footerReference w:type="default" r:id="rId9"/>
       <w:pgSz w:w="12240" w:h="15840"/>
-      <w:pgMar w:top="936" w:right="1080" w:bottom="936" w:left="1080" w:header="720" w:footer="720" w:gutter="0"/>
+      <w:pgMar w:top="1008" w:right="1152" w:bottom="1008" w:left="1152" w:header="720" w:footer="720" w:gutter="0"/>
       <w:cols w:space="720"/>
       <w:docGrid w:linePitch="360"/>
     </w:sectPr>
@@ -1829,7 +1586,7 @@
       <w:jc w:val="center"/>
     </w:pPr>
     <w:r>
-      <w:t>NYC Power Outage EDA | Methods and Findings by Notebook Part</w:t>
+      <w:t>NYC Power Outage EDA | Methods and Results Summary by Notebook Part</w:t>
     </w:r>
   </w:p>
 </w:ftr>
@@ -2199,8 +1956,8 @@
     <w:qFormat/>
     <w:rsid w:val="00FC693F"/>
     <w:rPr>
-      <w:rFonts w:ascii="Arial" w:hAnsi="Arial"/>
-      <w:sz w:val="20"/>
+      <w:rFonts w:ascii="Times New Roman" w:hAnsi="Times New Roman"/>
+      <w:sz w:val="22"/>
     </w:rPr>
   </w:style>
   <w:style w:type="paragraph" w:styleId="Header">
@@ -2262,7 +2019,7 @@
       <w:outlineLvl w:val="0"/>
     </w:pPr>
     <w:rPr>
-      <w:rFonts w:asciiTheme="majorHAnsi" w:eastAsiaTheme="majorEastAsia" w:hAnsiTheme="majorHAnsi" w:cstheme="majorBidi" w:ascii="Arial" w:hAnsi="Arial"/>
+      <w:rFonts w:asciiTheme="majorHAnsi" w:eastAsiaTheme="majorEastAsia" w:hAnsiTheme="majorHAnsi" w:cstheme="majorBidi" w:ascii="Times New Roman" w:hAnsi="Times New Roman"/>
       <w:b/>
       <w:bCs/>
       <w:color w:val="365F91" w:themeColor="accent1" w:themeShade="BF"/>
@@ -2286,7 +2043,7 @@
       <w:outlineLvl w:val="1"/>
     </w:pPr>
     <w:rPr>
-      <w:rFonts w:asciiTheme="majorHAnsi" w:eastAsiaTheme="majorEastAsia" w:hAnsiTheme="majorHAnsi" w:cstheme="majorBidi" w:ascii="Arial" w:hAnsi="Arial"/>
+      <w:rFonts w:asciiTheme="majorHAnsi" w:eastAsiaTheme="majorEastAsia" w:hAnsiTheme="majorHAnsi" w:cstheme="majorBidi" w:ascii="Times New Roman" w:hAnsi="Times New Roman"/>
       <w:b/>
       <w:bCs/>
       <w:color w:val="4F81BD" w:themeColor="accent1"/>
@@ -2310,7 +2067,7 @@
       <w:outlineLvl w:val="2"/>
     </w:pPr>
     <w:rPr>
-      <w:rFonts w:asciiTheme="majorHAnsi" w:eastAsiaTheme="majorEastAsia" w:hAnsiTheme="majorHAnsi" w:cstheme="majorBidi"/>
+      <w:rFonts w:asciiTheme="majorHAnsi" w:eastAsiaTheme="majorEastAsia" w:hAnsiTheme="majorHAnsi" w:cstheme="majorBidi" w:ascii="Times New Roman" w:hAnsi="Times New Roman"/>
       <w:b/>
       <w:bCs/>
       <w:color w:val="4F81BD" w:themeColor="accent1"/>
@@ -2551,11 +2308,11 @@
       <w:contextualSpacing/>
     </w:pPr>
     <w:rPr>
-      <w:rFonts w:asciiTheme="majorHAnsi" w:eastAsiaTheme="majorEastAsia" w:hAnsiTheme="majorHAnsi" w:cstheme="majorBidi" w:ascii="Arial" w:hAnsi="Arial"/>
+      <w:rFonts w:asciiTheme="majorHAnsi" w:eastAsiaTheme="majorEastAsia" w:hAnsiTheme="majorHAnsi" w:cstheme="majorBidi" w:ascii="Times New Roman" w:hAnsi="Times New Roman"/>
       <w:color w:val="17365D" w:themeColor="text2" w:themeShade="BF"/>
       <w:spacing w:val="5"/>
       <w:kern w:val="28"/>
-      <w:sz w:val="32"/>
+      <w:sz w:val="52"/>
       <w:szCs w:val="52"/>
     </w:rPr>
   </w:style>

</xml_diff>

<commit_message>
Add conclusions to EDA outage findings
</commit_message>
<xml_diff>
--- a/docs/EDA_Outage_Report.docx
+++ b/docs/EDA_Outage_Report.docx
@@ -4,10 +4,12 @@
   <w:body>
     <w:p>
       <w:pPr>
+        <w:spacing w:after="120"/>
         <w:jc w:val="center"/>
       </w:pPr>
       <w:r>
         <w:rPr>
+          <w:rFonts w:ascii="Times New Roman" w:hAnsi="Times New Roman"/>
           <w:b/>
           <w:sz w:val="32"/>
         </w:rPr>
@@ -16,10 +18,12 @@
     </w:p>
     <w:p>
       <w:pPr>
+        <w:spacing w:after="120"/>
         <w:jc w:val="center"/>
       </w:pPr>
       <w:r>
         <w:rPr>
+          <w:rFonts w:ascii="Times New Roman" w:hAnsi="Times New Roman"/>
           <w:i/>
           <w:sz w:val="22"/>
         </w:rPr>
@@ -27,1543 +31,1738 @@
       </w:r>
     </w:p>
     <w:p>
+      <w:pPr>
+        <w:spacing w:after="120"/>
+      </w:pPr>
       <w:r>
+        <w:rPr>
+          <w:rFonts w:ascii="Times New Roman" w:hAnsi="Times New Roman"/>
+          <w:sz w:val="22"/>
+        </w:rPr>
         <w:t>This document summarizes the analytical workflow used to examine New York City power outage burden from 2014 to 2023. The analysis links outage events with county and tract geography, severe-weather indicators, customer impact measures, outage duration, and Climate Vulnerability Index (CVI) variables. The purpose is to describe how outage frequency and duration vary over time and geography, and to evaluate whether social vulnerability is associated with outage burden after accounting for weather, seasonality, and data structure.</w:t>
       </w:r>
     </w:p>
     <w:p>
       <w:pPr>
         <w:pStyle w:val="Heading1"/>
+        <w:spacing w:after="120"/>
       </w:pPr>
       <w:r>
+        <w:rPr>
+          <w:rFonts w:ascii="Times New Roman" w:hAnsi="Times New Roman"/>
+          <w:sz w:val="22"/>
+        </w:rPr>
         <w:t>Study Scope</w:t>
       </w:r>
     </w:p>
-    <w:tbl>
-      <w:tblPr>
-        <w:tblStyle w:val="TableGrid"/>
-        <w:tblW w:type="auto" w:w="0"/>
-        <w:tblLook w:firstColumn="1" w:firstRow="1" w:lastColumn="0" w:lastRow="0" w:noHBand="0" w:noVBand="1" w:val="04A0"/>
-      </w:tblPr>
-      <w:tblGrid>
-        <w:gridCol w:w="4968"/>
-        <w:gridCol w:w="4968"/>
-      </w:tblGrid>
-      <w:tr>
-        <w:tc>
-          <w:tcPr>
-            <w:tcW w:type="dxa" w:w="4968"/>
-          </w:tcPr>
-          <w:p>
-            <w:r>
-              <w:rPr>
-                <w:rFonts w:ascii="Arial" w:hAnsi="Arial"/>
-                <w:sz w:val="17"/>
-              </w:rPr>
-              <w:t>Item</w:t>
-            </w:r>
-          </w:p>
-        </w:tc>
-        <w:tc>
-          <w:tcPr>
-            <w:tcW w:type="dxa" w:w="4968"/>
-          </w:tcPr>
-          <w:p>
-            <w:r>
-              <w:rPr>
-                <w:rFonts w:ascii="Arial" w:hAnsi="Arial"/>
-                <w:sz w:val="17"/>
-              </w:rPr>
-              <w:t>Specification</w:t>
-            </w:r>
-          </w:p>
-        </w:tc>
-      </w:tr>
-      <w:tr>
-        <w:tc>
-          <w:tcPr>
-            <w:tcW w:type="dxa" w:w="4968"/>
-          </w:tcPr>
-          <w:p>
-            <w:r>
-              <w:rPr>
-                <w:rFonts w:ascii="Arial" w:hAnsi="Arial"/>
-                <w:sz w:val="17"/>
-              </w:rPr>
-              <w:t>Study window</w:t>
-            </w:r>
-          </w:p>
-        </w:tc>
-        <w:tc>
-          <w:tcPr>
-            <w:tcW w:type="dxa" w:w="4968"/>
-          </w:tcPr>
-          <w:p>
-            <w:r>
-              <w:rPr>
-                <w:rFonts w:ascii="Arial" w:hAnsi="Arial"/>
-                <w:sz w:val="17"/>
-              </w:rPr>
-              <w:t>2014-2023</w:t>
-            </w:r>
-          </w:p>
-        </w:tc>
-      </w:tr>
-      <w:tr>
-        <w:tc>
-          <w:tcPr>
-            <w:tcW w:type="dxa" w:w="4968"/>
-          </w:tcPr>
-          <w:p>
-            <w:r>
-              <w:rPr>
-                <w:rFonts w:ascii="Arial" w:hAnsi="Arial"/>
-                <w:sz w:val="17"/>
-              </w:rPr>
-              <w:t>Geography</w:t>
-            </w:r>
-          </w:p>
-        </w:tc>
-        <w:tc>
-          <w:tcPr>
-            <w:tcW w:type="dxa" w:w="4968"/>
-          </w:tcPr>
-          <w:p>
-            <w:r>
-              <w:rPr>
-                <w:rFonts w:ascii="Arial" w:hAnsi="Arial"/>
-                <w:sz w:val="17"/>
-              </w:rPr>
-              <w:t>NYC five counties: Bronx, Brooklyn, Manhattan, Queens, Staten Island</w:t>
-            </w:r>
-          </w:p>
-        </w:tc>
-      </w:tr>
-      <w:tr>
-        <w:tc>
-          <w:tcPr>
-            <w:tcW w:type="dxa" w:w="4968"/>
-          </w:tcPr>
-          <w:p>
-            <w:r>
-              <w:rPr>
-                <w:rFonts w:ascii="Arial" w:hAnsi="Arial"/>
-                <w:sz w:val="17"/>
-              </w:rPr>
-              <w:t>Primary source</w:t>
-            </w:r>
-          </w:p>
-        </w:tc>
-        <w:tc>
-          <w:tcPr>
-            <w:tcW w:type="dxa" w:w="4968"/>
-          </w:tcPr>
-          <w:p>
-            <w:r>
-              <w:rPr>
-                <w:rFonts w:ascii="Arial" w:hAnsi="Arial"/>
-                <w:sz w:val="17"/>
-              </w:rPr>
-              <w:t>Merged outage event file with CVI indicators and severe-weather flags</w:t>
-            </w:r>
-          </w:p>
-        </w:tc>
-      </w:tr>
-      <w:tr>
-        <w:tc>
-          <w:tcPr>
-            <w:tcW w:type="dxa" w:w="4968"/>
-          </w:tcPr>
-          <w:p>
-            <w:r>
-              <w:rPr>
-                <w:rFonts w:ascii="Arial" w:hAnsi="Arial"/>
-                <w:sz w:val="17"/>
-              </w:rPr>
-              <w:t>Exploratory unit</w:t>
-            </w:r>
-          </w:p>
-        </w:tc>
-        <w:tc>
-          <w:tcPr>
-            <w:tcW w:type="dxa" w:w="4968"/>
-          </w:tcPr>
-          <w:p>
-            <w:r>
-              <w:rPr>
-                <w:rFonts w:ascii="Arial" w:hAnsi="Arial"/>
-                <w:sz w:val="17"/>
-              </w:rPr>
-              <w:t>Census tract-year and tract-month summaries</w:t>
-            </w:r>
-          </w:p>
-        </w:tc>
-      </w:tr>
-      <w:tr>
-        <w:tc>
-          <w:tcPr>
-            <w:tcW w:type="dxa" w:w="4968"/>
-          </w:tcPr>
-          <w:p>
-            <w:r>
-              <w:rPr>
-                <w:rFonts w:ascii="Arial" w:hAnsi="Arial"/>
-                <w:sz w:val="17"/>
-              </w:rPr>
-              <w:t>Main frequency unit</w:t>
-            </w:r>
-          </w:p>
-        </w:tc>
-        <w:tc>
-          <w:tcPr>
-            <w:tcW w:type="dxa" w:w="4968"/>
-          </w:tcPr>
-          <w:p>
-            <w:r>
-              <w:rPr>
-                <w:rFonts w:ascii="Arial" w:hAnsi="Arial"/>
-                <w:sz w:val="17"/>
-              </w:rPr>
-              <w:t>Balanced county-month panel with 600 observations</w:t>
-            </w:r>
-          </w:p>
-        </w:tc>
-      </w:tr>
-      <w:tr>
-        <w:tc>
-          <w:tcPr>
-            <w:tcW w:type="dxa" w:w="4968"/>
-          </w:tcPr>
-          <w:p>
-            <w:r>
-              <w:rPr>
-                <w:rFonts w:ascii="Arial" w:hAnsi="Arial"/>
-                <w:sz w:val="17"/>
-              </w:rPr>
-              <w:t>Duration unit</w:t>
-            </w:r>
-          </w:p>
-        </w:tc>
-        <w:tc>
-          <w:tcPr>
-            <w:tcW w:type="dxa" w:w="4968"/>
-          </w:tcPr>
-          <w:p>
-            <w:r>
-              <w:rPr>
-                <w:rFonts w:ascii="Arial" w:hAnsi="Arial"/>
-                <w:sz w:val="17"/>
-              </w:rPr>
-              <w:t>Deduplicated outage-event panel with approximately 4,500 events</w:t>
-            </w:r>
-          </w:p>
-        </w:tc>
-      </w:tr>
-      <w:tr>
-        <w:tc>
-          <w:tcPr>
-            <w:tcW w:type="dxa" w:w="4968"/>
-          </w:tcPr>
-          <w:p>
-            <w:r>
-              <w:rPr>
-                <w:rFonts w:ascii="Arial" w:hAnsi="Arial"/>
-                <w:sz w:val="17"/>
-              </w:rPr>
-              <w:t>Core methodological caution</w:t>
-            </w:r>
-          </w:p>
-        </w:tc>
-        <w:tc>
-          <w:tcPr>
-            <w:tcW w:type="dxa" w:w="4968"/>
-          </w:tcPr>
-          <w:p>
-            <w:r>
-              <w:rPr>
-                <w:rFonts w:ascii="Arial" w:hAnsi="Arial"/>
-                <w:sz w:val="17"/>
-              </w:rPr>
-              <w:t>Tract-level rows are useful for mapping, but outage outcomes repeat within county-year cells; final inference should not rely on false tract-level precision.</w:t>
-            </w:r>
-          </w:p>
-        </w:tc>
-      </w:tr>
-    </w:tbl>
     <w:p>
       <w:pPr>
+        <w:spacing w:after="120"/>
+      </w:pPr>
+      <w:r>
+        <w:rPr>
+          <w:rFonts w:ascii="Times New Roman" w:hAnsi="Times New Roman"/>
+          <w:b/>
+          <w:sz w:val="22"/>
+        </w:rPr>
+        <w:t>Study scope details:</w:t>
+      </w:r>
+    </w:p>
+    <w:p>
+      <w:pPr>
+        <w:spacing w:after="120"/>
+        <w:ind w:left="360"/>
+      </w:pPr>
+      <w:r>
+        <w:rPr>
+          <w:rFonts w:ascii="Times New Roman" w:hAnsi="Times New Roman"/>
+          <w:b/>
+          <w:sz w:val="22"/>
+        </w:rPr>
+        <w:t xml:space="preserve">Study window: </w:t>
+      </w:r>
+      <w:r>
+        <w:rPr>
+          <w:rFonts w:ascii="Times New Roman" w:hAnsi="Times New Roman"/>
+          <w:sz w:val="22"/>
+        </w:rPr>
+        <w:t>2014-2023</w:t>
+      </w:r>
+    </w:p>
+    <w:p>
+      <w:pPr>
+        <w:spacing w:after="120"/>
+        <w:ind w:left="360"/>
+      </w:pPr>
+      <w:r>
+        <w:rPr>
+          <w:rFonts w:ascii="Times New Roman" w:hAnsi="Times New Roman"/>
+          <w:b/>
+          <w:sz w:val="22"/>
+        </w:rPr>
+        <w:t xml:space="preserve">Geography: </w:t>
+      </w:r>
+      <w:r>
+        <w:rPr>
+          <w:rFonts w:ascii="Times New Roman" w:hAnsi="Times New Roman"/>
+          <w:sz w:val="22"/>
+        </w:rPr>
+        <w:t>NYC five counties: Bronx, Brooklyn, Manhattan, Queens, Staten Island</w:t>
+      </w:r>
+    </w:p>
+    <w:p>
+      <w:pPr>
+        <w:spacing w:after="120"/>
+        <w:ind w:left="360"/>
+      </w:pPr>
+      <w:r>
+        <w:rPr>
+          <w:rFonts w:ascii="Times New Roman" w:hAnsi="Times New Roman"/>
+          <w:b/>
+          <w:sz w:val="22"/>
+        </w:rPr>
+        <w:t xml:space="preserve">Primary source: </w:t>
+      </w:r>
+      <w:r>
+        <w:rPr>
+          <w:rFonts w:ascii="Times New Roman" w:hAnsi="Times New Roman"/>
+          <w:sz w:val="22"/>
+        </w:rPr>
+        <w:t>Merged outage event file with CVI indicators and severe-weather flags</w:t>
+      </w:r>
+    </w:p>
+    <w:p>
+      <w:pPr>
+        <w:spacing w:after="120"/>
+        <w:ind w:left="360"/>
+      </w:pPr>
+      <w:r>
+        <w:rPr>
+          <w:rFonts w:ascii="Times New Roman" w:hAnsi="Times New Roman"/>
+          <w:b/>
+          <w:sz w:val="22"/>
+        </w:rPr>
+        <w:t xml:space="preserve">Exploratory unit: </w:t>
+      </w:r>
+      <w:r>
+        <w:rPr>
+          <w:rFonts w:ascii="Times New Roman" w:hAnsi="Times New Roman"/>
+          <w:sz w:val="22"/>
+        </w:rPr>
+        <w:t>Census tract-year and tract-month summaries</w:t>
+      </w:r>
+    </w:p>
+    <w:p>
+      <w:pPr>
+        <w:spacing w:after="120"/>
+        <w:ind w:left="360"/>
+      </w:pPr>
+      <w:r>
+        <w:rPr>
+          <w:rFonts w:ascii="Times New Roman" w:hAnsi="Times New Roman"/>
+          <w:b/>
+          <w:sz w:val="22"/>
+        </w:rPr>
+        <w:t xml:space="preserve">Main frequency unit: </w:t>
+      </w:r>
+      <w:r>
+        <w:rPr>
+          <w:rFonts w:ascii="Times New Roman" w:hAnsi="Times New Roman"/>
+          <w:sz w:val="22"/>
+        </w:rPr>
+        <w:t>Balanced county-month panel with 600 observations</w:t>
+      </w:r>
+    </w:p>
+    <w:p>
+      <w:pPr>
+        <w:spacing w:after="120"/>
+        <w:ind w:left="360"/>
+      </w:pPr>
+      <w:r>
+        <w:rPr>
+          <w:rFonts w:ascii="Times New Roman" w:hAnsi="Times New Roman"/>
+          <w:b/>
+          <w:sz w:val="22"/>
+        </w:rPr>
+        <w:t xml:space="preserve">Duration unit: </w:t>
+      </w:r>
+      <w:r>
+        <w:rPr>
+          <w:rFonts w:ascii="Times New Roman" w:hAnsi="Times New Roman"/>
+          <w:sz w:val="22"/>
+        </w:rPr>
+        <w:t>Deduplicated outage-event panel with approximately 4,500 events</w:t>
+      </w:r>
+    </w:p>
+    <w:p>
+      <w:pPr>
+        <w:spacing w:after="120"/>
+        <w:ind w:left="360"/>
+      </w:pPr>
+      <w:r>
+        <w:rPr>
+          <w:rFonts w:ascii="Times New Roman" w:hAnsi="Times New Roman"/>
+          <w:b/>
+          <w:sz w:val="22"/>
+        </w:rPr>
+        <w:t xml:space="preserve">Core methodological caution: </w:t>
+      </w:r>
+      <w:r>
+        <w:rPr>
+          <w:rFonts w:ascii="Times New Roman" w:hAnsi="Times New Roman"/>
+          <w:sz w:val="22"/>
+        </w:rPr>
+        <w:t>Tract-level rows are useful for mapping, but outage outcomes repeat within county-year cells; final inference should not rely on false tract-level precision.</w:t>
+      </w:r>
+    </w:p>
+    <w:p>
+      <w:pPr>
         <w:pStyle w:val="Heading1"/>
+        <w:spacing w:after="120"/>
       </w:pPr>
       <w:r>
+        <w:rPr>
+          <w:rFonts w:ascii="Times New Roman" w:hAnsi="Times New Roman"/>
+          <w:sz w:val="22"/>
+        </w:rPr>
         <w:t>Part 0: Data Preparation and NYC Filter</w:t>
       </w:r>
     </w:p>
     <w:p>
+      <w:pPr>
+        <w:spacing w:after="120"/>
+      </w:pPr>
       <w:r>
+        <w:rPr>
+          <w:rFonts w:ascii="Times New Roman" w:hAnsi="Times New Roman"/>
+          <w:sz w:val="22"/>
+        </w:rPr>
         <w:t>Part 0 prepares the event-level outage/CVI file for analysis. County FIPS and tract FIPS are standardized, outage start times are parsed, years and months are extracted, outage duration is converted to numeric hours, and outage event types are used to create a severe-weather flag. The file is then restricted to the five NYC counties and the 2014-2023 study window.</w:t>
       </w:r>
     </w:p>
     <w:p>
       <w:pPr>
         <w:pStyle w:val="ListBullet"/>
+        <w:spacing w:after="120"/>
       </w:pPr>
       <w:r>
+        <w:rPr>
+          <w:rFonts w:ascii="Times New Roman" w:hAnsi="Times New Roman"/>
+          <w:sz w:val="22"/>
+        </w:rPr>
         <w:t>Methodology: field cleaning, date parsing, FIPS normalization, NYC filtering, and severe-weather flag construction.</w:t>
       </w:r>
     </w:p>
     <w:p>
       <w:pPr>
         <w:pStyle w:val="ListBullet"/>
+        <w:spacing w:after="120"/>
       </w:pPr>
       <w:r>
+        <w:rPr>
+          <w:rFonts w:ascii="Times New Roman" w:hAnsi="Times New Roman"/>
+          <w:sz w:val="22"/>
+        </w:rPr>
         <w:t>Purpose: establish a reproducible analysis panel and ensure that all later summaries use the same geography and time window.</w:t>
       </w:r>
     </w:p>
     <w:p>
       <w:pPr>
         <w:pStyle w:val="ListBullet"/>
+        <w:spacing w:after="120"/>
       </w:pPr>
       <w:r>
+        <w:rPr>
+          <w:rFonts w:ascii="Times New Roman" w:hAnsi="Times New Roman"/>
+          <w:sz w:val="22"/>
+        </w:rPr>
         <w:t>Interpretation role: foundation step only; no substantive inference is made here.</w:t>
       </w:r>
     </w:p>
     <w:p>
-      <w:pPr/>
+      <w:pPr>
+        <w:spacing w:after="120"/>
+      </w:pPr>
       <w:r>
         <w:rPr>
+          <w:rFonts w:ascii="Times New Roman" w:hAnsi="Times New Roman"/>
           <w:b/>
+          <w:sz w:val="22"/>
         </w:rPr>
         <w:t xml:space="preserve">Findings: </w:t>
       </w:r>
       <w:r>
+        <w:rPr>
+          <w:rFonts w:ascii="Times New Roman" w:hAnsi="Times New Roman"/>
+          <w:sz w:val="22"/>
+        </w:rPr>
         <w:t>The cleaned NYC panel covers five borough counties from 2014 through 2023. Total outage rows are lowest in 2014 (17,171) and highest in 2018 (667,269), with another large year in 2022 (587,220). The severe-weather share is also highest in 2018 (32.3%), while average duration peaks in 2020 at about 7.98 hours.</w:t>
       </w:r>
     </w:p>
     <w:p>
       <w:pPr>
+        <w:spacing w:after="120"/>
         <w:ind w:left="360"/>
       </w:pPr>
       <w:r>
+        <w:rPr>
+          <w:rFonts w:ascii="Times New Roman" w:hAnsi="Times New Roman"/>
+          <w:sz w:val="22"/>
+        </w:rPr>
         <w:t>This means the dataset is useful for comparing outage burden across boroughs and years, but the high-burden years are not evenly distributed. Later models therefore treat severe-weather exposure and time structure as important context rather than assuming a smooth annual trend.</w:t>
       </w:r>
     </w:p>
     <w:p>
       <w:pPr>
+        <w:spacing w:after="120"/>
+        <w:ind w:left="0"/>
+      </w:pPr>
+      <w:r>
+        <w:rPr>
+          <w:rFonts w:ascii="Times New Roman" w:hAnsi="Times New Roman"/>
+          <w:b/>
+          <w:sz w:val="22"/>
+        </w:rPr>
+        <w:t xml:space="preserve">Conclusion: </w:t>
+      </w:r>
+      <w:r>
+        <w:rPr>
+          <w:rFonts w:ascii="Times New Roman" w:hAnsi="Times New Roman"/>
+          <w:sz w:val="22"/>
+        </w:rPr>
+        <w:t>The basic panel tells us outage burden is episodic rather than steady. The main story is not simply that outages rise or fall over time; instead, certain years and weather conditions produce much heavier burden, so the analysis needs to focus on shocks, seasonality, and borough differences.</w:t>
+      </w:r>
+    </w:p>
+    <w:p>
+      <w:pPr>
         <w:pStyle w:val="Heading1"/>
+        <w:spacing w:after="120"/>
       </w:pPr>
       <w:r>
+        <w:rPr>
+          <w:rFonts w:ascii="Times New Roman" w:hAnsi="Times New Roman"/>
+          <w:sz w:val="22"/>
+        </w:rPr>
         <w:t>Parts 1-3: Initial Tract-Year and Month Effects</w:t>
       </w:r>
     </w:p>
     <w:p>
+      <w:pPr>
+        <w:spacing w:after="120"/>
+      </w:pPr>
       <w:r>
+        <w:rPr>
+          <w:rFonts w:ascii="Times New Roman" w:hAnsi="Times New Roman"/>
+          <w:sz w:val="22"/>
+        </w:rPr>
         <w:t>Parts 1 through 3 explore whether severe weather, year trends, and month effects are related to outage outcomes. These sections use tract-year summaries and year-by-month counts to identify broad patterns before moving to corrected models.</w:t>
       </w:r>
     </w:p>
-    <w:tbl>
-      <w:tblPr>
-        <w:tblStyle w:val="TableGrid"/>
-        <w:tblW w:type="auto" w:w="0"/>
-        <w:tblLook w:firstColumn="1" w:firstRow="1" w:lastColumn="0" w:lastRow="0" w:noHBand="0" w:noVBand="1" w:val="04A0"/>
-      </w:tblPr>
-      <w:tblGrid>
-        <w:gridCol w:w="3312"/>
-        <w:gridCol w:w="3312"/>
-        <w:gridCol w:w="3312"/>
-      </w:tblGrid>
-      <w:tr>
-        <w:tc>
-          <w:tcPr>
-            <w:tcW w:type="dxa" w:w="3312"/>
-          </w:tcPr>
-          <w:p>
-            <w:r>
-              <w:rPr>
-                <w:rFonts w:ascii="Arial" w:hAnsi="Arial"/>
-                <w:sz w:val="17"/>
-              </w:rPr>
-              <w:t>Part</w:t>
-            </w:r>
-          </w:p>
-        </w:tc>
-        <w:tc>
-          <w:tcPr>
-            <w:tcW w:type="dxa" w:w="3312"/>
-          </w:tcPr>
-          <w:p>
-            <w:r>
-              <w:rPr>
-                <w:rFonts w:ascii="Arial" w:hAnsi="Arial"/>
-                <w:sz w:val="17"/>
-              </w:rPr>
-              <w:t>Methodology</w:t>
-            </w:r>
-          </w:p>
-        </w:tc>
-        <w:tc>
-          <w:tcPr>
-            <w:tcW w:type="dxa" w:w="3312"/>
-          </w:tcPr>
-          <w:p>
-            <w:r>
-              <w:rPr>
-                <w:rFonts w:ascii="Arial" w:hAnsi="Arial"/>
-                <w:sz w:val="17"/>
-              </w:rPr>
-              <w:t>Use in final interpretation</w:t>
-            </w:r>
-          </w:p>
-        </w:tc>
-      </w:tr>
-      <w:tr>
-        <w:tc>
-          <w:tcPr>
-            <w:tcW w:type="dxa" w:w="3312"/>
-          </w:tcPr>
-          <w:p>
-            <w:r>
-              <w:rPr>
-                <w:rFonts w:ascii="Arial" w:hAnsi="Arial"/>
-                <w:sz w:val="17"/>
-              </w:rPr>
-              <w:t>Part 1</w:t>
-            </w:r>
-          </w:p>
-        </w:tc>
-        <w:tc>
-          <w:tcPr>
-            <w:tcW w:type="dxa" w:w="3312"/>
-          </w:tcPr>
-          <w:p>
-            <w:r>
-              <w:rPr>
-                <w:rFonts w:ascii="Arial" w:hAnsi="Arial"/>
-                <w:sz w:val="17"/>
-              </w:rPr>
-              <w:t>Per-tract OLS models of outage occurrence and log duration on severe-weather count, with FDR correction.</w:t>
-            </w:r>
-          </w:p>
-        </w:tc>
-        <w:tc>
-          <w:tcPr>
-            <w:tcW w:type="dxa" w:w="3312"/>
-          </w:tcPr>
-          <w:p>
-            <w:r>
-              <w:rPr>
-                <w:rFonts w:ascii="Arial" w:hAnsi="Arial"/>
-                <w:sz w:val="17"/>
-              </w:rPr>
-              <w:t>Exploratory screen for weather-outage association.</w:t>
-            </w:r>
-          </w:p>
-        </w:tc>
-      </w:tr>
-      <w:tr>
-        <w:tc>
-          <w:tcPr>
-            <w:tcW w:type="dxa" w:w="3312"/>
-          </w:tcPr>
-          <w:p>
-            <w:r>
-              <w:rPr>
-                <w:rFonts w:ascii="Arial" w:hAnsi="Arial"/>
-                <w:sz w:val="17"/>
-              </w:rPr>
-              <w:t>Part 2</w:t>
-            </w:r>
-          </w:p>
-        </w:tc>
-        <w:tc>
-          <w:tcPr>
-            <w:tcW w:type="dxa" w:w="3312"/>
-          </w:tcPr>
-          <w:p>
-            <w:r>
-              <w:rPr>
-                <w:rFonts w:ascii="Arial" w:hAnsi="Arial"/>
-                <w:sz w:val="17"/>
-              </w:rPr>
-              <w:t>Per-tract year-trend OLS, Kendall tau, and Theil-Sen slope checks.</w:t>
-            </w:r>
-          </w:p>
-        </w:tc>
-        <w:tc>
-          <w:tcPr>
-            <w:tcW w:type="dxa" w:w="3312"/>
-          </w:tcPr>
-          <w:p>
-            <w:r>
-              <w:rPr>
-                <w:rFonts w:ascii="Arial" w:hAnsi="Arial"/>
-                <w:sz w:val="17"/>
-              </w:rPr>
-              <w:t>Describes temporal patterns but is not final causal evidence.</w:t>
-            </w:r>
-          </w:p>
-        </w:tc>
-      </w:tr>
-      <w:tr>
-        <w:tc>
-          <w:tcPr>
-            <w:tcW w:type="dxa" w:w="3312"/>
-          </w:tcPr>
-          <w:p>
-            <w:r>
-              <w:rPr>
-                <w:rFonts w:ascii="Arial" w:hAnsi="Arial"/>
-                <w:sz w:val="17"/>
-              </w:rPr>
-              <w:t>Part 3</w:t>
-            </w:r>
-          </w:p>
-        </w:tc>
-        <w:tc>
-          <w:tcPr>
-            <w:tcW w:type="dxa" w:w="3312"/>
-          </w:tcPr>
-          <w:p>
-            <w:r>
-              <w:rPr>
-                <w:rFonts w:ascii="Arial" w:hAnsi="Arial"/>
-                <w:sz w:val="17"/>
-              </w:rPr>
-              <w:t>Year-by-month chi-square tests and FDR-adjusted residual checks.</w:t>
-            </w:r>
-          </w:p>
-        </w:tc>
-        <w:tc>
-          <w:tcPr>
-            <w:tcW w:type="dxa" w:w="3312"/>
-          </w:tcPr>
-          <w:p>
-            <w:r>
-              <w:rPr>
-                <w:rFonts w:ascii="Arial" w:hAnsi="Arial"/>
-                <w:sz w:val="17"/>
-              </w:rPr>
-              <w:t>Identifies seasonality and motivates month controls in later models.</w:t>
-            </w:r>
-          </w:p>
-        </w:tc>
-      </w:tr>
-    </w:tbl>
     <w:p>
+      <w:pPr>
+        <w:spacing w:after="120"/>
+      </w:pPr>
       <w:r>
+        <w:rPr>
+          <w:rFonts w:ascii="Times New Roman" w:hAnsi="Times New Roman"/>
+          <w:b/>
+          <w:sz w:val="22"/>
+        </w:rPr>
+        <w:t>Initial exploratory methods:</w:t>
+      </w:r>
+    </w:p>
+    <w:p>
+      <w:pPr>
+        <w:spacing w:after="120"/>
+        <w:ind w:left="360"/>
+      </w:pPr>
+      <w:r>
+        <w:rPr>
+          <w:rFonts w:ascii="Times New Roman" w:hAnsi="Times New Roman"/>
+          <w:b/>
+          <w:sz w:val="22"/>
+        </w:rPr>
+        <w:t xml:space="preserve">Part 1: </w:t>
+      </w:r>
+      <w:r>
+        <w:rPr>
+          <w:rFonts w:ascii="Times New Roman" w:hAnsi="Times New Roman"/>
+          <w:sz w:val="22"/>
+        </w:rPr>
+        <w:t>Per-tract OLS models of outage occurrence and log duration on severe-weather count, with FDR correction. Final interpretation use: Exploratory screen for weather-outage association.</w:t>
+      </w:r>
+    </w:p>
+    <w:p>
+      <w:pPr>
+        <w:spacing w:after="120"/>
+        <w:ind w:left="360"/>
+      </w:pPr>
+      <w:r>
+        <w:rPr>
+          <w:rFonts w:ascii="Times New Roman" w:hAnsi="Times New Roman"/>
+          <w:b/>
+          <w:sz w:val="22"/>
+        </w:rPr>
+        <w:t xml:space="preserve">Part 2: </w:t>
+      </w:r>
+      <w:r>
+        <w:rPr>
+          <w:rFonts w:ascii="Times New Roman" w:hAnsi="Times New Roman"/>
+          <w:sz w:val="22"/>
+        </w:rPr>
+        <w:t>Per-tract year-trend OLS, Kendall tau, and Theil-Sen slope checks. Final interpretation use: Describes temporal patterns but is not final causal evidence.</w:t>
+      </w:r>
+    </w:p>
+    <w:p>
+      <w:pPr>
+        <w:spacing w:after="120"/>
+        <w:ind w:left="360"/>
+      </w:pPr>
+      <w:r>
+        <w:rPr>
+          <w:rFonts w:ascii="Times New Roman" w:hAnsi="Times New Roman"/>
+          <w:b/>
+          <w:sz w:val="22"/>
+        </w:rPr>
+        <w:t xml:space="preserve">Part 3: </w:t>
+      </w:r>
+      <w:r>
+        <w:rPr>
+          <w:rFonts w:ascii="Times New Roman" w:hAnsi="Times New Roman"/>
+          <w:sz w:val="22"/>
+        </w:rPr>
+        <w:t>Year-by-month chi-square tests and FDR-adjusted residual checks. Final interpretation use: Identifies seasonality and motivates month controls in later models.</w:t>
+      </w:r>
+    </w:p>
+    <w:p>
+      <w:pPr>
+        <w:spacing w:after="120"/>
+      </w:pPr>
+      <w:r>
+        <w:rPr>
+          <w:rFonts w:ascii="Times New Roman" w:hAnsi="Times New Roman"/>
+          <w:sz w:val="22"/>
+        </w:rPr>
         <w:t>These early analyses are useful for pattern discovery, but they are not the strongest evidence because tract-level observations do not represent fully independent outage outcomes.</w:t>
       </w:r>
     </w:p>
     <w:p>
-      <w:pPr/>
+      <w:pPr>
+        <w:spacing w:after="120"/>
+      </w:pPr>
       <w:r>
         <w:rPr>
+          <w:rFonts w:ascii="Times New Roman" w:hAnsi="Times New Roman"/>
           <w:b/>
+          <w:sz w:val="22"/>
         </w:rPr>
         <w:t xml:space="preserve">Findings: </w:t>
       </w:r>
       <w:r>
+        <w:rPr>
+          <w:rFonts w:ascii="Times New Roman" w:hAnsi="Times New Roman"/>
+          <w:sz w:val="22"/>
+        </w:rPr>
         <w:t>The first severe-weather screen shows a broad positive relationship between severe weather and outage occurrence: 1,769 of 2,168 tracts are significant at FDR 0.05 in the initial OLS screen, and all significant slopes are positive. The median severe-weather coefficient is about 2.32.</w:t>
       </w:r>
     </w:p>
     <w:p>
       <w:pPr>
+        <w:spacing w:after="120"/>
         <w:ind w:left="360"/>
       </w:pPr>
       <w:r>
+        <w:rPr>
+          <w:rFonts w:ascii="Times New Roman" w:hAnsi="Times New Roman"/>
+          <w:sz w:val="22"/>
+        </w:rPr>
         <w:t>After switching to the more robust Spearman version, the occurrence result remains visible but weaker: 1,008 of 2,168 tracts are significant at FDR 0.05 and 669 are significant at FDR 0.01, with median rho about 0.69. Duration does not show the same robust tract-level relationship.</w:t>
       </w:r>
     </w:p>
     <w:p>
       <w:pPr>
+        <w:spacing w:after="120"/>
         <w:ind w:left="360"/>
       </w:pPr>
       <w:r>
+        <w:rPr>
+          <w:rFonts w:ascii="Times New Roman" w:hAnsi="Times New Roman"/>
+          <w:sz w:val="22"/>
+        </w:rPr>
         <w:t>The annual trend screen does not support a clean 2014-2023 time trend after FDR correction. Raw occurrence slopes are often positive, but no tract-level occurrence or duration trend survives the multiple-testing adjustment.</w:t>
       </w:r>
     </w:p>
     <w:p>
       <w:pPr>
+        <w:spacing w:after="120"/>
         <w:ind w:left="360"/>
       </w:pPr>
       <w:r>
+        <w:rPr>
+          <w:rFonts w:ascii="Times New Roman" w:hAnsi="Times New Roman"/>
+          <w:sz w:val="22"/>
+        </w:rPr>
         <w:t>Month effects are much clearer than linear year trends. Every year has a significant month effect, with high-outage months shifting across years; July appears as the top month in three years, and March appears in two years.</w:t>
       </w:r>
     </w:p>
     <w:p>
       <w:pPr>
+        <w:spacing w:after="120"/>
+        <w:ind w:left="0"/>
+      </w:pPr>
+      <w:r>
+        <w:rPr>
+          <w:rFonts w:ascii="Times New Roman" w:hAnsi="Times New Roman"/>
+          <w:b/>
+          <w:sz w:val="22"/>
+        </w:rPr>
+        <w:t xml:space="preserve">Conclusion: </w:t>
+      </w:r>
+      <w:r>
+        <w:rPr>
+          <w:rFonts w:ascii="Times New Roman" w:hAnsi="Times New Roman"/>
+          <w:sz w:val="22"/>
+        </w:rPr>
+        <w:t>The early tests point to severe weather and month timing as stronger explanations than a simple long-term trend. This supports framing the outage problem as one of recurring seasonal and weather-driven risk, not as a smooth year-by-year deterioration or improvement from 2014 to 2023.</w:t>
+      </w:r>
+    </w:p>
+    <w:p>
+      <w:pPr>
         <w:pStyle w:val="Heading1"/>
+        <w:spacing w:after="120"/>
       </w:pPr>
       <w:r>
+        <w:rPr>
+          <w:rFonts w:ascii="Times New Roman" w:hAnsi="Times New Roman"/>
+          <w:sz w:val="22"/>
+        </w:rPr>
         <w:t>Parts 4-6: Visualization, Correlation, and Seasonality Clustering</w:t>
       </w:r>
     </w:p>
     <w:p>
+      <w:pPr>
+        <w:spacing w:after="120"/>
+      </w:pPr>
       <w:r>
+        <w:rPr>
+          <w:rFonts w:ascii="Times New Roman" w:hAnsi="Times New Roman"/>
+          <w:sz w:val="22"/>
+        </w:rPr>
         <w:t>Parts 4 through 6 summarize spatial and seasonal structure. Visualizations show annual totals and monthly heat maps. Spearman correlations are used because outage counts and duration are skewed. K-means clustering is applied to monthly outage-share profiles to summarize seasonality patterns.</w:t>
       </w:r>
     </w:p>
     <w:p>
       <w:pPr>
         <w:pStyle w:val="ListBullet"/>
+        <w:spacing w:after="120"/>
       </w:pPr>
       <w:r>
+        <w:rPr>
+          <w:rFonts w:ascii="Times New Roman" w:hAnsi="Times New Roman"/>
+          <w:sz w:val="22"/>
+        </w:rPr>
         <w:t>Methodology: descriptive visualization, nonparametric correlation, and clustering of monthly outage-share profiles.</w:t>
       </w:r>
     </w:p>
     <w:p>
       <w:pPr>
         <w:pStyle w:val="ListBullet"/>
+        <w:spacing w:after="120"/>
       </w:pPr>
       <w:r>
+        <w:rPr>
+          <w:rFonts w:ascii="Times New Roman" w:hAnsi="Times New Roman"/>
+          <w:sz w:val="22"/>
+        </w:rPr>
         <w:t>Main role: communicate patterns and diagnose structure before modeling.</w:t>
       </w:r>
     </w:p>
     <w:p>
       <w:pPr>
         <w:pStyle w:val="ListBullet"/>
+        <w:spacing w:after="120"/>
       </w:pPr>
       <w:r>
+        <w:rPr>
+          <w:rFonts w:ascii="Times New Roman" w:hAnsi="Times New Roman"/>
+          <w:sz w:val="22"/>
+        </w:rPr>
         <w:t>Important caveat: the clustering reflects county-level seasonality more than true tract-level heterogeneity because many tract profiles duplicate county patterns.</w:t>
       </w:r>
     </w:p>
     <w:p>
-      <w:pPr/>
+      <w:pPr>
+        <w:spacing w:after="120"/>
+      </w:pPr>
       <w:r>
         <w:rPr>
+          <w:rFonts w:ascii="Times New Roman" w:hAnsi="Times New Roman"/>
           <w:b/>
+          <w:sz w:val="22"/>
         </w:rPr>
         <w:t xml:space="preserve">Findings: </w:t>
       </w:r>
       <w:r>
+        <w:rPr>
+          <w:rFonts w:ascii="Times New Roman" w:hAnsi="Times New Roman"/>
+          <w:sz w:val="22"/>
+        </w:rPr>
         <w:t>The corrected significance summary supports severe weather and seasonality as the two strongest descriptive patterns. Severe weather versus occurrence is significant for 1,008 tracts at FDR 0.05 and 669 at FDR 0.01, while severe weather versus duration is significant for zero tracts.</w:t>
       </w:r>
     </w:p>
     <w:p>
       <w:pPr>
+        <w:spacing w:after="120"/>
         <w:ind w:left="360"/>
       </w:pPr>
       <w:r>
+        <w:rPr>
+          <w:rFonts w:ascii="Times New Roman" w:hAnsi="Times New Roman"/>
+          <w:sz w:val="22"/>
+        </w:rPr>
         <w:t>Monthly trend testing finds no month with a significant occurrence trend after FDR correction. January is the only month with a significant negative duration trend, so the notebook should not claim broad month-specific improvement or deterioration over time.</w:t>
       </w:r>
     </w:p>
     <w:p>
       <w:pPr>
+        <w:spacing w:after="120"/>
         <w:ind w:left="360"/>
       </w:pPr>
       <w:r>
+        <w:rPr>
+          <w:rFonts w:ascii="Times New Roman" w:hAnsi="Times New Roman"/>
+          <w:sz w:val="22"/>
+        </w:rPr>
         <w:t>The seasonality clustering produces four groups with sizes 111, 1,008, 288, and 761 tracts. Their top months differ, but later diagnostics show that these clusters mostly reflect county-level seasonal profiles rather than independent tract-level behavioral types.</w:t>
       </w:r>
     </w:p>
     <w:p>
       <w:pPr>
+        <w:spacing w:after="120"/>
+        <w:ind w:left="0"/>
+      </w:pPr>
+      <w:r>
+        <w:rPr>
+          <w:rFonts w:ascii="Times New Roman" w:hAnsi="Times New Roman"/>
+          <w:b/>
+          <w:sz w:val="22"/>
+        </w:rPr>
+        <w:t xml:space="preserve">Conclusion: </w:t>
+      </w:r>
+      <w:r>
+        <w:rPr>
+          <w:rFonts w:ascii="Times New Roman" w:hAnsi="Times New Roman"/>
+          <w:sz w:val="22"/>
+        </w:rPr>
+        <w:t>These results show that the strongest descriptive pattern is timing: outage occurrence changes sharply by month and severe-weather context. However, because the clusters largely follow county patterns, they should be used to describe borough-level seasonality rather than to claim that individual tracts have truly distinct outage behavior.</w:t>
+      </w:r>
+    </w:p>
+    <w:p>
+      <w:pPr>
         <w:pStyle w:val="Heading1"/>
+        <w:spacing w:after="120"/>
       </w:pPr>
       <w:r>
+        <w:rPr>
+          <w:rFonts w:ascii="Times New Roman" w:hAnsi="Times New Roman"/>
+          <w:sz w:val="22"/>
+        </w:rPr>
         <w:t>Part 7: CVI Variables and Exploratory Regressions</w:t>
       </w:r>
     </w:p>
     <w:p>
+      <w:pPr>
+        <w:spacing w:after="120"/>
+      </w:pPr>
       <w:r>
+        <w:rPr>
+          <w:rFonts w:ascii="Times New Roman" w:hAnsi="Times New Roman"/>
+          <w:sz w:val="22"/>
+        </w:rPr>
         <w:t>Part 7 adds CVI measures to the outage panel. The candidate variables include overall CVI, baseline social-economic CVI, baseline infrastructure CVI, and climate/extreme-events CVI. Exploratory tract-year regressions are used to understand possible vulnerability relationships.</w:t>
       </w:r>
     </w:p>
     <w:p>
       <w:pPr>
         <w:pStyle w:val="ListBullet"/>
+        <w:spacing w:after="120"/>
       </w:pPr>
       <w:r>
+        <w:rPr>
+          <w:rFonts w:ascii="Times New Roman" w:hAnsi="Times New Roman"/>
+          <w:sz w:val="22"/>
+        </w:rPr>
         <w:t>Methodology: merge tract-level CVI features, construct tract-year outcomes, and fit exploratory regression models.</w:t>
       </w:r>
     </w:p>
     <w:p>
       <w:pPr>
         <w:pStyle w:val="ListBullet"/>
+        <w:spacing w:after="120"/>
       </w:pPr>
       <w:r>
+        <w:rPr>
+          <w:rFonts w:ascii="Times New Roman" w:hAnsi="Times New Roman"/>
+          <w:sz w:val="22"/>
+        </w:rPr>
         <w:t>Key caution: CVI variables are correlated with one another, so models with many CVI predictors can produce unstable coefficients.</w:t>
       </w:r>
     </w:p>
     <w:p>
       <w:pPr>
         <w:pStyle w:val="ListBullet"/>
+        <w:spacing w:after="120"/>
       </w:pPr>
       <w:r>
+        <w:rPr>
+          <w:rFonts w:ascii="Times New Roman" w:hAnsi="Times New Roman"/>
+          <w:sz w:val="22"/>
+        </w:rPr>
         <w:t>Interpretation role: hypothesis generation rather than final evidence.</w:t>
       </w:r>
     </w:p>
     <w:p>
-      <w:pPr/>
+      <w:pPr>
+        <w:spacing w:after="120"/>
+      </w:pPr>
       <w:r>
         <w:rPr>
+          <w:rFonts w:ascii="Times New Roman" w:hAnsi="Times New Roman"/>
           <w:b/>
+          <w:sz w:val="22"/>
         </w:rPr>
         <w:t xml:space="preserve">Findings: </w:t>
       </w:r>
       <w:r>
+        <w:rPr>
+          <w:rFonts w:ascii="Times New Roman" w:hAnsi="Times New Roman"/>
+          <w:sz w:val="22"/>
+        </w:rPr>
         <w:t>The exploratory CVI regressions suggest that social and economic vulnerability is more relevant to outage burden than several other CVI dimensions. However, the CVI variables are correlated, so this section is best read as a variable-screening step rather than final evidence.</w:t>
       </w:r>
     </w:p>
     <w:p>
       <w:pPr>
+        <w:spacing w:after="120"/>
         <w:ind w:left="360"/>
       </w:pPr>
       <w:r>
+        <w:rPr>
+          <w:rFonts w:ascii="Times New Roman" w:hAnsi="Times New Roman"/>
+          <w:sz w:val="22"/>
+        </w:rPr>
         <w:t>In the cleaner county-year frequency setup, overall CVI is positively associated with outage frequency in OLS (coef. 0.426, p = 0.016), and the social-economic CVI component is also positive (coef. 0.444, p = 0.008). The high-vulnerability share is not significant in OLS.</w:t>
       </w:r>
     </w:p>
     <w:p>
       <w:pPr>
+        <w:spacing w:after="120"/>
+        <w:ind w:left="0"/>
+      </w:pPr>
+      <w:r>
+        <w:rPr>
+          <w:rFonts w:ascii="Times New Roman" w:hAnsi="Times New Roman"/>
+          <w:b/>
+          <w:sz w:val="22"/>
+        </w:rPr>
+        <w:t xml:space="preserve">Conclusion: </w:t>
+      </w:r>
+      <w:r>
+        <w:rPr>
+          <w:rFonts w:ascii="Times New Roman" w:hAnsi="Times New Roman"/>
+          <w:sz w:val="22"/>
+        </w:rPr>
+        <w:t>The CVI results suggest an equity-relevant pattern: places with higher social-economic vulnerability tend to face higher outage frequency. Because this is still an exploratory and correlated-variable setting, the conclusion should be cautious: social vulnerability appears connected to outage burden, but this section alone does not prove causality.</w:t>
+      </w:r>
+    </w:p>
+    <w:p>
+      <w:pPr>
         <w:pStyle w:val="Heading1"/>
+        <w:spacing w:after="120"/>
       </w:pPr>
       <w:r>
+        <w:rPr>
+          <w:rFonts w:ascii="Times New Roman" w:hAnsi="Times New Roman"/>
+          <w:sz w:val="22"/>
+        </w:rPr>
         <w:t>Part 8: Data Structure Correction</w:t>
       </w:r>
     </w:p>
     <w:p>
+      <w:pPr>
+        <w:spacing w:after="120"/>
+      </w:pPr>
       <w:r>
+        <w:rPr>
+          <w:rFonts w:ascii="Times New Roman" w:hAnsi="Times New Roman"/>
+          <w:sz w:val="22"/>
+        </w:rPr>
         <w:t>Part 8 is the methodological turning point. It shows that outage occurrence, mean duration, and severe-weather count are often identical for tracts within the same county-year. This means tract-level regressions create a misleading sense of precision. The corrected analysis therefore collapses the data to county-year and county-month panels for the main frequency models.</w:t>
       </w:r>
     </w:p>
     <w:p>
       <w:pPr>
         <w:pStyle w:val="ListBullet"/>
+        <w:spacing w:after="120"/>
       </w:pPr>
       <w:r>
+        <w:rPr>
+          <w:rFonts w:ascii="Times New Roman" w:hAnsi="Times New Roman"/>
+          <w:sz w:val="22"/>
+        </w:rPr>
         <w:t>Methodology: county-year consistency checks, county-year collapse, OLS/Poisson diagnostics, and VIF checks.</w:t>
       </w:r>
     </w:p>
     <w:p>
       <w:pPr>
         <w:pStyle w:val="ListBullet"/>
+        <w:spacing w:after="120"/>
       </w:pPr>
       <w:r>
+        <w:rPr>
+          <w:rFonts w:ascii="Times New Roman" w:hAnsi="Times New Roman"/>
+          <w:sz w:val="22"/>
+        </w:rPr>
         <w:t>Reason for correction: repeated tract rows do not add independent outage information.</w:t>
       </w:r>
     </w:p>
     <w:p>
       <w:pPr>
         <w:pStyle w:val="ListBullet"/>
+        <w:spacing w:after="120"/>
       </w:pPr>
       <w:r>
+        <w:rPr>
+          <w:rFonts w:ascii="Times New Roman" w:hAnsi="Times New Roman"/>
+          <w:sz w:val="22"/>
+        </w:rPr>
         <w:t>Final implication: tract-level results should be used for maps and screening; county-month and event-level models should carry the main interpretation.</w:t>
       </w:r>
     </w:p>
     <w:p>
-      <w:pPr/>
+      <w:pPr>
+        <w:spacing w:after="120"/>
+      </w:pPr>
       <w:r>
         <w:rPr>
+          <w:rFonts w:ascii="Times New Roman" w:hAnsi="Times New Roman"/>
           <w:b/>
+          <w:sz w:val="22"/>
         </w:rPr>
         <w:t xml:space="preserve">Findings: </w:t>
       </w:r>
       <w:r>
+        <w:rPr>
+          <w:rFonts w:ascii="Times New Roman" w:hAnsi="Times New Roman"/>
+          <w:sz w:val="22"/>
+        </w:rPr>
         <w:t>The data-structure check confirms why the original tract-level interpretation needed correction: within each county-year, outage occurrence, duration, and severe-weather indicators are repeated consistently across tracts. In the 47 county-year rows checked, the unique-value consistency rate is 100% for occurrence, duration, and severe-weather variables.</w:t>
       </w:r>
     </w:p>
     <w:p>
       <w:pPr>
+        <w:spacing w:after="120"/>
         <w:ind w:left="360"/>
       </w:pPr>
       <w:r>
+        <w:rPr>
+          <w:rFonts w:ascii="Times New Roman" w:hAnsi="Times New Roman"/>
+          <w:sz w:val="22"/>
+        </w:rPr>
         <w:t>This finding changes the most defensible unit of inference. Tract maps and CVI joins remain useful for description, but final frequency models should be interpreted at the county-year or county-month level.</w:t>
       </w:r>
     </w:p>
     <w:p>
       <w:pPr>
+        <w:spacing w:after="120"/>
+        <w:ind w:left="0"/>
+      </w:pPr>
+      <w:r>
+        <w:rPr>
+          <w:rFonts w:ascii="Times New Roman" w:hAnsi="Times New Roman"/>
+          <w:b/>
+          <w:sz w:val="22"/>
+        </w:rPr>
+        <w:t xml:space="preserve">Conclusion: </w:t>
+      </w:r>
+      <w:r>
+        <w:rPr>
+          <w:rFonts w:ascii="Times New Roman" w:hAnsi="Times New Roman"/>
+          <w:sz w:val="22"/>
+        </w:rPr>
+        <w:t>The repeated county-year outcomes mean tract-level models overstate the amount of independent information in the data. The smarter conclusion is that tract-level CVI helps describe who lives in more vulnerable places, while county-year or county-month models are the more credible basis for final outage-frequency inference.</w:t>
+      </w:r>
+    </w:p>
+    <w:p>
+      <w:pPr>
         <w:pStyle w:val="Heading1"/>
+        <w:spacing w:after="120"/>
       </w:pPr>
       <w:r>
+        <w:rPr>
+          <w:rFonts w:ascii="Times New Roman" w:hAnsi="Times New Roman"/>
+          <w:sz w:val="22"/>
+        </w:rPr>
         <w:t>Part 8b and Part 9: Corrected Frequency Models</w:t>
       </w:r>
     </w:p>
     <w:p>
+      <w:pPr>
+        <w:spacing w:after="120"/>
+      </w:pPr>
       <w:r>
+        <w:rPr>
+          <w:rFonts w:ascii="Times New Roman" w:hAnsi="Times New Roman"/>
+          <w:sz w:val="22"/>
+        </w:rPr>
         <w:t>The corrected frequency analysis uses count models and county-month models. Poisson diagnostics show substantial overdispersion, so Negative Binomial models are preferred for outage counts. Part 9 then estimates one main CVI concept at a time in a county-month framework with time, severe-weather, and month controls.</w:t>
       </w:r>
     </w:p>
-    <w:tbl>
-      <w:tblPr>
-        <w:tblStyle w:val="TableGrid"/>
-        <w:tblW w:type="auto" w:w="0"/>
-        <w:tblLook w:firstColumn="1" w:firstRow="1" w:lastColumn="0" w:lastRow="0" w:noHBand="0" w:noVBand="1" w:val="04A0"/>
-      </w:tblPr>
-      <w:tblGrid>
-        <w:gridCol w:w="3312"/>
-        <w:gridCol w:w="3312"/>
-        <w:gridCol w:w="3312"/>
-      </w:tblGrid>
-      <w:tr>
-        <w:tc>
-          <w:tcPr>
-            <w:tcW w:type="dxa" w:w="3312"/>
-          </w:tcPr>
-          <w:p>
-            <w:r>
-              <w:rPr>
-                <w:rFonts w:ascii="Arial" w:hAnsi="Arial"/>
-                <w:sz w:val="17"/>
-              </w:rPr>
-              <w:t>Model component</w:t>
-            </w:r>
-          </w:p>
-        </w:tc>
-        <w:tc>
-          <w:tcPr>
-            <w:tcW w:type="dxa" w:w="3312"/>
-          </w:tcPr>
-          <w:p>
-            <w:r>
-              <w:rPr>
-                <w:rFonts w:ascii="Arial" w:hAnsi="Arial"/>
-                <w:sz w:val="17"/>
-              </w:rPr>
-              <w:t>Methodology</w:t>
-            </w:r>
-          </w:p>
-        </w:tc>
-        <w:tc>
-          <w:tcPr>
-            <w:tcW w:type="dxa" w:w="3312"/>
-          </w:tcPr>
-          <w:p>
-            <w:r>
-              <w:rPr>
-                <w:rFonts w:ascii="Arial" w:hAnsi="Arial"/>
-                <w:sz w:val="17"/>
-              </w:rPr>
-              <w:t>Interpretation</w:t>
-            </w:r>
-          </w:p>
-        </w:tc>
-      </w:tr>
-      <w:tr>
-        <w:tc>
-          <w:tcPr>
-            <w:tcW w:type="dxa" w:w="3312"/>
-          </w:tcPr>
-          <w:p>
-            <w:r>
-              <w:rPr>
-                <w:rFonts w:ascii="Arial" w:hAnsi="Arial"/>
-                <w:sz w:val="17"/>
-              </w:rPr>
-              <w:t>Overdispersion check</w:t>
-            </w:r>
-          </w:p>
-        </w:tc>
-        <w:tc>
-          <w:tcPr>
-            <w:tcW w:type="dxa" w:w="3312"/>
-          </w:tcPr>
-          <w:p>
-            <w:r>
-              <w:rPr>
-                <w:rFonts w:ascii="Arial" w:hAnsi="Arial"/>
-                <w:sz w:val="17"/>
-              </w:rPr>
-              <w:t>Compare Poisson assumptions against observed count variance.</w:t>
-            </w:r>
-          </w:p>
-        </w:tc>
-        <w:tc>
-          <w:tcPr>
-            <w:tcW w:type="dxa" w:w="3312"/>
-          </w:tcPr>
-          <w:p>
-            <w:r>
-              <w:rPr>
-                <w:rFonts w:ascii="Arial" w:hAnsi="Arial"/>
-                <w:sz w:val="17"/>
-              </w:rPr>
-              <w:t>Poisson is too restrictive when overdispersion is high.</w:t>
-            </w:r>
-          </w:p>
-        </w:tc>
-      </w:tr>
-      <w:tr>
-        <w:tc>
-          <w:tcPr>
-            <w:tcW w:type="dxa" w:w="3312"/>
-          </w:tcPr>
-          <w:p>
-            <w:r>
-              <w:rPr>
-                <w:rFonts w:ascii="Arial" w:hAnsi="Arial"/>
-                <w:sz w:val="17"/>
-              </w:rPr>
-              <w:t>Negative Binomial</w:t>
-            </w:r>
-          </w:p>
-        </w:tc>
-        <w:tc>
-          <w:tcPr>
-            <w:tcW w:type="dxa" w:w="3312"/>
-          </w:tcPr>
-          <w:p>
-            <w:r>
-              <w:rPr>
-                <w:rFonts w:ascii="Arial" w:hAnsi="Arial"/>
-                <w:sz w:val="17"/>
-              </w:rPr>
-              <w:t>Use an overdispersed count model for outage frequency.</w:t>
-            </w:r>
-          </w:p>
-        </w:tc>
-        <w:tc>
-          <w:tcPr>
-            <w:tcW w:type="dxa" w:w="3312"/>
-          </w:tcPr>
-          <w:p>
-            <w:r>
-              <w:rPr>
-                <w:rFonts w:ascii="Arial" w:hAnsi="Arial"/>
-                <w:sz w:val="17"/>
-              </w:rPr>
-              <w:t>Preferred count-model family for frequency.</w:t>
-            </w:r>
-          </w:p>
-        </w:tc>
-      </w:tr>
-      <w:tr>
-        <w:tc>
-          <w:tcPr>
-            <w:tcW w:type="dxa" w:w="3312"/>
-          </w:tcPr>
-          <w:p>
-            <w:r>
-              <w:rPr>
-                <w:rFonts w:ascii="Arial" w:hAnsi="Arial"/>
-                <w:sz w:val="17"/>
-              </w:rPr>
-              <w:t>County-month panel</w:t>
-            </w:r>
-          </w:p>
-        </w:tc>
-        <w:tc>
-          <w:tcPr>
-            <w:tcW w:type="dxa" w:w="3312"/>
-          </w:tcPr>
-          <w:p>
-            <w:r>
-              <w:rPr>
-                <w:rFonts w:ascii="Arial" w:hAnsi="Arial"/>
-                <w:sz w:val="17"/>
-              </w:rPr>
-              <w:t>Five counties x ten years x twelve months, producing 600 observations.</w:t>
-            </w:r>
-          </w:p>
-        </w:tc>
-        <w:tc>
-          <w:tcPr>
-            <w:tcW w:type="dxa" w:w="3312"/>
-          </w:tcPr>
-          <w:p>
-            <w:r>
-              <w:rPr>
-                <w:rFonts w:ascii="Arial" w:hAnsi="Arial"/>
-                <w:sz w:val="17"/>
-              </w:rPr>
-              <w:t>Main frequency model because it accounts for seasonality and avoids tract-level pseudo-replication.</w:t>
-            </w:r>
-          </w:p>
-        </w:tc>
-      </w:tr>
-      <w:tr>
-        <w:tc>
-          <w:tcPr>
-            <w:tcW w:type="dxa" w:w="3312"/>
-          </w:tcPr>
-          <w:p>
-            <w:r>
-              <w:rPr>
-                <w:rFonts w:ascii="Arial" w:hAnsi="Arial"/>
-                <w:sz w:val="17"/>
-              </w:rPr>
-              <w:t>One-CVI-at-a-time models</w:t>
-            </w:r>
-          </w:p>
-        </w:tc>
-        <w:tc>
-          <w:tcPr>
-            <w:tcW w:type="dxa" w:w="3312"/>
-          </w:tcPr>
-          <w:p>
-            <w:r>
-              <w:rPr>
-                <w:rFonts w:ascii="Arial" w:hAnsi="Arial"/>
-                <w:sz w:val="17"/>
-              </w:rPr>
-              <w:t>Estimate separate models for overall, social-economic, climate, and high-vulnerability-share concepts.</w:t>
-            </w:r>
-          </w:p>
-        </w:tc>
-        <w:tc>
-          <w:tcPr>
-            <w:tcW w:type="dxa" w:w="3312"/>
-          </w:tcPr>
-          <w:p>
-            <w:r>
-              <w:rPr>
-                <w:rFonts w:ascii="Arial" w:hAnsi="Arial"/>
-                <w:sz w:val="17"/>
-              </w:rPr>
-              <w:t>Improves interpretability and reduces multicollinearity problems.</w:t>
-            </w:r>
-          </w:p>
-        </w:tc>
-      </w:tr>
-    </w:tbl>
     <w:p>
+      <w:pPr>
+        <w:spacing w:after="120"/>
+      </w:pPr>
       <w:r>
+        <w:rPr>
+          <w:rFonts w:ascii="Times New Roman" w:hAnsi="Times New Roman"/>
+          <w:b/>
+          <w:sz w:val="22"/>
+        </w:rPr>
+        <w:t>Corrected frequency model components:</w:t>
+      </w:r>
+    </w:p>
+    <w:p>
+      <w:pPr>
+        <w:spacing w:after="120"/>
+        <w:ind w:left="360"/>
+      </w:pPr>
+      <w:r>
+        <w:rPr>
+          <w:rFonts w:ascii="Times New Roman" w:hAnsi="Times New Roman"/>
+          <w:b/>
+          <w:sz w:val="22"/>
+        </w:rPr>
+        <w:t xml:space="preserve">Overdispersion check: </w:t>
+      </w:r>
+      <w:r>
+        <w:rPr>
+          <w:rFonts w:ascii="Times New Roman" w:hAnsi="Times New Roman"/>
+          <w:sz w:val="22"/>
+        </w:rPr>
+        <w:t>Compare Poisson assumptions against observed count variance. Interpretation: Poisson is too restrictive when overdispersion is high.</w:t>
+      </w:r>
+    </w:p>
+    <w:p>
+      <w:pPr>
+        <w:spacing w:after="120"/>
+        <w:ind w:left="360"/>
+      </w:pPr>
+      <w:r>
+        <w:rPr>
+          <w:rFonts w:ascii="Times New Roman" w:hAnsi="Times New Roman"/>
+          <w:b/>
+          <w:sz w:val="22"/>
+        </w:rPr>
+        <w:t xml:space="preserve">Negative Binomial: </w:t>
+      </w:r>
+      <w:r>
+        <w:rPr>
+          <w:rFonts w:ascii="Times New Roman" w:hAnsi="Times New Roman"/>
+          <w:sz w:val="22"/>
+        </w:rPr>
+        <w:t>Use an overdispersed count model for outage frequency. Interpretation: Preferred count-model family for frequency.</w:t>
+      </w:r>
+    </w:p>
+    <w:p>
+      <w:pPr>
+        <w:spacing w:after="120"/>
+        <w:ind w:left="360"/>
+      </w:pPr>
+      <w:r>
+        <w:rPr>
+          <w:rFonts w:ascii="Times New Roman" w:hAnsi="Times New Roman"/>
+          <w:b/>
+          <w:sz w:val="22"/>
+        </w:rPr>
+        <w:t xml:space="preserve">County-month panel: </w:t>
+      </w:r>
+      <w:r>
+        <w:rPr>
+          <w:rFonts w:ascii="Times New Roman" w:hAnsi="Times New Roman"/>
+          <w:sz w:val="22"/>
+        </w:rPr>
+        <w:t>Five counties x ten years x twelve months, producing 600 observations. Interpretation: Main frequency model because it accounts for seasonality and avoids tract-level pseudo-replication.</w:t>
+      </w:r>
+    </w:p>
+    <w:p>
+      <w:pPr>
+        <w:spacing w:after="120"/>
+        <w:ind w:left="360"/>
+      </w:pPr>
+      <w:r>
+        <w:rPr>
+          <w:rFonts w:ascii="Times New Roman" w:hAnsi="Times New Roman"/>
+          <w:b/>
+          <w:sz w:val="22"/>
+        </w:rPr>
+        <w:t xml:space="preserve">One-CVI-at-a-time models: </w:t>
+      </w:r>
+      <w:r>
+        <w:rPr>
+          <w:rFonts w:ascii="Times New Roman" w:hAnsi="Times New Roman"/>
+          <w:sz w:val="22"/>
+        </w:rPr>
+        <w:t>Estimate separate models for overall, social-economic, climate, and high-vulnerability-share concepts. Interpretation: Improves interpretability and reduces multicollinearity problems.</w:t>
+      </w:r>
+    </w:p>
+    <w:p>
+      <w:pPr>
+        <w:spacing w:after="120"/>
+      </w:pPr>
+      <w:r>
+        <w:rPr>
+          <w:rFonts w:ascii="Times New Roman" w:hAnsi="Times New Roman"/>
+          <w:sz w:val="22"/>
+        </w:rPr>
         <w:t>The clearest vulnerability signal appears for social-economic CVI. In the county-month Poisson specification, a one-standard-deviation increase in social-economic CVI is associated with an incidence rate ratio of approximately 1.20, or about 20 percent higher monthly outage counts, conditional on the model controls.</w:t>
       </w:r>
     </w:p>
     <w:p>
-      <w:pPr/>
+      <w:pPr>
+        <w:spacing w:after="120"/>
+      </w:pPr>
       <w:r>
         <w:rPr>
+          <w:rFonts w:ascii="Times New Roman" w:hAnsi="Times New Roman"/>
           <w:b/>
+          <w:sz w:val="22"/>
         </w:rPr>
         <w:t xml:space="preserve">Findings: </w:t>
       </w:r>
       <w:r>
+        <w:rPr>
+          <w:rFonts w:ascii="Times New Roman" w:hAnsi="Times New Roman"/>
+          <w:sz w:val="22"/>
+        </w:rPr>
         <w:t>The count-model diagnostics support Negative Binomial models over simple Poisson models. The county-year Poisson model has strong overdispersion, with dispersion about 41.7 and AIC about 2,297, while the comparable Negative Binomial model has much lower AIC, about 551.</w:t>
       </w:r>
     </w:p>
     <w:p>
       <w:pPr>
+        <w:spacing w:after="120"/>
         <w:ind w:left="360"/>
       </w:pPr>
       <w:r>
+        <w:rPr>
+          <w:rFonts w:ascii="Times New Roman" w:hAnsi="Times New Roman"/>
+          <w:sz w:val="22"/>
+        </w:rPr>
         <w:t>At the county-month level, adding month effects improves the Negative Binomial model: AIC decreases from about 3,277 to 3,227, and the likelihood-ratio test for month effects is highly significant (p about 5.44e-11). The county-month panel contains 600 cells, including 126 zero-outage cells.</w:t>
       </w:r>
     </w:p>
     <w:p>
       <w:pPr>
+        <w:spacing w:after="120"/>
         <w:ind w:left="360"/>
       </w:pPr>
       <w:r>
+        <w:rPr>
+          <w:rFonts w:ascii="Times New Roman" w:hAnsi="Times New Roman"/>
+          <w:sz w:val="22"/>
+        </w:rPr>
         <w:t>In the CVI frequency models, social-economic CVI is the clearest positive vulnerability signal. The Poisson incidence-rate ratio is about 1.18 for social-economic CVI, while severe-weather exposure remains a positive predictor in the cleaner models.</w:t>
       </w:r>
     </w:p>
     <w:p>
       <w:pPr>
+        <w:spacing w:after="120"/>
+        <w:ind w:left="0"/>
+      </w:pPr>
+      <w:r>
+        <w:rPr>
+          <w:rFonts w:ascii="Times New Roman" w:hAnsi="Times New Roman"/>
+          <w:b/>
+          <w:sz w:val="22"/>
+        </w:rPr>
+        <w:t xml:space="preserve">Conclusion: </w:t>
+      </w:r>
+      <w:r>
+        <w:rPr>
+          <w:rFonts w:ascii="Times New Roman" w:hAnsi="Times New Roman"/>
+          <w:sz w:val="22"/>
+        </w:rPr>
+        <w:t>The corrected count models strengthen the main frequency conclusion: outage counts are overdispersed, seasonal, and better handled with Negative Binomial models. Within that corrected setup, social-economic vulnerability remains the most consistent CVI signal, meaning the equity pattern is not only an artifact of the first exploratory regressions.</w:t>
+      </w:r>
+    </w:p>
+    <w:p>
+      <w:pPr>
         <w:pStyle w:val="Heading1"/>
+        <w:spacing w:after="120"/>
       </w:pPr>
       <w:r>
+        <w:rPr>
+          <w:rFonts w:ascii="Times New Roman" w:hAnsi="Times New Roman"/>
+          <w:sz w:val="22"/>
+        </w:rPr>
         <w:t>Part 9b: Theory-Driven CVI Selection and Ridge Sensitivity</w:t>
       </w:r>
     </w:p>
     <w:p>
+      <w:pPr>
+        <w:spacing w:after="120"/>
+      </w:pPr>
       <w:r>
+        <w:rPr>
+          <w:rFonts w:ascii="Times New Roman" w:hAnsi="Times New Roman"/>
+          <w:sz w:val="22"/>
+        </w:rPr>
         <w:t>Part 9b narrows the vulnerability question to theoretically motivated predictors, including social-economic CVI, infrastructure CVI, and severe-weather count. OLS and Ridge models are compared to assess whether coefficient signs remain stable when predictors are correlated.</w:t>
       </w:r>
     </w:p>
     <w:p>
       <w:pPr>
         <w:pStyle w:val="ListBullet"/>
+        <w:spacing w:after="120"/>
       </w:pPr>
       <w:r>
+        <w:rPr>
+          <w:rFonts w:ascii="Times New Roman" w:hAnsi="Times New Roman"/>
+          <w:sz w:val="22"/>
+        </w:rPr>
         <w:t>Methodology: compare OLS estimates with Ridge sensitivity models.</w:t>
       </w:r>
     </w:p>
     <w:p>
       <w:pPr>
         <w:pStyle w:val="ListBullet"/>
+        <w:spacing w:after="120"/>
       </w:pPr>
       <w:r>
+        <w:rPr>
+          <w:rFonts w:ascii="Times New Roman" w:hAnsi="Times New Roman"/>
+          <w:sz w:val="22"/>
+        </w:rPr>
         <w:t>Use of Ridge: directional robustness check, not the primary explanatory model.</w:t>
       </w:r>
     </w:p>
     <w:p>
       <w:pPr>
         <w:pStyle w:val="ListBullet"/>
+        <w:spacing w:after="120"/>
       </w:pPr>
       <w:r>
+        <w:rPr>
+          <w:rFonts w:ascii="Times New Roman" w:hAnsi="Times New Roman"/>
+          <w:sz w:val="22"/>
+        </w:rPr>
         <w:t>Interpretation: infrastructure CVI is positive but imprecise; social-economic CVI is directionally consistent but still sensitive to small county-level sample size.</w:t>
       </w:r>
     </w:p>
     <w:p>
-      <w:pPr/>
+      <w:pPr>
+        <w:spacing w:after="120"/>
+      </w:pPr>
       <w:r>
         <w:rPr>
+          <w:rFonts w:ascii="Times New Roman" w:hAnsi="Times New Roman"/>
           <w:b/>
+          <w:sz w:val="22"/>
         </w:rPr>
         <w:t xml:space="preserve">Findings: </w:t>
       </w:r>
       <w:r>
+        <w:rPr>
+          <w:rFonts w:ascii="Times New Roman" w:hAnsi="Times New Roman"/>
+          <w:sz w:val="22"/>
+        </w:rPr>
         <w:t>The theory-driven sensitivity check keeps the social-economic and infrastructure CVI components together with severe-weather exposure. In this more conservative setup, social-economic CVI remains positive in both OLS and Ridge, but its confidence interval crosses zero.</w:t>
       </w:r>
     </w:p>
     <w:p>
       <w:pPr>
+        <w:spacing w:after="120"/>
         <w:ind w:left="360"/>
       </w:pPr>
       <w:r>
+        <w:rPr>
+          <w:rFonts w:ascii="Times New Roman" w:hAnsi="Times New Roman"/>
+          <w:sz w:val="22"/>
+        </w:rPr>
         <w:t>Infrastructure CVI is also positive but uncertain. Severe-weather exposure is the most stable predictor: OLS coefficient about 0.389 with 95% CI 0.137 to 0.641, and Ridge coefficient about 0.385 with interval 0.208 to 0.763.</w:t>
       </w:r>
     </w:p>
     <w:p>
       <w:pPr>
+        <w:spacing w:after="120"/>
         <w:ind w:left="360"/>
       </w:pPr>
       <w:r>
+        <w:rPr>
+          <w:rFonts w:ascii="Times New Roman" w:hAnsi="Times New Roman"/>
+          <w:sz w:val="22"/>
+        </w:rPr>
         <w:t>The VIF values for social-economic and infrastructure CVI are about 4.85 and 4.81, confirming moderate collinearity. This is why the report should describe CVI results as suggestive and model-sensitive, while treating severe weather as the most robust signal.</w:t>
       </w:r>
     </w:p>
     <w:p>
       <w:pPr>
+        <w:spacing w:after="120"/>
+        <w:ind w:left="0"/>
+      </w:pPr>
+      <w:r>
+        <w:rPr>
+          <w:rFonts w:ascii="Times New Roman" w:hAnsi="Times New Roman"/>
+          <w:b/>
+          <w:sz w:val="22"/>
+        </w:rPr>
+        <w:t xml:space="preserve">Conclusion: </w:t>
+      </w:r>
+      <w:r>
+        <w:rPr>
+          <w:rFonts w:ascii="Times New Roman" w:hAnsi="Times New Roman"/>
+          <w:sz w:val="22"/>
+        </w:rPr>
+        <w:t>The sensitivity check narrows the claim. Severe weather is clearly robust, while social-economic and infrastructure vulnerability are directionally meaningful but statistically less secure. This supports a balanced conclusion: weather is the primary operational driver, and vulnerability helps identify which communities may be more exposed to repeated burden.</w:t>
+      </w:r>
+    </w:p>
+    <w:p>
+      <w:pPr>
         <w:pStyle w:val="Heading1"/>
+        <w:spacing w:after="120"/>
       </w:pPr>
       <w:r>
+        <w:rPr>
+          <w:rFonts w:ascii="Times New Roman" w:hAnsi="Times New Roman"/>
+          <w:sz w:val="22"/>
+        </w:rPr>
         <w:t>Part 10 and Part 10b: Duration and Resilience Models</w:t>
       </w:r>
     </w:p>
     <w:p>
+      <w:pPr>
+        <w:spacing w:after="120"/>
+      </w:pPr>
       <w:r>
+        <w:rPr>
+          <w:rFonts w:ascii="Times New Roman" w:hAnsi="Times New Roman"/>
+          <w:sz w:val="22"/>
+        </w:rPr>
         <w:t>Parts 10 and 10b separate outage frequency from outage resilience. Frequency asks whether outages occur more often. Duration asks whether outages last longer once they occur. This distinction matters because high-burden communities may be affected through restoration time rather than event count alone.</w:t>
       </w:r>
     </w:p>
-    <w:tbl>
-      <w:tblPr>
-        <w:tblStyle w:val="TableGrid"/>
-        <w:tblW w:type="auto" w:w="0"/>
-        <w:tblLook w:firstColumn="1" w:firstRow="1" w:lastColumn="0" w:lastRow="0" w:noHBand="0" w:noVBand="1" w:val="04A0"/>
-      </w:tblPr>
-      <w:tblGrid>
-        <w:gridCol w:w="3312"/>
-        <w:gridCol w:w="3312"/>
-        <w:gridCol w:w="3312"/>
-      </w:tblGrid>
-      <w:tr>
-        <w:tc>
-          <w:tcPr>
-            <w:tcW w:type="dxa" w:w="3312"/>
-          </w:tcPr>
-          <w:p>
-            <w:r>
-              <w:rPr>
-                <w:rFonts w:ascii="Arial" w:hAnsi="Arial"/>
-                <w:sz w:val="17"/>
-              </w:rPr>
-              <w:t>Outcome family</w:t>
-            </w:r>
-          </w:p>
-        </w:tc>
-        <w:tc>
-          <w:tcPr>
-            <w:tcW w:type="dxa" w:w="3312"/>
-          </w:tcPr>
-          <w:p>
-            <w:r>
-              <w:rPr>
-                <w:rFonts w:ascii="Arial" w:hAnsi="Arial"/>
-                <w:sz w:val="17"/>
-              </w:rPr>
-              <w:t>Methodology</w:t>
-            </w:r>
-          </w:p>
-        </w:tc>
-        <w:tc>
-          <w:tcPr>
-            <w:tcW w:type="dxa" w:w="3312"/>
-          </w:tcPr>
-          <w:p>
-            <w:r>
-              <w:rPr>
-                <w:rFonts w:ascii="Arial" w:hAnsi="Arial"/>
-                <w:sz w:val="17"/>
-              </w:rPr>
-              <w:t>Main interpretation</w:t>
-            </w:r>
-          </w:p>
-        </w:tc>
-      </w:tr>
-      <w:tr>
-        <w:tc>
-          <w:tcPr>
-            <w:tcW w:type="dxa" w:w="3312"/>
-          </w:tcPr>
-          <w:p>
-            <w:r>
-              <w:rPr>
-                <w:rFonts w:ascii="Arial" w:hAnsi="Arial"/>
-                <w:sz w:val="17"/>
-              </w:rPr>
-              <w:t>County-year duration</w:t>
-            </w:r>
-          </w:p>
-        </w:tc>
-        <w:tc>
-          <w:tcPr>
-            <w:tcW w:type="dxa" w:w="3312"/>
-          </w:tcPr>
-          <w:p>
-            <w:r>
-              <w:rPr>
-                <w:rFonts w:ascii="Arial" w:hAnsi="Arial"/>
-                <w:sz w:val="17"/>
-              </w:rPr>
-              <w:t>Median duration, p90 duration, share above 8 hours, and share above 24 hours.</w:t>
-            </w:r>
-          </w:p>
-        </w:tc>
-        <w:tc>
-          <w:tcPr>
-            <w:tcW w:type="dxa" w:w="3312"/>
-          </w:tcPr>
-          <w:p>
-            <w:r>
-              <w:rPr>
-                <w:rFonts w:ascii="Arial" w:hAnsi="Arial"/>
-                <w:sz w:val="17"/>
-              </w:rPr>
-              <w:t>Useful but limited by small county-year sample.</w:t>
-            </w:r>
-          </w:p>
-        </w:tc>
-      </w:tr>
-      <w:tr>
-        <w:tc>
-          <w:tcPr>
-            <w:tcW w:type="dxa" w:w="3312"/>
-          </w:tcPr>
-          <w:p>
-            <w:r>
-              <w:rPr>
-                <w:rFonts w:ascii="Arial" w:hAnsi="Arial"/>
-                <w:sz w:val="17"/>
-              </w:rPr>
-              <w:t>Event-level log duration</w:t>
-            </w:r>
-          </w:p>
-        </w:tc>
-        <w:tc>
-          <w:tcPr>
-            <w:tcW w:type="dxa" w:w="3312"/>
-          </w:tcPr>
-          <w:p>
-            <w:r>
-              <w:rPr>
-                <w:rFonts w:ascii="Arial" w:hAnsi="Arial"/>
-                <w:sz w:val="17"/>
-              </w:rPr>
-              <w:t>OLS and clustered/sensitivity specifications on deduplicated outage events.</w:t>
-            </w:r>
-          </w:p>
-        </w:tc>
-        <w:tc>
-          <w:tcPr>
-            <w:tcW w:type="dxa" w:w="3312"/>
-          </w:tcPr>
-          <w:p>
-            <w:r>
-              <w:rPr>
-                <w:rFonts w:ascii="Arial" w:hAnsi="Arial"/>
-                <w:sz w:val="17"/>
-              </w:rPr>
-              <w:t>Stronger duration evidence because the event is the unit of analysis.</w:t>
-            </w:r>
-          </w:p>
-        </w:tc>
-      </w:tr>
-      <w:tr>
-        <w:tc>
-          <w:tcPr>
-            <w:tcW w:type="dxa" w:w="3312"/>
-          </w:tcPr>
-          <w:p>
-            <w:r>
-              <w:rPr>
-                <w:rFonts w:ascii="Arial" w:hAnsi="Arial"/>
-                <w:sz w:val="17"/>
-              </w:rPr>
-              <w:t>Severe outage probability</w:t>
-            </w:r>
-          </w:p>
-        </w:tc>
-        <w:tc>
-          <w:tcPr>
-            <w:tcW w:type="dxa" w:w="3312"/>
-          </w:tcPr>
-          <w:p>
-            <w:r>
-              <w:rPr>
-                <w:rFonts w:ascii="Arial" w:hAnsi="Arial"/>
-                <w:sz w:val="17"/>
-              </w:rPr>
-              <w:t>Logistic or GEE-style binary models for long/severe outage outcomes.</w:t>
-            </w:r>
-          </w:p>
-        </w:tc>
-        <w:tc>
-          <w:tcPr>
-            <w:tcW w:type="dxa" w:w="3312"/>
-          </w:tcPr>
-          <w:p>
-            <w:r>
-              <w:rPr>
-                <w:rFonts w:ascii="Arial" w:hAnsi="Arial"/>
-                <w:sz w:val="17"/>
-              </w:rPr>
-              <w:t>Appropriate for binary severe-outage indicators.</w:t>
-            </w:r>
-          </w:p>
-        </w:tc>
-      </w:tr>
-      <w:tr>
-        <w:tc>
-          <w:tcPr>
-            <w:tcW w:type="dxa" w:w="3312"/>
-          </w:tcPr>
-          <w:p>
-            <w:r>
-              <w:rPr>
-                <w:rFonts w:ascii="Arial" w:hAnsi="Arial"/>
-                <w:sz w:val="17"/>
-              </w:rPr>
-              <w:t>Customer-hours</w:t>
-            </w:r>
-          </w:p>
-        </w:tc>
-        <w:tc>
-          <w:tcPr>
-            <w:tcW w:type="dxa" w:w="3312"/>
-          </w:tcPr>
-          <w:p>
-            <w:r>
-              <w:rPr>
-                <w:rFonts w:ascii="Arial" w:hAnsi="Arial"/>
-                <w:sz w:val="17"/>
-              </w:rPr>
-              <w:t>Event-level customer impact multiplied by duration.</w:t>
-            </w:r>
-          </w:p>
-        </w:tc>
-        <w:tc>
-          <w:tcPr>
-            <w:tcW w:type="dxa" w:w="3312"/>
-          </w:tcPr>
-          <w:p>
-            <w:r>
-              <w:rPr>
-                <w:rFonts w:ascii="Arial" w:hAnsi="Arial"/>
-                <w:sz w:val="17"/>
-              </w:rPr>
-              <w:t>Captures both outage length and affected customers.</w:t>
-            </w:r>
-          </w:p>
-        </w:tc>
-      </w:tr>
-    </w:tbl>
     <w:p>
+      <w:pPr>
+        <w:spacing w:after="120"/>
+      </w:pPr>
       <w:r>
+        <w:rPr>
+          <w:rFonts w:ascii="Times New Roman" w:hAnsi="Times New Roman"/>
+          <w:b/>
+          <w:sz w:val="22"/>
+        </w:rPr>
+        <w:t>Duration and resilience outcome families:</w:t>
+      </w:r>
+    </w:p>
+    <w:p>
+      <w:pPr>
+        <w:spacing w:after="120"/>
+        <w:ind w:left="360"/>
+      </w:pPr>
+      <w:r>
+        <w:rPr>
+          <w:rFonts w:ascii="Times New Roman" w:hAnsi="Times New Roman"/>
+          <w:b/>
+          <w:sz w:val="22"/>
+        </w:rPr>
+        <w:t xml:space="preserve">County-year duration: </w:t>
+      </w:r>
+      <w:r>
+        <w:rPr>
+          <w:rFonts w:ascii="Times New Roman" w:hAnsi="Times New Roman"/>
+          <w:sz w:val="22"/>
+        </w:rPr>
+        <w:t>Median duration, p90 duration, share above 8 hours, and share above 24 hours. Main interpretation: Useful but limited by small county-year sample.</w:t>
+      </w:r>
+    </w:p>
+    <w:p>
+      <w:pPr>
+        <w:spacing w:after="120"/>
+        <w:ind w:left="360"/>
+      </w:pPr>
+      <w:r>
+        <w:rPr>
+          <w:rFonts w:ascii="Times New Roman" w:hAnsi="Times New Roman"/>
+          <w:b/>
+          <w:sz w:val="22"/>
+        </w:rPr>
+        <w:t xml:space="preserve">Event-level log duration: </w:t>
+      </w:r>
+      <w:r>
+        <w:rPr>
+          <w:rFonts w:ascii="Times New Roman" w:hAnsi="Times New Roman"/>
+          <w:sz w:val="22"/>
+        </w:rPr>
+        <w:t>OLS and clustered/sensitivity specifications on deduplicated outage events. Main interpretation: Stronger duration evidence because the event is the unit of analysis.</w:t>
+      </w:r>
+    </w:p>
+    <w:p>
+      <w:pPr>
+        <w:spacing w:after="120"/>
+        <w:ind w:left="360"/>
+      </w:pPr>
+      <w:r>
+        <w:rPr>
+          <w:rFonts w:ascii="Times New Roman" w:hAnsi="Times New Roman"/>
+          <w:b/>
+          <w:sz w:val="22"/>
+        </w:rPr>
+        <w:t xml:space="preserve">Severe outage probability: </w:t>
+      </w:r>
+      <w:r>
+        <w:rPr>
+          <w:rFonts w:ascii="Times New Roman" w:hAnsi="Times New Roman"/>
+          <w:sz w:val="22"/>
+        </w:rPr>
+        <w:t>Logistic or GEE-style binary models for long/severe outage outcomes. Main interpretation: Appropriate for binary severe-outage indicators.</w:t>
+      </w:r>
+    </w:p>
+    <w:p>
+      <w:pPr>
+        <w:spacing w:after="120"/>
+        <w:ind w:left="360"/>
+      </w:pPr>
+      <w:r>
+        <w:rPr>
+          <w:rFonts w:ascii="Times New Roman" w:hAnsi="Times New Roman"/>
+          <w:b/>
+          <w:sz w:val="22"/>
+        </w:rPr>
+        <w:t xml:space="preserve">Customer-hours: </w:t>
+      </w:r>
+      <w:r>
+        <w:rPr>
+          <w:rFonts w:ascii="Times New Roman" w:hAnsi="Times New Roman"/>
+          <w:sz w:val="22"/>
+        </w:rPr>
+        <w:t>Event-level customer impact multiplied by duration. Main interpretation: Captures both outage length and affected customers.</w:t>
+      </w:r>
+    </w:p>
+    <w:p>
+      <w:pPr>
+        <w:spacing w:after="120"/>
+      </w:pPr>
+      <w:r>
+        <w:rPr>
+          <w:rFonts w:ascii="Times New Roman" w:hAnsi="Times New Roman"/>
+          <w:sz w:val="22"/>
+        </w:rPr>
         <w:t>Severe weather is the most consistent predictor of longer duration and larger customer-hour impacts. CVI duration evidence is weaker and more model-sensitive, although social-economic CVI remains the most plausible vulnerability channel.</w:t>
       </w:r>
     </w:p>
     <w:p>
-      <w:pPr/>
+      <w:pPr>
+        <w:spacing w:after="120"/>
+      </w:pPr>
       <w:r>
         <w:rPr>
+          <w:rFonts w:ascii="Times New Roman" w:hAnsi="Times New Roman"/>
           <w:b/>
+          <w:sz w:val="22"/>
         </w:rPr>
         <w:t xml:space="preserve">Findings: </w:t>
       </w:r>
       <w:r>
+        <w:rPr>
+          <w:rFonts w:ascii="Times New Roman" w:hAnsi="Times New Roman"/>
+          <w:sz w:val="22"/>
+        </w:rPr>
         <w:t>The county-year duration models do not show a stable social-economic CVI effect for median duration, 90th-percentile duration, outages longer than 8 hours, or outages longer than 24 hours. Severe-weather share is significant for 90th-percentile duration (coef. about 0.371, p = 0.020), which suggests weather is more important for extreme duration than for typical duration.</w:t>
       </w:r>
     </w:p>
     <w:p>
       <w:pPr>
+        <w:spacing w:after="120"/>
         <w:ind w:left="360"/>
       </w:pPr>
       <w:r>
+        <w:rPr>
+          <w:rFonts w:ascii="Times New Roman" w:hAnsi="Times New Roman"/>
+          <w:sz w:val="22"/>
+        </w:rPr>
         <w:t>The event-level models provide the strongest duration evidence. Across 4,518 outage events, severe-weather events have significantly longer log duration (coef. about 0.446, p &lt; 0.001) and much larger customer-hour impacts (coef. about 1.506, p &lt; 0.001).</w:t>
       </w:r>
     </w:p>
     <w:p>
       <w:pPr>
+        <w:spacing w:after="120"/>
         <w:ind w:left="360"/>
       </w:pPr>
       <w:r>
+        <w:rPr>
+          <w:rFonts w:ascii="Times New Roman" w:hAnsi="Times New Roman"/>
+          <w:sz w:val="22"/>
+        </w:rPr>
         <w:t>Event-level social-economic CVI is not significant in ordinary OLS (coef. about 0.042, p = 0.728), but the Ridge sensitivity check gives a small positive coefficient with an interval barely above zero. This supports a cautious statement: social vulnerability may matter for resilience, but the evidence is weaker than the severe-weather effect.</w:t>
       </w:r>
     </w:p>
     <w:p>
       <w:pPr>
+        <w:spacing w:after="120"/>
+        <w:ind w:left="0"/>
+      </w:pPr>
+      <w:r>
+        <w:rPr>
+          <w:rFonts w:ascii="Times New Roman" w:hAnsi="Times New Roman"/>
+          <w:b/>
+          <w:sz w:val="22"/>
+        </w:rPr>
+        <w:t xml:space="preserve">Conclusion: </w:t>
+      </w:r>
+      <w:r>
+        <w:rPr>
+          <w:rFonts w:ascii="Times New Roman" w:hAnsi="Times New Roman"/>
+          <w:sz w:val="22"/>
+        </w:rPr>
+        <w:t>The duration analysis shows that frequency and resilience are different problems. Severe weather clearly makes outages longer and more damaging, while the CVI evidence for longer restoration time is weaker. Therefore, the report should not say vulnerable communities definitely experience longer outages; it can say vulnerability may shape resilience, but the strongest duration evidence is weather-related.</w:t>
+      </w:r>
+    </w:p>
+    <w:p>
+      <w:pPr>
         <w:pStyle w:val="Heading1"/>
+        <w:spacing w:after="120"/>
       </w:pPr>
       <w:r>
+        <w:rPr>
+          <w:rFonts w:ascii="Times New Roman" w:hAnsi="Times New Roman"/>
+          <w:sz w:val="22"/>
+        </w:rPr>
         <w:t>Part 11: Robustness Summary</w:t>
       </w:r>
     </w:p>
     <w:p>
+      <w:pPr>
+        <w:spacing w:after="120"/>
+      </w:pPr>
       <w:r>
+        <w:rPr>
+          <w:rFonts w:ascii="Times New Roman" w:hAnsi="Times New Roman"/>
+          <w:sz w:val="22"/>
+        </w:rPr>
         <w:t>Part 11 compares results across county-year frequency, county-year duration, event-level OLS, and event-level Ridge specifications. This section is important because it prevents the analysis from relying on a single model specification.</w:t>
       </w:r>
     </w:p>
     <w:p>
       <w:pPr>
         <w:pStyle w:val="ListBullet"/>
+        <w:spacing w:after="120"/>
       </w:pPr>
       <w:r>
+        <w:rPr>
+          <w:rFonts w:ascii="Times New Roman" w:hAnsi="Times New Roman"/>
+          <w:sz w:val="22"/>
+        </w:rPr>
         <w:t>Methodology: compare coefficient direction, interval coverage, and model level across specifications.</w:t>
       </w:r>
     </w:p>
     <w:p>
       <w:pPr>
         <w:pStyle w:val="ListBullet"/>
+        <w:spacing w:after="120"/>
       </w:pPr>
       <w:r>
+        <w:rPr>
+          <w:rFonts w:ascii="Times New Roman" w:hAnsi="Times New Roman"/>
+          <w:sz w:val="22"/>
+        </w:rPr>
         <w:t>Main finding: severe weather is robust across model families; social-economic CVI is the clearest vulnerability signal but not uniformly significant.</w:t>
       </w:r>
     </w:p>
     <w:p>
       <w:pPr>
         <w:pStyle w:val="ListBullet"/>
+        <w:spacing w:after="120"/>
       </w:pPr>
       <w:r>
+        <w:rPr>
+          <w:rFonts w:ascii="Times New Roman" w:hAnsi="Times New Roman"/>
+          <w:sz w:val="22"/>
+        </w:rPr>
         <w:t>Recommended language: describe CVI findings as policy-relevant and directional rather than definitive across every outcome.</w:t>
       </w:r>
     </w:p>
     <w:p>
-      <w:pPr/>
+      <w:pPr>
+        <w:spacing w:after="120"/>
+      </w:pPr>
       <w:r>
         <w:rPr>
+          <w:rFonts w:ascii="Times New Roman" w:hAnsi="Times New Roman"/>
           <w:b/>
+          <w:sz w:val="22"/>
         </w:rPr>
         <w:t xml:space="preserve">Findings: </w:t>
       </w:r>
       <w:r>
+        <w:rPr>
+          <w:rFonts w:ascii="Times New Roman" w:hAnsi="Times New Roman"/>
+          <w:sz w:val="22"/>
+        </w:rPr>
         <w:t>The robustness table supports the final wording. Social-economic CVI is positive in the county-year frequency OLS, county-year frequency Ridge, event-level OLS, and event-level Ridge models, but most intervals cross zero. It is negative and near zero in the county-year duration OLS model.</w:t>
       </w:r>
     </w:p>
     <w:p>
       <w:pPr>
+        <w:spacing w:after="120"/>
         <w:ind w:left="360"/>
       </w:pPr>
       <w:r>
+        <w:rPr>
+          <w:rFonts w:ascii="Times New Roman" w:hAnsi="Times New Roman"/>
+          <w:sz w:val="22"/>
+        </w:rPr>
         <w:t>Only the event-level Ridge version gives a positive social-economic CVI interval that excludes zero. Therefore, the notebook supports a careful interpretation of recurring positive direction, not a strong causal claim.</w:t>
       </w:r>
     </w:p>
     <w:p>
       <w:pPr>
+        <w:spacing w:after="120"/>
+        <w:ind w:left="0"/>
+      </w:pPr>
+      <w:r>
+        <w:rPr>
+          <w:rFonts w:ascii="Times New Roman" w:hAnsi="Times New Roman"/>
+          <w:b/>
+          <w:sz w:val="22"/>
+        </w:rPr>
+        <w:t xml:space="preserve">Conclusion: </w:t>
+      </w:r>
+      <w:r>
+        <w:rPr>
+          <w:rFonts w:ascii="Times New Roman" w:hAnsi="Times New Roman"/>
+          <w:sz w:val="22"/>
+        </w:rPr>
+        <w:t>The robustness section tells us which claims are stable enough to carry forward. The safest final conclusion is that social-economic vulnerability repeatedly points in the expected direction, but only some specifications make it statistically clear; severe weather remains the most dependable finding across the notebook.</w:t>
+      </w:r>
+    </w:p>
+    <w:p>
+      <w:pPr>
         <w:pStyle w:val="Heading1"/>
+        <w:spacing w:after="120"/>
       </w:pPr>
       <w:r>
+        <w:rPr>
+          <w:rFonts w:ascii="Times New Roman" w:hAnsi="Times New Roman"/>
+          <w:sz w:val="22"/>
+        </w:rPr>
         <w:t>Part 12: Mechanism Interpretation</w:t>
       </w:r>
     </w:p>
     <w:p>
+      <w:pPr>
+        <w:spacing w:after="120"/>
+      </w:pPr>
       <w:r>
+        <w:rPr>
+          <w:rFonts w:ascii="Times New Roman" w:hAnsi="Times New Roman"/>
+          <w:sz w:val="22"/>
+        </w:rPr>
         <w:t>Part 12 synthesizes the frequency and duration evidence. The careful interpretation is that outage burden has a strong weather component and a more cautious vulnerability component. Social-economic vulnerability appears most relevant in the corrected county-month frequency model and in selected event-level duration sensitivity checks.</w:t>
       </w:r>
     </w:p>
     <w:p>
       <w:pPr>
         <w:pStyle w:val="ListBullet"/>
+        <w:spacing w:after="120"/>
       </w:pPr>
       <w:r>
+        <w:rPr>
+          <w:rFonts w:ascii="Times New Roman" w:hAnsi="Times New Roman"/>
+          <w:sz w:val="22"/>
+        </w:rPr>
         <w:t>Strongest claim: severe weather is consistently associated with more severe outage outcomes.</w:t>
       </w:r>
     </w:p>
     <w:p>
       <w:pPr>
         <w:pStyle w:val="ListBullet"/>
+        <w:spacing w:after="120"/>
       </w:pPr>
       <w:r>
+        <w:rPr>
+          <w:rFonts w:ascii="Times New Roman" w:hAnsi="Times New Roman"/>
+          <w:sz w:val="22"/>
+        </w:rPr>
         <w:t>Most credible CVI pattern: social-economic vulnerability is associated with higher outage frequency and may relate to longer restoration burden.</w:t>
       </w:r>
     </w:p>
     <w:p>
       <w:pPr>
         <w:pStyle w:val="ListBullet"/>
+        <w:spacing w:after="120"/>
       </w:pPr>
       <w:r>
+        <w:rPr>
+          <w:rFonts w:ascii="Times New Roman" w:hAnsi="Times New Roman"/>
+          <w:sz w:val="22"/>
+        </w:rPr>
         <w:t>What not to claim: every CVI dimension predicts every outage outcome. Climate-extreme-events CVI, in particular, should be treated cautiously because its sign is not intuitive in some models.</w:t>
       </w:r>
     </w:p>
     <w:p>
-      <w:pPr/>
+      <w:pPr>
+        <w:spacing w:after="120"/>
+      </w:pPr>
       <w:r>
         <w:rPr>
+          <w:rFonts w:ascii="Times New Roman" w:hAnsi="Times New Roman"/>
           <w:b/>
+          <w:sz w:val="22"/>
         </w:rPr>
         <w:t xml:space="preserve">Findings: </w:t>
       </w:r>
       <w:r>
+        <w:rPr>
+          <w:rFonts w:ascii="Times New Roman" w:hAnsi="Times New Roman"/>
+          <w:sz w:val="22"/>
+        </w:rPr>
         <w:t>County summaries show that Queens has the highest mean outage occurrence, about 178.6, followed by Brooklyn at 104.0 and the Bronx at 86.5. Manhattan has the lowest mean outage occurrence, about 32.8, but has a higher median event duration than most boroughs.</w:t>
       </w:r>
     </w:p>
     <w:p>
       <w:pPr>
+        <w:spacing w:after="120"/>
         <w:ind w:left="360"/>
       </w:pPr>
       <w:r>
+        <w:rPr>
+          <w:rFonts w:ascii="Times New Roman" w:hAnsi="Times New Roman"/>
+          <w:sz w:val="22"/>
+        </w:rPr>
         <w:t>The Bronx has the highest social-economic CVI among the five counties, about 0.761, while Brooklyn and Queens are also elevated at about 0.586 and 0.575. This helps explain why vulnerability and outage burden do not map perfectly onto each other: exposure, infrastructure, and event severity operate through different channels.</w:t>
       </w:r>
     </w:p>
     <w:p>
       <w:pPr>
+        <w:spacing w:after="120"/>
         <w:ind w:left="360"/>
       </w:pPr>
       <w:r>
+        <w:rPr>
+          <w:rFonts w:ascii="Times New Roman" w:hAnsi="Times New Roman"/>
+          <w:sz w:val="22"/>
+        </w:rPr>
         <w:t>The final interpretation should separate frequency from resilience. Severe weather is the most consistent predictor across the notebook; social-economic vulnerability is a plausible equity signal, but it is more sensitive to model choice and aggregation level.</w:t>
       </w:r>
     </w:p>
     <w:p>
       <w:pPr>
+        <w:spacing w:after="120"/>
+        <w:ind w:left="0"/>
+      </w:pPr>
+      <w:r>
+        <w:rPr>
+          <w:rFonts w:ascii="Times New Roman" w:hAnsi="Times New Roman"/>
+          <w:b/>
+          <w:sz w:val="22"/>
+        </w:rPr>
+        <w:t xml:space="preserve">Conclusion: </w:t>
+      </w:r>
+      <w:r>
+        <w:rPr>
+          <w:rFonts w:ascii="Times New Roman" w:hAnsi="Times New Roman"/>
+          <w:sz w:val="22"/>
+        </w:rPr>
+        <w:t>The borough comparison makes the final story more concrete: outage burden is not distributed through one single channel. Queens and Brooklyn show high outage occurrence, the Bronx shows high social-economic vulnerability, and Manhattan shows relatively low occurrence but longer median duration. That means policy interpretation should combine exposure, vulnerability, and restoration/resilience rather than ranking communities by one number only.</w:t>
+      </w:r>
+    </w:p>
+    <w:p>
+      <w:pPr>
         <w:pStyle w:val="Heading1"/>
+        <w:spacing w:after="120"/>
       </w:pPr>
       <w:r>
+        <w:rPr>
+          <w:rFonts w:ascii="Times New Roman" w:hAnsi="Times New Roman"/>
+          <w:sz w:val="22"/>
+        </w:rPr>
         <w:t>Key Limitations</w:t>
       </w:r>
     </w:p>
     <w:p>
       <w:pPr>
         <w:pStyle w:val="ListBullet"/>
+        <w:spacing w:after="120"/>
       </w:pPr>
       <w:r>
+        <w:rPr>
+          <w:rFonts w:ascii="Times New Roman" w:hAnsi="Times New Roman"/>
+          <w:sz w:val="22"/>
+        </w:rPr>
         <w:t>County-month models have approximately 600 observations (5 counties × 10 years × 12 months), so p-values and confidence intervals should be interpreted cautiously.</w:t>
       </w:r>
     </w:p>
     <w:p>
       <w:pPr>
         <w:pStyle w:val="ListBullet"/>
+        <w:spacing w:after="120"/>
       </w:pPr>
       <w:r>
+        <w:rPr>
+          <w:rFonts w:ascii="Times New Roman" w:hAnsi="Times New Roman"/>
+          <w:sz w:val="22"/>
+        </w:rPr>
         <w:t>Only five counties are observed, which makes cross-sectional estimates sensitive to individual counties.</w:t>
       </w:r>
     </w:p>
     <w:p>
       <w:pPr>
         <w:pStyle w:val="ListBullet"/>
+        <w:spacing w:after="120"/>
       </w:pPr>
       <w:r>
+        <w:rPr>
+          <w:rFonts w:ascii="Times New Roman" w:hAnsi="Times New Roman"/>
+          <w:sz w:val="22"/>
+        </w:rPr>
         <w:t>Tract-level regressions are exploratory because outage outcomes repeat within county-year cells.</w:t>
       </w:r>
     </w:p>
     <w:p>
       <w:pPr>
         <w:pStyle w:val="ListBullet"/>
+        <w:spacing w:after="120"/>
       </w:pPr>
       <w:r>
+        <w:rPr>
+          <w:rFonts w:ascii="Times New Roman" w:hAnsi="Times New Roman"/>
+          <w:sz w:val="22"/>
+        </w:rPr>
         <w:t>Ridge models should be treated as sensitivity checks unless alpha is selected by cross-validation.</w:t>
       </w:r>
     </w:p>
     <w:p>
       <w:pPr>
         <w:pStyle w:val="ListBullet"/>
+        <w:spacing w:after="120"/>
       </w:pPr>
       <w:r>
+        <w:rPr>
+          <w:rFonts w:ascii="Times New Roman" w:hAnsi="Times New Roman"/>
+          <w:sz w:val="22"/>
+        </w:rPr>
         <w:t>The severe-weather flag should be documented more fully, especially whether it is assigned at the event level or row level.</w:t>
       </w:r>
     </w:p>
     <w:p>
       <w:pPr>
         <w:pStyle w:val="ListBullet"/>
+        <w:spacing w:after="120"/>
       </w:pPr>
       <w:r>
+        <w:rPr>
+          <w:rFonts w:ascii="Times New Roman" w:hAnsi="Times New Roman"/>
+          <w:sz w:val="22"/>
+        </w:rPr>
         <w:t>True tract-level inference would require more granular utility outage data or a data source where outage outcomes vary independently by tract.</w:t>
       </w:r>
     </w:p>

</xml_diff>